<commit_message>
TS 7.3 7.4 Kramam Tamil corr
</commit_message>
<xml_diff>
--- a/TS-Kramam/TS-7.4/TS 7.4 Tamil Krama Paatam Corrections.docx
+++ b/TS-Kramam/TS-7.4/TS 7.4 Tamil Krama Paatam Corrections.docx
@@ -1,7 +1,4181 @@
 
 <file path=word/document.xml><?xml version="1.0" encoding="utf-8"?>
-<w:document xmlns:wpc="http://schemas.microsoft.com/office/word/2010/wordprocessingCanvas" xmlns:cx="http://schemas.microsoft.com/office/drawing/2014/chartex" xmlns:cx1="http://schemas.microsoft.com/office/drawing/2015/9/8/chartex" xmlns:cx2="http://schemas.microsoft.com/office/drawing/2015/10/21/chartex" xmlns:cx3="http://schemas.microsoft.com/office/drawing/2016/5/9/chartex" xmlns:cx4="http://schemas.microsoft.com/office/drawing/2016/5/10/chartex" xmlns:cx5="http://schemas.microsoft.com/office/drawing/2016/5/11/chartex" xmlns:cx6="http://schemas.microsoft.com/office/drawing/2016/5/12/chartex" xmlns:cx7="http://schemas.microsoft.com/office/drawing/2016/5/13/chartex" xmlns:cx8="http://schemas.microsoft.com/office/drawing/2016/5/14/chartex" xmlns:mc="http://schemas.openxmlformats.org/markup-compatibility/2006" xmlns:aink="http://schemas.microsoft.com/office/drawing/2016/ink" xmlns:am3d="http://schemas.microsoft.com/office/drawing/2017/model3d" xmlns:o="urn:schemas-microsoft-com:office:office" xmlns:oel="http://schemas.microsoft.com/office/2019/extlst" xmlns:r="http://schemas.openxmlformats.org/officeDocument/2006/relationships" xmlns:m="http://schemas.openxmlformats.org/officeDocument/2006/math" xmlns:v="urn:schemas-microsoft-com:vml" xmlns:wp14="http://schemas.microsoft.com/office/word/2010/wordprocessingDrawing" xmlns:wp="http://schemas.openxmlformats.org/drawingml/2006/wordprocessingDrawing" xmlns:w10="urn:schemas-microsoft-com:office:word" xmlns:w="http://schemas.openxmlformats.org/wordprocessingml/2006/main" xmlns:w14="http://schemas.microsoft.com/office/word/2010/wordml" xmlns:w15="http://schemas.microsoft.com/office/word/2012/wordml" xmlns:w16cex="http://schemas.microsoft.com/office/word/2018/wordml/cex" xmlns:w16cid="http://schemas.microsoft.com/office/word/2016/wordml/cid" xmlns:w16="http://schemas.microsoft.com/office/word/2018/wordml" xmlns:w16sdtdh="http://schemas.microsoft.com/office/word/2020/wordml/sdtdatahash" xmlns:w16se="http://schemas.microsoft.com/office/word/2015/wordml/symex" xmlns:wpg="http://schemas.microsoft.com/office/word/2010/wordprocessingGroup" xmlns:wpi="http://schemas.microsoft.com/office/word/2010/wordprocessingInk" xmlns:wne="http://schemas.microsoft.com/office/word/2006/wordml" xmlns:wps="http://schemas.microsoft.com/office/word/2010/wordprocessingShape" mc:Ignorable="w14 w15 w16se w16cid w16 w16cex w16sdtdh wp14">
+<w:document xmlns:wpc="http://schemas.microsoft.com/office/word/2010/wordprocessingCanvas" xmlns:cx="http://schemas.microsoft.com/office/drawing/2014/chartex" xmlns:cx1="http://schemas.microsoft.com/office/drawing/2015/9/8/chartex" xmlns:cx2="http://schemas.microsoft.com/office/drawing/2015/10/21/chartex" xmlns:cx3="http://schemas.microsoft.com/office/drawing/2016/5/9/chartex" xmlns:cx4="http://schemas.microsoft.com/office/drawing/2016/5/10/chartex" xmlns:cx5="http://schemas.microsoft.com/office/drawing/2016/5/11/chartex" xmlns:cx6="http://schemas.microsoft.com/office/drawing/2016/5/12/chartex" xmlns:cx7="http://schemas.microsoft.com/office/drawing/2016/5/13/chartex" xmlns:cx8="http://schemas.microsoft.com/office/drawing/2016/5/14/chartex" xmlns:mc="http://schemas.openxmlformats.org/markup-compatibility/2006" xmlns:aink="http://schemas.microsoft.com/office/drawing/2016/ink" xmlns:am3d="http://schemas.microsoft.com/office/drawing/2017/model3d" xmlns:o="urn:schemas-microsoft-com:office:office" xmlns:oel="http://schemas.microsoft.com/office/2019/extlst" xmlns:r="http://schemas.openxmlformats.org/officeDocument/2006/relationships" xmlns:m="http://schemas.openxmlformats.org/officeDocument/2006/math" xmlns:v="urn:schemas-microsoft-com:vml" xmlns:wp14="http://schemas.microsoft.com/office/word/2010/wordprocessingDrawing" xmlns:wp="http://schemas.openxmlformats.org/drawingml/2006/wordprocessingDrawing" xmlns:w10="urn:schemas-microsoft-com:office:word" xmlns:w="http://schemas.openxmlformats.org/wordprocessingml/2006/main" xmlns:w14="http://schemas.microsoft.com/office/word/2010/wordml" xmlns:w15="http://schemas.microsoft.com/office/word/2012/wordml" xmlns:w16cex="http://schemas.microsoft.com/office/word/2018/wordml/cex" xmlns:w16cid="http://schemas.microsoft.com/office/word/2016/wordml/cid" xmlns:w16="http://schemas.microsoft.com/office/word/2018/wordml" xmlns:w16du="http://schemas.microsoft.com/office/word/2023/wordml/word16du" xmlns:w16sdtdh="http://schemas.microsoft.com/office/word/2020/wordml/sdtdatahash" xmlns:w16sdtfl="http://schemas.microsoft.com/office/word/2024/wordml/sdtformatlock" xmlns:w16se="http://schemas.microsoft.com/office/word/2015/wordml/symex" xmlns:wpg="http://schemas.microsoft.com/office/word/2010/wordprocessingGroup" xmlns:wpi="http://schemas.microsoft.com/office/word/2010/wordprocessingInk" xmlns:wne="http://schemas.microsoft.com/office/word/2006/wordml" xmlns:wps="http://schemas.microsoft.com/office/word/2010/wordprocessingShape" mc:Ignorable="w14 w15 w16se w16cid w16 w16cex w16sdtdh w16sdtfl w16du wp14">
   <w:body>
+    <w:p>
+      <w:pPr>
+        <w:jc w:val="center"/>
+        <w:rPr>
+          <w:b/>
+          <w:bCs/>
+          <w:sz w:val="32"/>
+          <w:szCs w:val="32"/>
+          <w:u w:val="single"/>
+        </w:rPr>
+      </w:pPr>
+    </w:p>
+    <w:p>
+      <w:pPr>
+        <w:jc w:val="center"/>
+        <w:rPr>
+          <w:b/>
+          <w:bCs/>
+          <w:color w:val="EE0000"/>
+          <w:sz w:val="32"/>
+          <w:szCs w:val="32"/>
+          <w:u w:val="single"/>
+        </w:rPr>
+      </w:pPr>
+      <w:r>
+        <w:rPr>
+          <w:b/>
+          <w:bCs/>
+          <w:sz w:val="32"/>
+          <w:szCs w:val="32"/>
+          <w:u w:val="single"/>
+        </w:rPr>
+        <w:t xml:space="preserve">TS </w:t>
+      </w:r>
+      <w:r>
+        <w:rPr>
+          <w:b/>
+          <w:bCs/>
+          <w:sz w:val="32"/>
+          <w:szCs w:val="32"/>
+          <w:u w:val="single"/>
+        </w:rPr>
+        <w:t>Krama</w:t>
+      </w:r>
+      <w:r>
+        <w:rPr>
+          <w:b/>
+          <w:bCs/>
+          <w:sz w:val="32"/>
+          <w:szCs w:val="32"/>
+          <w:u w:val="single"/>
+        </w:rPr>
+        <w:t xml:space="preserve"> Paatam – TS </w:t>
+      </w:r>
+      <w:r>
+        <w:rPr>
+          <w:b/>
+          <w:bCs/>
+          <w:sz w:val="32"/>
+          <w:szCs w:val="32"/>
+          <w:u w:val="single"/>
+        </w:rPr>
+        <w:t>7.4 Tamil</w:t>
+      </w:r>
+      <w:r>
+        <w:rPr>
+          <w:b/>
+          <w:bCs/>
+          <w:sz w:val="32"/>
+          <w:szCs w:val="32"/>
+          <w:u w:val="single"/>
+        </w:rPr>
+        <w:t xml:space="preserve"> Corrections –</w:t>
+      </w:r>
+      <w:r>
+        <w:rPr>
+          <w:b/>
+          <w:bCs/>
+          <w:sz w:val="32"/>
+          <w:szCs w:val="32"/>
+          <w:u w:val="single"/>
+        </w:rPr>
+        <w:t xml:space="preserve"> </w:t>
+      </w:r>
+      <w:r>
+        <w:rPr>
+          <w:b/>
+          <w:bCs/>
+          <w:sz w:val="32"/>
+          <w:szCs w:val="32"/>
+          <w:u w:val="single"/>
+        </w:rPr>
+        <w:t xml:space="preserve">Observed till </w:t>
+      </w:r>
+      <w:proofErr w:type="spellStart"/>
+      <w:r>
+        <w:rPr>
+          <w:b/>
+          <w:bCs/>
+          <w:color w:val="EE0000"/>
+          <w:sz w:val="32"/>
+          <w:szCs w:val="32"/>
+          <w:highlight w:val="yellow"/>
+          <w:u w:val="single"/>
+        </w:rPr>
+        <w:t>xxxxxxxx</w:t>
+      </w:r>
+      <w:proofErr w:type="spellEnd"/>
+      <w:r>
+        <w:rPr>
+          <w:b/>
+          <w:bCs/>
+          <w:color w:val="EE0000"/>
+          <w:sz w:val="32"/>
+          <w:szCs w:val="32"/>
+          <w:u w:val="single"/>
+        </w:rPr>
+        <w:t xml:space="preserve"> </w:t>
+      </w:r>
+      <w:r>
+        <w:rPr>
+          <w:b/>
+          <w:bCs/>
+          <w:color w:val="EE0000"/>
+          <w:sz w:val="32"/>
+          <w:szCs w:val="32"/>
+          <w:highlight w:val="yellow"/>
+          <w:u w:val="single"/>
+        </w:rPr>
+        <w:t>2026</w:t>
+      </w:r>
+    </w:p>
+    <w:p>
+      <w:pPr>
+        <w:jc w:val="center"/>
+        <w:rPr>
+          <w:b/>
+          <w:bCs/>
+        </w:rPr>
+      </w:pPr>
+      <w:r>
+        <w:rPr>
+          <w:b/>
+          <w:bCs/>
+        </w:rPr>
+        <w:t>(ignore those which are already incorporated in your book’s version and date)</w:t>
+      </w:r>
+    </w:p>
+    <w:tbl>
+      <w:tblPr>
+        <w:tblW w:w="13970" w:type="dxa"/>
+        <w:tblInd w:w="-792" w:type="dxa"/>
+        <w:tblBorders>
+          <w:top w:val="single" w:sz="4" w:space="0" w:color="000000"/>
+          <w:left w:val="single" w:sz="4" w:space="0" w:color="000000"/>
+          <w:bottom w:val="single" w:sz="4" w:space="0" w:color="000000"/>
+          <w:right w:val="single" w:sz="4" w:space="0" w:color="000000"/>
+          <w:insideH w:val="single" w:sz="4" w:space="0" w:color="000000"/>
+          <w:insideV w:val="single" w:sz="4" w:space="0" w:color="000000"/>
+        </w:tblBorders>
+        <w:tblLook w:val="04A0" w:firstRow="1" w:lastRow="0" w:firstColumn="1" w:lastColumn="0" w:noHBand="0" w:noVBand="1"/>
+      </w:tblPr>
+      <w:tblGrid>
+        <w:gridCol w:w="3877"/>
+        <w:gridCol w:w="4738"/>
+        <w:gridCol w:w="5355"/>
+      </w:tblGrid>
+      <w:tr>
+        <w:tc>
+          <w:tcPr>
+            <w:tcW w:w="3877" w:type="dxa"/>
+          </w:tcPr>
+          <w:p>
+            <w:pPr>
+              <w:spacing w:before="0" w:line="240" w:lineRule="auto"/>
+              <w:jc w:val="center"/>
+              <w:rPr>
+                <w:b/>
+                <w:bCs/>
+                <w:sz w:val="32"/>
+                <w:szCs w:val="32"/>
+              </w:rPr>
+            </w:pPr>
+            <w:r>
+              <w:rPr>
+                <w:b/>
+                <w:bCs/>
+                <w:sz w:val="32"/>
+                <w:szCs w:val="32"/>
+              </w:rPr>
+              <w:t>Section, Paragraph</w:t>
+            </w:r>
+          </w:p>
+          <w:p>
+            <w:pPr>
+              <w:spacing w:before="0" w:line="240" w:lineRule="auto"/>
+              <w:jc w:val="center"/>
+              <w:rPr>
+                <w:b/>
+                <w:bCs/>
+                <w:sz w:val="32"/>
+                <w:szCs w:val="32"/>
+              </w:rPr>
+            </w:pPr>
+            <w:r>
+              <w:rPr>
+                <w:b/>
+                <w:bCs/>
+                <w:sz w:val="32"/>
+                <w:szCs w:val="32"/>
+              </w:rPr>
+              <w:t>Reference</w:t>
+            </w:r>
+          </w:p>
+        </w:tc>
+        <w:tc>
+          <w:tcPr>
+            <w:tcW w:w="4738" w:type="dxa"/>
+          </w:tcPr>
+          <w:p>
+            <w:pPr>
+              <w:spacing w:before="0" w:line="240" w:lineRule="auto"/>
+              <w:jc w:val="center"/>
+              <w:rPr>
+                <w:b/>
+                <w:bCs/>
+                <w:sz w:val="32"/>
+                <w:szCs w:val="32"/>
+              </w:rPr>
+            </w:pPr>
+            <w:r>
+              <w:rPr>
+                <w:b/>
+                <w:bCs/>
+                <w:sz w:val="32"/>
+                <w:szCs w:val="32"/>
+              </w:rPr>
+              <w:t>As Printed</w:t>
+            </w:r>
+          </w:p>
+        </w:tc>
+        <w:tc>
+          <w:tcPr>
+            <w:tcW w:w="5355" w:type="dxa"/>
+          </w:tcPr>
+          <w:p>
+            <w:pPr>
+              <w:spacing w:before="0" w:line="240" w:lineRule="auto"/>
+              <w:ind w:right="-18"/>
+              <w:jc w:val="center"/>
+              <w:rPr>
+                <w:b/>
+                <w:bCs/>
+                <w:sz w:val="32"/>
+                <w:szCs w:val="32"/>
+              </w:rPr>
+            </w:pPr>
+            <w:r>
+              <w:rPr>
+                <w:b/>
+                <w:bCs/>
+                <w:sz w:val="32"/>
+                <w:szCs w:val="32"/>
+              </w:rPr>
+              <w:t>To be read as or corrected as</w:t>
+            </w:r>
+          </w:p>
+        </w:tc>
+      </w:tr>
+      <w:tr>
+        <w:trPr>
+          <w:trHeight w:val="1539"/>
+        </w:trPr>
+        <w:tc>
+          <w:tcPr>
+            <w:tcW w:w="3877" w:type="dxa"/>
+          </w:tcPr>
+          <w:p>
+            <w:pPr>
+              <w:widowControl w:val="0"/>
+              <w:tabs>
+                <w:tab w:val="left" w:pos="993"/>
+              </w:tabs>
+              <w:autoSpaceDE w:val="0"/>
+              <w:autoSpaceDN w:val="0"/>
+              <w:adjustRightInd w:val="0"/>
+              <w:spacing w:before="0" w:line="252" w:lineRule="auto"/>
+              <w:ind w:right="297"/>
+              <w:rPr>
+                <w:rFonts w:cs="Arial"/>
+                <w:b/>
+                <w:sz w:val="28"/>
+                <w:szCs w:val="28"/>
+              </w:rPr>
+            </w:pPr>
+            <w:r>
+              <w:rPr>
+                <w:rFonts w:cs="Arial"/>
+                <w:b/>
+                <w:sz w:val="28"/>
+                <w:szCs w:val="28"/>
+              </w:rPr>
+              <w:t>T.S.7.4.1.</w:t>
+            </w:r>
+            <w:r>
+              <w:rPr>
+                <w:rFonts w:cs="Arial"/>
+                <w:b/>
+                <w:sz w:val="28"/>
+                <w:szCs w:val="28"/>
+              </w:rPr>
+              <w:t>2</w:t>
+            </w:r>
+            <w:r>
+              <w:rPr>
+                <w:rFonts w:cs="Arial"/>
+                <w:b/>
+                <w:sz w:val="28"/>
+                <w:szCs w:val="28"/>
+              </w:rPr>
+              <w:t xml:space="preserve"> – Kramam</w:t>
+            </w:r>
+          </w:p>
+          <w:p>
+            <w:pPr>
+              <w:widowControl w:val="0"/>
+              <w:tabs>
+                <w:tab w:val="left" w:pos="993"/>
+              </w:tabs>
+              <w:autoSpaceDE w:val="0"/>
+              <w:autoSpaceDN w:val="0"/>
+              <w:adjustRightInd w:val="0"/>
+              <w:spacing w:before="0" w:line="252" w:lineRule="auto"/>
+              <w:ind w:right="297"/>
+              <w:rPr>
+                <w:rFonts w:cs="Arial"/>
+                <w:b/>
+                <w:sz w:val="28"/>
+                <w:szCs w:val="28"/>
+              </w:rPr>
+            </w:pPr>
+            <w:r>
+              <w:rPr>
+                <w:rFonts w:cs="Arial"/>
+                <w:b/>
+                <w:sz w:val="28"/>
+                <w:szCs w:val="28"/>
+              </w:rPr>
+              <w:t xml:space="preserve">Krama Vaakyam No.– </w:t>
+            </w:r>
+            <w:r>
+              <w:rPr>
+                <w:rFonts w:cs="Arial"/>
+                <w:b/>
+                <w:sz w:val="28"/>
+                <w:szCs w:val="28"/>
+              </w:rPr>
+              <w:t>32,33</w:t>
+            </w:r>
+          </w:p>
+          <w:p>
+            <w:pPr>
+              <w:widowControl w:val="0"/>
+              <w:autoSpaceDE w:val="0"/>
+              <w:autoSpaceDN w:val="0"/>
+              <w:adjustRightInd w:val="0"/>
+              <w:spacing w:before="0" w:line="264" w:lineRule="auto"/>
+              <w:rPr>
+                <w:rFonts w:cs="Arial"/>
+                <w:bCs/>
+                <w:color w:val="FF0000"/>
+                <w:sz w:val="32"/>
+                <w:szCs w:val="36"/>
+              </w:rPr>
+            </w:pPr>
+            <w:r>
+              <w:rPr>
+                <w:rFonts w:cs="Arial"/>
+                <w:b/>
+                <w:sz w:val="28"/>
+                <w:szCs w:val="28"/>
+              </w:rPr>
+              <w:t xml:space="preserve">Panchaati No. - </w:t>
+            </w:r>
+            <w:r>
+              <w:rPr>
+                <w:rFonts w:cs="Arial"/>
+                <w:b/>
+                <w:sz w:val="28"/>
+                <w:szCs w:val="28"/>
+              </w:rPr>
+              <w:t>2</w:t>
+            </w:r>
+          </w:p>
+        </w:tc>
+        <w:tc>
+          <w:tcPr>
+            <w:tcW w:w="4738" w:type="dxa"/>
+          </w:tcPr>
+          <w:p>
+            <w:pPr>
+              <w:widowControl w:val="0"/>
+              <w:autoSpaceDE w:val="0"/>
+              <w:autoSpaceDN w:val="0"/>
+              <w:adjustRightInd w:val="0"/>
+              <w:spacing w:before="0" w:line="264" w:lineRule="auto"/>
+              <w:rPr>
+                <w:rFonts w:cs="Arial"/>
+                <w:bCs/>
+                <w:color w:val="FF0000"/>
+                <w:sz w:val="32"/>
+                <w:szCs w:val="36"/>
+              </w:rPr>
+            </w:pPr>
+            <w:r>
+              <w:rPr>
+                <w:rFonts w:ascii="Latha" w:hAnsi="Latha" w:cs="Latha"/>
+                <w:sz w:val="28"/>
+                <w:szCs w:val="28"/>
+                <w:cs/>
+                <w:lang w:bidi="ta-IN"/>
+              </w:rPr>
+              <w:t>ஏ</w:t>
+            </w:r>
+            <w:r>
+              <w:rPr>
+                <w:rFonts w:ascii="BRH Tamil Tab Extra" w:hAnsi="BRH Tamil Tab Extra" w:cs="Latha"/>
+                <w:b/>
+                <w:sz w:val="32"/>
+                <w:szCs w:val="28"/>
+                <w:lang w:bidi="ta-IN"/>
+              </w:rPr>
+              <w:t>…</w:t>
+            </w:r>
+            <w:r>
+              <w:rPr>
+                <w:rFonts w:ascii="Latha" w:hAnsi="Latha" w:cs="Latha"/>
+                <w:sz w:val="28"/>
+                <w:szCs w:val="28"/>
+                <w:cs/>
+                <w:lang w:bidi="ta-IN"/>
+              </w:rPr>
+              <w:t>வ</w:t>
+            </w:r>
+            <w:r>
+              <w:rPr>
+                <w:rFonts w:ascii="Latha" w:hAnsi="Latha" w:cs="Latha"/>
+                <w:sz w:val="28"/>
+                <w:szCs w:val="28"/>
+                <w:lang w:bidi="ta-IN"/>
+              </w:rPr>
+              <w:t xml:space="preserve"> </w:t>
+            </w:r>
+            <w:r>
+              <w:rPr>
+                <w:rFonts w:ascii="Latha" w:hAnsi="Latha" w:cs="Latha"/>
+                <w:sz w:val="28"/>
+                <w:szCs w:val="28"/>
+                <w:cs/>
+                <w:lang w:bidi="ta-IN"/>
+              </w:rPr>
+              <w:t>ப்</w:t>
+            </w:r>
+            <w:r>
+              <w:rPr>
+                <w:rFonts w:ascii="Latha" w:hAnsi="Latha" w:cs="Latha"/>
+                <w:b/>
+                <w:bCs/>
+                <w:i/>
+                <w:iCs/>
+                <w:sz w:val="28"/>
+                <w:szCs w:val="28"/>
+                <w:cs/>
+                <w:lang w:bidi="ta-IN"/>
+              </w:rPr>
+              <w:t>ரு</w:t>
+            </w:r>
+            <w:r>
+              <w:rPr>
+                <w:rFonts w:ascii="BRH Tamil Tab Extra" w:hAnsi="BRH Tamil Tab Extra" w:cs="Latha"/>
+                <w:b/>
+                <w:sz w:val="32"/>
+                <w:szCs w:val="28"/>
+                <w:lang w:bidi="ta-IN"/>
+              </w:rPr>
+              <w:t>…</w:t>
+            </w:r>
+            <w:r>
+              <w:rPr>
+                <w:rFonts w:ascii="Latha" w:hAnsi="Latha" w:cs="Latha"/>
+                <w:sz w:val="28"/>
+                <w:szCs w:val="28"/>
+                <w:cs/>
+                <w:lang w:bidi="ta-IN"/>
+              </w:rPr>
+              <w:t>ஷ்</w:t>
+            </w:r>
+            <w:r>
+              <w:rPr>
+                <w:rFonts w:ascii="Latha" w:hAnsi="Latha" w:cs="Latha"/>
+                <w:sz w:val="28"/>
+                <w:szCs w:val="28"/>
+                <w:highlight w:val="yellow"/>
+                <w:cs/>
+                <w:lang w:bidi="ta-IN"/>
+              </w:rPr>
+              <w:t>ட</w:t>
+            </w:r>
+            <w:r>
+              <w:rPr>
+                <w:rFonts w:ascii="Latha" w:hAnsi="Latha" w:cs="Latha"/>
+                <w:b/>
+                <w:bCs/>
+                <w:position w:val="-12"/>
+                <w:sz w:val="28"/>
+                <w:szCs w:val="28"/>
+                <w:highlight w:val="yellow"/>
+                <w:cs/>
+                <w:lang w:bidi="ta-IN"/>
+              </w:rPr>
+              <w:t>2</w:t>
+            </w:r>
+            <w:r>
+              <w:rPr>
+                <w:rFonts w:ascii="Latha" w:hAnsi="Latha" w:cs="Latha"/>
+                <w:sz w:val="28"/>
+                <w:szCs w:val="28"/>
+                <w:highlight w:val="yellow"/>
+                <w:cs/>
+                <w:lang w:bidi="ta-IN"/>
+              </w:rPr>
+              <w:t>இ</w:t>
+            </w:r>
+            <w:r>
+              <w:rPr>
+                <w:rFonts w:ascii="Latha" w:hAnsi="Latha" w:cs="Latha"/>
+                <w:b/>
+                <w:bCs/>
+                <w:sz w:val="32"/>
+                <w:szCs w:val="32"/>
+                <w:cs/>
+                <w:lang w:bidi="ta-IN"/>
+              </w:rPr>
+              <w:t>:</w:t>
+            </w:r>
+            <w:r>
+              <w:rPr>
+                <w:rFonts w:ascii="Latha" w:hAnsi="Latha" w:cs="Latha"/>
+                <w:sz w:val="28"/>
+                <w:szCs w:val="28"/>
+                <w:lang w:bidi="ta-IN"/>
+              </w:rPr>
+              <w:t xml:space="preserve"> | </w:t>
+            </w:r>
+            <w:r>
+              <w:rPr>
+                <w:rFonts w:ascii="Latha" w:hAnsi="Latha" w:cs="Latha"/>
+                <w:sz w:val="28"/>
+                <w:szCs w:val="28"/>
+                <w:cs/>
+                <w:lang w:bidi="ta-IN"/>
+              </w:rPr>
+              <w:t>ப்</w:t>
+            </w:r>
+            <w:r>
+              <w:rPr>
+                <w:rFonts w:ascii="Latha" w:hAnsi="Latha" w:cs="Latha"/>
+                <w:b/>
+                <w:bCs/>
+                <w:i/>
+                <w:iCs/>
+                <w:sz w:val="28"/>
+                <w:szCs w:val="28"/>
+                <w:cs/>
+                <w:lang w:bidi="ta-IN"/>
+              </w:rPr>
+              <w:t>ரு</w:t>
+            </w:r>
+            <w:r>
+              <w:rPr>
+                <w:rFonts w:ascii="BRH Tamil Tab Extra" w:hAnsi="BRH Tamil Tab Extra" w:cs="Latha"/>
+                <w:b/>
+                <w:sz w:val="32"/>
+                <w:szCs w:val="28"/>
+                <w:lang w:bidi="ta-IN"/>
+              </w:rPr>
+              <w:t>…</w:t>
+            </w:r>
+            <w:r>
+              <w:rPr>
+                <w:rFonts w:ascii="Latha" w:hAnsi="Latha" w:cs="Latha"/>
+                <w:sz w:val="28"/>
+                <w:szCs w:val="28"/>
+                <w:cs/>
+                <w:lang w:bidi="ta-IN"/>
+              </w:rPr>
+              <w:t>ஷ்</w:t>
+            </w:r>
+            <w:r>
+              <w:rPr>
+                <w:rFonts w:ascii="Latha" w:hAnsi="Latha" w:cs="Latha"/>
+                <w:sz w:val="28"/>
+                <w:szCs w:val="28"/>
+                <w:highlight w:val="yellow"/>
+                <w:cs/>
+                <w:lang w:bidi="ta-IN"/>
+              </w:rPr>
+              <w:t>ட</w:t>
+            </w:r>
+            <w:r>
+              <w:rPr>
+                <w:rFonts w:ascii="Latha" w:hAnsi="Latha" w:cs="Latha"/>
+                <w:b/>
+                <w:bCs/>
+                <w:position w:val="-12"/>
+                <w:sz w:val="28"/>
+                <w:szCs w:val="28"/>
+                <w:highlight w:val="yellow"/>
+                <w:cs/>
+                <w:lang w:bidi="ta-IN"/>
+              </w:rPr>
+              <w:t>2</w:t>
+            </w:r>
+            <w:r>
+              <w:rPr>
+                <w:rFonts w:ascii="Latha" w:hAnsi="Latha" w:cs="Latha"/>
+                <w:sz w:val="28"/>
+                <w:szCs w:val="28"/>
+                <w:highlight w:val="yellow"/>
+                <w:cs/>
+                <w:lang w:bidi="ta-IN"/>
+              </w:rPr>
+              <w:t>இ</w:t>
+            </w:r>
+            <w:r>
+              <w:rPr>
+                <w:rFonts w:ascii="Latha" w:hAnsi="Latha" w:cs="Latha"/>
+                <w:sz w:val="28"/>
+                <w:szCs w:val="28"/>
+                <w:cs/>
+                <w:lang w:bidi="ta-IN"/>
+              </w:rPr>
+              <w:t>ரவ</w:t>
+            </w:r>
+            <w:r>
+              <w:rPr>
+                <w:rFonts w:ascii="BRH Tamil Tab Extra" w:hAnsi="BRH Tamil Tab Extra" w:cs="Latha"/>
+                <w:b/>
+                <w:sz w:val="36"/>
+                <w:szCs w:val="28"/>
+                <w:lang w:bidi="ta-IN"/>
+              </w:rPr>
+              <w:t>†</w:t>
+            </w:r>
+            <w:r>
+              <w:rPr>
+                <w:rFonts w:ascii="Latha" w:hAnsi="Latha" w:cs="Latha"/>
+                <w:sz w:val="28"/>
+                <w:szCs w:val="28"/>
+                <w:lang w:bidi="ta-IN"/>
+              </w:rPr>
+              <w:t xml:space="preserve"> |</w:t>
+            </w:r>
+          </w:p>
+        </w:tc>
+        <w:tc>
+          <w:tcPr>
+            <w:tcW w:w="5355" w:type="dxa"/>
+          </w:tcPr>
+          <w:p>
+            <w:pPr>
+              <w:widowControl w:val="0"/>
+              <w:autoSpaceDE w:val="0"/>
+              <w:autoSpaceDN w:val="0"/>
+              <w:adjustRightInd w:val="0"/>
+              <w:spacing w:before="0" w:line="264" w:lineRule="auto"/>
+              <w:rPr>
+                <w:rFonts w:cs="Arial"/>
+                <w:bCs/>
+                <w:color w:val="FF0000"/>
+                <w:sz w:val="32"/>
+                <w:szCs w:val="36"/>
+              </w:rPr>
+            </w:pPr>
+            <w:r>
+              <w:rPr>
+                <w:rFonts w:ascii="Latha" w:hAnsi="Latha" w:cs="Latha"/>
+                <w:sz w:val="28"/>
+                <w:szCs w:val="28"/>
+                <w:cs/>
+                <w:lang w:bidi="ta-IN"/>
+              </w:rPr>
+              <w:t>ஏ</w:t>
+            </w:r>
+            <w:r>
+              <w:rPr>
+                <w:rFonts w:ascii="BRH Tamil Tab Extra" w:hAnsi="BRH Tamil Tab Extra" w:cs="Latha"/>
+                <w:b/>
+                <w:sz w:val="32"/>
+                <w:szCs w:val="28"/>
+                <w:lang w:bidi="ta-IN"/>
+              </w:rPr>
+              <w:t>…</w:t>
+            </w:r>
+            <w:r>
+              <w:rPr>
+                <w:rFonts w:ascii="Latha" w:hAnsi="Latha" w:cs="Latha"/>
+                <w:sz w:val="28"/>
+                <w:szCs w:val="28"/>
+                <w:cs/>
+                <w:lang w:bidi="ta-IN"/>
+              </w:rPr>
+              <w:t>வ</w:t>
+            </w:r>
+            <w:r>
+              <w:rPr>
+                <w:rFonts w:ascii="Latha" w:hAnsi="Latha" w:cs="Latha"/>
+                <w:sz w:val="28"/>
+                <w:szCs w:val="28"/>
+                <w:lang w:bidi="ta-IN"/>
+              </w:rPr>
+              <w:t xml:space="preserve"> </w:t>
+            </w:r>
+            <w:r>
+              <w:rPr>
+                <w:rFonts w:ascii="Latha" w:hAnsi="Latha" w:cs="Latha"/>
+                <w:sz w:val="28"/>
+                <w:szCs w:val="28"/>
+                <w:cs/>
+                <w:lang w:bidi="ta-IN"/>
+              </w:rPr>
+              <w:t>ப்</w:t>
+            </w:r>
+            <w:r>
+              <w:rPr>
+                <w:rFonts w:ascii="Latha" w:hAnsi="Latha" w:cs="Latha"/>
+                <w:b/>
+                <w:bCs/>
+                <w:i/>
+                <w:iCs/>
+                <w:sz w:val="28"/>
+                <w:szCs w:val="28"/>
+                <w:cs/>
+                <w:lang w:bidi="ta-IN"/>
+              </w:rPr>
+              <w:t>ரு</w:t>
+            </w:r>
+            <w:r>
+              <w:rPr>
+                <w:rFonts w:ascii="BRH Tamil Tab Extra" w:hAnsi="BRH Tamil Tab Extra" w:cs="Latha"/>
+                <w:b/>
+                <w:sz w:val="32"/>
+                <w:szCs w:val="28"/>
+                <w:lang w:bidi="ta-IN"/>
+              </w:rPr>
+              <w:t>…</w:t>
+            </w:r>
+            <w:r>
+              <w:rPr>
+                <w:rFonts w:ascii="Latha" w:hAnsi="Latha" w:cs="Latha"/>
+                <w:sz w:val="28"/>
+                <w:szCs w:val="28"/>
+                <w:cs/>
+                <w:lang w:bidi="ta-IN"/>
+              </w:rPr>
+              <w:t>ஷ்</w:t>
+            </w:r>
+            <w:r>
+              <w:rPr>
+                <w:rFonts w:ascii="Latha" w:hAnsi="Latha" w:cs="Latha" w:hint="cs"/>
+                <w:sz w:val="28"/>
+                <w:szCs w:val="28"/>
+                <w:highlight w:val="green"/>
+                <w:cs/>
+                <w:lang w:bidi="ta-IN"/>
+              </w:rPr>
+              <w:t>டை</w:t>
+            </w:r>
+            <w:r>
+              <w:rPr>
+                <w:rFonts w:ascii="Latha" w:hAnsi="Latha" w:cs="Latha"/>
+                <w:b/>
+                <w:bCs/>
+                <w:position w:val="-12"/>
+                <w:sz w:val="28"/>
+                <w:szCs w:val="28"/>
+                <w:highlight w:val="green"/>
+                <w:cs/>
+                <w:lang w:bidi="ta-IN"/>
+              </w:rPr>
+              <w:t>2</w:t>
+            </w:r>
+            <w:r>
+              <w:rPr>
+                <w:rFonts w:ascii="Latha" w:hAnsi="Latha" w:cs="Latha"/>
+                <w:b/>
+                <w:bCs/>
+                <w:sz w:val="32"/>
+                <w:szCs w:val="32"/>
+                <w:highlight w:val="green"/>
+                <w:cs/>
+                <w:lang w:bidi="ta-IN"/>
+              </w:rPr>
+              <w:t>:</w:t>
+            </w:r>
+            <w:r>
+              <w:rPr>
+                <w:rFonts w:ascii="Latha" w:hAnsi="Latha" w:cs="Latha"/>
+                <w:sz w:val="28"/>
+                <w:szCs w:val="28"/>
+                <w:lang w:bidi="ta-IN"/>
+              </w:rPr>
+              <w:t xml:space="preserve"> | </w:t>
+            </w:r>
+            <w:r>
+              <w:rPr>
+                <w:rFonts w:ascii="Latha" w:hAnsi="Latha" w:cs="Latha"/>
+                <w:sz w:val="28"/>
+                <w:szCs w:val="28"/>
+                <w:cs/>
+                <w:lang w:bidi="ta-IN"/>
+              </w:rPr>
+              <w:br/>
+            </w:r>
+            <w:r>
+              <w:rPr>
+                <w:rFonts w:ascii="Latha" w:hAnsi="Latha" w:cs="Latha"/>
+                <w:sz w:val="28"/>
+                <w:szCs w:val="28"/>
+                <w:cs/>
+                <w:lang w:bidi="ta-IN"/>
+              </w:rPr>
+              <w:t>ப்</w:t>
+            </w:r>
+            <w:r>
+              <w:rPr>
+                <w:rFonts w:ascii="Latha" w:hAnsi="Latha" w:cs="Latha"/>
+                <w:b/>
+                <w:bCs/>
+                <w:i/>
+                <w:iCs/>
+                <w:sz w:val="28"/>
+                <w:szCs w:val="28"/>
+                <w:cs/>
+                <w:lang w:bidi="ta-IN"/>
+              </w:rPr>
+              <w:t>ரு</w:t>
+            </w:r>
+            <w:r>
+              <w:rPr>
+                <w:rFonts w:ascii="BRH Tamil Tab Extra" w:hAnsi="BRH Tamil Tab Extra" w:cs="Latha"/>
+                <w:b/>
+                <w:sz w:val="32"/>
+                <w:szCs w:val="28"/>
+                <w:lang w:bidi="ta-IN"/>
+              </w:rPr>
+              <w:t>…</w:t>
+            </w:r>
+            <w:r>
+              <w:rPr>
+                <w:rFonts w:ascii="Latha" w:hAnsi="Latha" w:cs="Latha"/>
+                <w:sz w:val="28"/>
+                <w:szCs w:val="28"/>
+                <w:cs/>
+                <w:lang w:bidi="ta-IN"/>
+              </w:rPr>
+              <w:t>ஷ்</w:t>
+            </w:r>
+            <w:r>
+              <w:rPr>
+                <w:rFonts w:ascii="Latha" w:hAnsi="Latha" w:cs="Latha" w:hint="cs"/>
+                <w:sz w:val="28"/>
+                <w:szCs w:val="28"/>
+                <w:highlight w:val="green"/>
+                <w:cs/>
+                <w:lang w:bidi="ta-IN"/>
+              </w:rPr>
+              <w:t>டை</w:t>
+            </w:r>
+            <w:r>
+              <w:rPr>
+                <w:rFonts w:ascii="Latha" w:hAnsi="Latha" w:cs="Latha"/>
+                <w:b/>
+                <w:bCs/>
+                <w:position w:val="-12"/>
+                <w:sz w:val="28"/>
+                <w:szCs w:val="28"/>
+                <w:highlight w:val="green"/>
+                <w:cs/>
+                <w:lang w:bidi="ta-IN"/>
+              </w:rPr>
+              <w:t>2</w:t>
+            </w:r>
+            <w:r>
+              <w:rPr>
+                <w:rFonts w:ascii="Latha" w:hAnsi="Latha" w:cs="Latha"/>
+                <w:sz w:val="28"/>
+                <w:szCs w:val="28"/>
+                <w:highlight w:val="green"/>
+                <w:cs/>
+                <w:lang w:bidi="ta-IN"/>
+              </w:rPr>
+              <w:t>ரவ</w:t>
+            </w:r>
+            <w:r>
+              <w:rPr>
+                <w:rFonts w:ascii="BRH Tamil Tab Extra" w:hAnsi="BRH Tamil Tab Extra" w:cs="Latha"/>
+                <w:b/>
+                <w:sz w:val="36"/>
+                <w:szCs w:val="28"/>
+                <w:lang w:bidi="ta-IN"/>
+              </w:rPr>
+              <w:t>†</w:t>
+            </w:r>
+            <w:r>
+              <w:rPr>
+                <w:rFonts w:ascii="Latha" w:hAnsi="Latha" w:cs="Latha"/>
+                <w:sz w:val="28"/>
+                <w:szCs w:val="28"/>
+                <w:lang w:bidi="ta-IN"/>
+              </w:rPr>
+              <w:t xml:space="preserve"> |</w:t>
+            </w:r>
+          </w:p>
+        </w:tc>
+      </w:tr>
+      <w:tr>
+        <w:trPr>
+          <w:trHeight w:val="680"/>
+        </w:trPr>
+        <w:tc>
+          <w:tcPr>
+            <w:tcW w:w="3877" w:type="dxa"/>
+          </w:tcPr>
+          <w:p>
+            <w:pPr>
+              <w:widowControl w:val="0"/>
+              <w:tabs>
+                <w:tab w:val="left" w:pos="993"/>
+              </w:tabs>
+              <w:autoSpaceDE w:val="0"/>
+              <w:autoSpaceDN w:val="0"/>
+              <w:adjustRightInd w:val="0"/>
+              <w:spacing w:before="0" w:line="252" w:lineRule="auto"/>
+              <w:ind w:right="297"/>
+              <w:rPr>
+                <w:rFonts w:cs="Arial"/>
+                <w:b/>
+                <w:sz w:val="28"/>
+                <w:szCs w:val="28"/>
+              </w:rPr>
+            </w:pPr>
+            <w:r>
+              <w:rPr>
+                <w:rFonts w:cs="Arial"/>
+                <w:b/>
+                <w:sz w:val="28"/>
+                <w:szCs w:val="28"/>
+              </w:rPr>
+              <w:t>T.S.7.4.</w:t>
+            </w:r>
+            <w:r>
+              <w:rPr>
+                <w:rFonts w:cs="Arial"/>
+                <w:b/>
+                <w:sz w:val="28"/>
+                <w:szCs w:val="28"/>
+              </w:rPr>
+              <w:t>2</w:t>
+            </w:r>
+            <w:r>
+              <w:rPr>
+                <w:rFonts w:cs="Arial"/>
+                <w:b/>
+                <w:sz w:val="28"/>
+                <w:szCs w:val="28"/>
+              </w:rPr>
+              <w:t>.</w:t>
+            </w:r>
+            <w:r>
+              <w:rPr>
+                <w:rFonts w:cs="Arial"/>
+                <w:b/>
+                <w:sz w:val="28"/>
+                <w:szCs w:val="28"/>
+              </w:rPr>
+              <w:t>5</w:t>
+            </w:r>
+            <w:r>
+              <w:rPr>
+                <w:rFonts w:cs="Arial"/>
+                <w:b/>
+                <w:sz w:val="28"/>
+                <w:szCs w:val="28"/>
+              </w:rPr>
+              <w:t xml:space="preserve"> – Kramam</w:t>
+            </w:r>
+          </w:p>
+          <w:p>
+            <w:pPr>
+              <w:widowControl w:val="0"/>
+              <w:tabs>
+                <w:tab w:val="left" w:pos="993"/>
+              </w:tabs>
+              <w:autoSpaceDE w:val="0"/>
+              <w:autoSpaceDN w:val="0"/>
+              <w:adjustRightInd w:val="0"/>
+              <w:spacing w:before="0" w:line="252" w:lineRule="auto"/>
+              <w:ind w:right="297"/>
+              <w:rPr>
+                <w:rFonts w:cs="Arial"/>
+                <w:b/>
+                <w:sz w:val="28"/>
+                <w:szCs w:val="28"/>
+              </w:rPr>
+            </w:pPr>
+            <w:r>
+              <w:rPr>
+                <w:rFonts w:cs="Arial"/>
+                <w:b/>
+                <w:sz w:val="28"/>
+                <w:szCs w:val="28"/>
+              </w:rPr>
+              <w:t xml:space="preserve">Krama Vaakyam No.– </w:t>
+            </w:r>
+            <w:r>
+              <w:rPr>
+                <w:rFonts w:cs="Arial"/>
+                <w:b/>
+                <w:sz w:val="28"/>
+                <w:szCs w:val="28"/>
+              </w:rPr>
+              <w:t>40,41,42</w:t>
+            </w:r>
+          </w:p>
+          <w:p>
+            <w:pPr>
+              <w:widowControl w:val="0"/>
+              <w:tabs>
+                <w:tab w:val="left" w:pos="993"/>
+              </w:tabs>
+              <w:autoSpaceDE w:val="0"/>
+              <w:autoSpaceDN w:val="0"/>
+              <w:adjustRightInd w:val="0"/>
+              <w:spacing w:before="0" w:line="252" w:lineRule="auto"/>
+              <w:ind w:right="297"/>
+              <w:rPr>
+                <w:rFonts w:cs="Arial"/>
+                <w:b/>
+                <w:sz w:val="28"/>
+                <w:szCs w:val="28"/>
+              </w:rPr>
+            </w:pPr>
+            <w:r>
+              <w:rPr>
+                <w:rFonts w:cs="Arial"/>
+                <w:b/>
+                <w:sz w:val="28"/>
+                <w:szCs w:val="28"/>
+              </w:rPr>
+              <w:t xml:space="preserve">Panchaati No. - </w:t>
+            </w:r>
+            <w:r>
+              <w:rPr>
+                <w:rFonts w:cs="Arial"/>
+                <w:b/>
+                <w:sz w:val="28"/>
+                <w:szCs w:val="28"/>
+              </w:rPr>
+              <w:t>8</w:t>
+            </w:r>
+          </w:p>
+        </w:tc>
+        <w:tc>
+          <w:tcPr>
+            <w:tcW w:w="4738" w:type="dxa"/>
+          </w:tcPr>
+          <w:p>
+            <w:pPr>
+              <w:widowControl w:val="0"/>
+              <w:autoSpaceDE w:val="0"/>
+              <w:autoSpaceDN w:val="0"/>
+              <w:adjustRightInd w:val="0"/>
+              <w:spacing w:before="0" w:line="264" w:lineRule="auto"/>
+              <w:rPr>
+                <w:rFonts w:ascii="Latha" w:hAnsi="Latha" w:cs="Latha"/>
+                <w:sz w:val="28"/>
+                <w:szCs w:val="28"/>
+                <w:cs/>
+                <w:lang w:bidi="ta-IN"/>
+              </w:rPr>
+            </w:pPr>
+            <w:r>
+              <w:rPr>
+                <w:rFonts w:ascii="Latha" w:hAnsi="Latha" w:cs="Latha"/>
+                <w:sz w:val="28"/>
+                <w:szCs w:val="28"/>
+                <w:cs/>
+                <w:lang w:bidi="ta-IN"/>
+              </w:rPr>
+              <w:t>ஸ்தோமா</w:t>
+            </w:r>
+            <w:r>
+              <w:rPr>
+                <w:rFonts w:ascii="BRH Tamil Tab Extra" w:hAnsi="BRH Tamil Tab Extra" w:cs="Latha"/>
+                <w:b/>
+                <w:sz w:val="36"/>
+                <w:szCs w:val="28"/>
+                <w:lang w:bidi="ta-IN"/>
+              </w:rPr>
+              <w:t>†</w:t>
+            </w:r>
+            <w:r>
+              <w:rPr>
+                <w:rFonts w:ascii="Latha" w:hAnsi="Latha" w:cs="Latha"/>
+                <w:sz w:val="28"/>
+                <w:szCs w:val="28"/>
+                <w:cs/>
+                <w:lang w:bidi="ta-IN"/>
+              </w:rPr>
+              <w:t>னா</w:t>
+            </w:r>
+            <w:r>
+              <w:rPr>
+                <w:rFonts w:ascii="BRH Tamil Tab Extra" w:hAnsi="BRH Tamil Tab Extra" w:cs="Latha"/>
+                <w:b/>
+                <w:sz w:val="32"/>
+                <w:szCs w:val="28"/>
+                <w:lang w:bidi="ta-IN"/>
+              </w:rPr>
+              <w:t>…</w:t>
+            </w:r>
+            <w:r>
+              <w:rPr>
+                <w:rFonts w:ascii="BRH Devanagari Extra" w:hAnsi="BRH Devanagari Extra" w:cs="Latha"/>
+                <w:b/>
+                <w:sz w:val="36"/>
+                <w:szCs w:val="28"/>
+                <w:lang w:bidi="ta-IN"/>
+              </w:rPr>
+              <w:t>óè</w:t>
+            </w:r>
+            <w:r>
+              <w:rPr>
+                <w:rFonts w:ascii="BRH Tamil Tab Extra" w:hAnsi="BRH Tamil Tab Extra" w:cs="Latha"/>
+                <w:b/>
+                <w:sz w:val="32"/>
+                <w:szCs w:val="28"/>
+                <w:lang w:bidi="ta-IN"/>
+              </w:rPr>
+              <w:t>…</w:t>
+            </w:r>
+            <w:r>
+              <w:rPr>
+                <w:rFonts w:ascii="Latha" w:hAnsi="Latha" w:cs="Latha"/>
+                <w:sz w:val="28"/>
+                <w:szCs w:val="28"/>
+                <w:lang w:bidi="ta-IN"/>
+              </w:rPr>
+              <w:t xml:space="preserve"> </w:t>
+            </w:r>
+            <w:r>
+              <w:rPr>
+                <w:rFonts w:ascii="Latha" w:hAnsi="Latha" w:cs="Latha"/>
+                <w:sz w:val="28"/>
+                <w:szCs w:val="28"/>
+                <w:cs/>
+                <w:lang w:bidi="ta-IN"/>
+              </w:rPr>
+              <w:t>ஸம்ப</w:t>
+            </w:r>
+            <w:r>
+              <w:rPr>
+                <w:rFonts w:ascii="BRH Tamil Tab Extra" w:hAnsi="BRH Tamil Tab Extra" w:cs="Latha"/>
+                <w:b/>
+                <w:sz w:val="36"/>
+                <w:szCs w:val="28"/>
+                <w:highlight w:val="cyan"/>
+                <w:lang w:bidi="ta-IN"/>
+              </w:rPr>
+              <w:t>†</w:t>
+            </w:r>
+            <w:r>
+              <w:rPr>
+                <w:rFonts w:ascii="Latha" w:hAnsi="Latha" w:cs="Latha"/>
+                <w:sz w:val="28"/>
+                <w:szCs w:val="28"/>
+                <w:highlight w:val="yellow"/>
+                <w:cs/>
+                <w:lang w:bidi="ta-IN"/>
+              </w:rPr>
+              <w:t>த்</w:t>
+            </w:r>
+            <w:r>
+              <w:rPr>
+                <w:rFonts w:ascii="Latha" w:hAnsi="Latha" w:cs="Latha"/>
+                <w:sz w:val="28"/>
+                <w:szCs w:val="28"/>
+                <w:cs/>
+                <w:lang w:bidi="ta-IN"/>
+              </w:rPr>
+              <w:t>யை</w:t>
+            </w:r>
+            <w:r>
+              <w:rPr>
+                <w:rFonts w:ascii="Latha" w:hAnsi="Latha" w:cs="Latha"/>
+                <w:sz w:val="28"/>
+                <w:szCs w:val="28"/>
+                <w:lang w:bidi="ta-IN"/>
+              </w:rPr>
+              <w:t xml:space="preserve"> | </w:t>
+            </w:r>
+            <w:r>
+              <w:rPr>
+                <w:rFonts w:ascii="Latha" w:hAnsi="Latha" w:cs="Latha"/>
+                <w:sz w:val="28"/>
+                <w:szCs w:val="28"/>
+                <w:cs/>
+                <w:lang w:bidi="ta-IN"/>
+              </w:rPr>
+              <w:t>ஸம்ப</w:t>
+            </w:r>
+            <w:r>
+              <w:rPr>
+                <w:rFonts w:ascii="BRH Tamil Tab Extra" w:hAnsi="BRH Tamil Tab Extra" w:cs="Latha"/>
+                <w:b/>
+                <w:sz w:val="36"/>
+                <w:szCs w:val="28"/>
+                <w:highlight w:val="yellow"/>
+                <w:lang w:bidi="ta-IN"/>
+              </w:rPr>
+              <w:t>†</w:t>
+            </w:r>
+            <w:r>
+              <w:rPr>
+                <w:rFonts w:ascii="Latha" w:hAnsi="Latha" w:cs="Latha"/>
+                <w:sz w:val="28"/>
+                <w:szCs w:val="28"/>
+                <w:highlight w:val="yellow"/>
+                <w:cs/>
+                <w:lang w:bidi="ta-IN"/>
+              </w:rPr>
+              <w:t>த்</w:t>
+            </w:r>
+            <w:r>
+              <w:rPr>
+                <w:rFonts w:ascii="Latha" w:hAnsi="Latha" w:cs="Latha"/>
+                <w:sz w:val="28"/>
+                <w:szCs w:val="28"/>
+                <w:cs/>
+                <w:lang w:bidi="ta-IN"/>
+              </w:rPr>
+              <w:t>யை</w:t>
+            </w:r>
+            <w:r>
+              <w:rPr>
+                <w:rFonts w:ascii="Latha" w:hAnsi="Latha" w:cs="Latha"/>
+                <w:sz w:val="28"/>
+                <w:szCs w:val="28"/>
+                <w:lang w:bidi="ta-IN"/>
+              </w:rPr>
+              <w:t xml:space="preserve"> </w:t>
+            </w:r>
+            <w:r>
+              <w:rPr>
+                <w:rFonts w:ascii="Latha" w:hAnsi="Latha" w:cs="Latha"/>
+                <w:sz w:val="28"/>
+                <w:szCs w:val="28"/>
+                <w:cs/>
+                <w:lang w:bidi="ta-IN"/>
+              </w:rPr>
+              <w:t>ப்ரப</w:t>
+            </w:r>
+            <w:r>
+              <w:rPr>
+                <w:rFonts w:ascii="BRH Tamil Tab Extra" w:hAnsi="BRH Tamil Tab Extra" w:cs="Latha"/>
+                <w:b/>
+                <w:sz w:val="32"/>
+                <w:szCs w:val="28"/>
+                <w:lang w:bidi="ta-IN"/>
+              </w:rPr>
+              <w:t>…</w:t>
+            </w:r>
+            <w:r>
+              <w:rPr>
+                <w:rFonts w:ascii="Latha" w:hAnsi="Latha" w:cs="Latha"/>
+                <w:b/>
+                <w:bCs/>
+                <w:position w:val="-12"/>
+                <w:sz w:val="28"/>
+                <w:szCs w:val="28"/>
+                <w:cs/>
+                <w:lang w:bidi="ta-IN"/>
+              </w:rPr>
+              <w:t>4</w:t>
+            </w:r>
+            <w:r>
+              <w:rPr>
+                <w:rFonts w:ascii="Latha" w:hAnsi="Latha" w:cs="Latha"/>
+                <w:sz w:val="28"/>
+                <w:szCs w:val="28"/>
+                <w:cs/>
+                <w:lang w:bidi="ta-IN"/>
+              </w:rPr>
+              <w:t>வாய</w:t>
+            </w:r>
+            <w:r>
+              <w:rPr>
+                <w:rFonts w:ascii="BRH Tamil Tab Extra" w:hAnsi="BRH Tamil Tab Extra" w:cs="Latha"/>
+                <w:b/>
+                <w:sz w:val="36"/>
+                <w:szCs w:val="28"/>
+                <w:lang w:bidi="ta-IN"/>
+              </w:rPr>
+              <w:t>†</w:t>
+            </w:r>
+            <w:r>
+              <w:rPr>
+                <w:rFonts w:ascii="Latha" w:hAnsi="Latha" w:cs="Latha"/>
+                <w:sz w:val="28"/>
+                <w:szCs w:val="28"/>
+                <w:lang w:bidi="ta-IN"/>
+              </w:rPr>
+              <w:t xml:space="preserve"> | </w:t>
+            </w:r>
+            <w:r>
+              <w:rPr>
+                <w:rFonts w:ascii="Latha" w:hAnsi="Latha" w:cs="Latha"/>
+                <w:sz w:val="28"/>
+                <w:szCs w:val="28"/>
+                <w:cs/>
+                <w:lang w:bidi="ta-IN"/>
+              </w:rPr>
+              <w:t>ஸம்ப</w:t>
+            </w:r>
+            <w:r>
+              <w:rPr>
+                <w:rFonts w:ascii="BRH Tamil Tab Extra" w:hAnsi="BRH Tamil Tab Extra" w:cs="Latha"/>
+                <w:b/>
+                <w:sz w:val="36"/>
+                <w:szCs w:val="28"/>
+                <w:lang w:bidi="ta-IN"/>
+              </w:rPr>
+              <w:t>†</w:t>
+            </w:r>
+            <w:r>
+              <w:rPr>
+                <w:rFonts w:ascii="Latha" w:hAnsi="Latha" w:cs="Latha"/>
+                <w:sz w:val="28"/>
+                <w:szCs w:val="28"/>
+                <w:highlight w:val="yellow"/>
+                <w:cs/>
+                <w:lang w:bidi="ta-IN"/>
+              </w:rPr>
+              <w:t>த்</w:t>
+            </w:r>
+            <w:r>
+              <w:rPr>
+                <w:rFonts w:ascii="Latha" w:hAnsi="Latha" w:cs="Latha"/>
+                <w:sz w:val="28"/>
+                <w:szCs w:val="28"/>
+                <w:cs/>
+                <w:lang w:bidi="ta-IN"/>
+              </w:rPr>
+              <w:t>யா</w:t>
+            </w:r>
+            <w:r>
+              <w:rPr>
+                <w:rFonts w:ascii="BRH Tamil Tab Extra" w:hAnsi="BRH Tamil Tab Extra" w:cs="Latha"/>
+                <w:b/>
+                <w:sz w:val="32"/>
+                <w:szCs w:val="28"/>
+                <w:lang w:bidi="ta-IN"/>
+              </w:rPr>
+              <w:t>…</w:t>
+            </w:r>
+            <w:r>
+              <w:rPr>
+                <w:rFonts w:ascii="Latha" w:hAnsi="Latha" w:cs="Latha"/>
+                <w:sz w:val="28"/>
+                <w:szCs w:val="28"/>
+                <w:lang w:bidi="ta-IN"/>
+              </w:rPr>
+              <w:t xml:space="preserve"> </w:t>
+            </w:r>
+            <w:r>
+              <w:rPr>
+                <w:rFonts w:ascii="Latha" w:hAnsi="Latha" w:cs="Latha"/>
+                <w:sz w:val="28"/>
+                <w:szCs w:val="28"/>
+                <w:cs/>
+                <w:lang w:bidi="ta-IN"/>
+              </w:rPr>
+              <w:t>இதி</w:t>
+            </w:r>
+            <w:r>
+              <w:rPr>
+                <w:rFonts w:ascii="BRH Tamil Tab Extra" w:hAnsi="BRH Tamil Tab Extra" w:cs="Latha"/>
+                <w:b/>
+                <w:sz w:val="32"/>
+                <w:szCs w:val="28"/>
+                <w:lang w:bidi="ta-IN"/>
+              </w:rPr>
+              <w:t>…</w:t>
+            </w:r>
+            <w:r>
+              <w:rPr>
+                <w:rFonts w:ascii="Latha" w:hAnsi="Latha" w:cs="Latha"/>
+                <w:sz w:val="28"/>
+                <w:szCs w:val="28"/>
+                <w:lang w:bidi="ta-IN"/>
+              </w:rPr>
+              <w:t xml:space="preserve"> </w:t>
+            </w:r>
+            <w:r>
+              <w:rPr>
+                <w:rFonts w:ascii="Latha" w:hAnsi="Latha" w:cs="Latha"/>
+                <w:sz w:val="28"/>
+                <w:szCs w:val="28"/>
+                <w:cs/>
+                <w:lang w:bidi="ta-IN"/>
+              </w:rPr>
+              <w:t>ஸம்</w:t>
+            </w:r>
+            <w:r>
+              <w:rPr>
+                <w:rFonts w:ascii="Latha" w:hAnsi="Latha" w:cs="Latha"/>
+                <w:sz w:val="28"/>
+                <w:szCs w:val="28"/>
+                <w:lang w:bidi="ta-IN"/>
+              </w:rPr>
+              <w:t xml:space="preserve"> - </w:t>
+            </w:r>
+            <w:r>
+              <w:rPr>
+                <w:rFonts w:ascii="Latha" w:hAnsi="Latha" w:cs="Latha"/>
+                <w:sz w:val="28"/>
+                <w:szCs w:val="28"/>
+                <w:cs/>
+                <w:lang w:bidi="ta-IN"/>
+              </w:rPr>
+              <w:t>ப</w:t>
+            </w:r>
+            <w:r>
+              <w:rPr>
+                <w:rFonts w:ascii="BRH Tamil Tab Extra" w:hAnsi="BRH Tamil Tab Extra" w:cs="Latha"/>
+                <w:b/>
+                <w:sz w:val="32"/>
+                <w:szCs w:val="28"/>
+                <w:lang w:bidi="ta-IN"/>
+              </w:rPr>
+              <w:t>…</w:t>
+            </w:r>
+            <w:r>
+              <w:rPr>
+                <w:rFonts w:ascii="Latha" w:hAnsi="Latha" w:cs="Latha"/>
+                <w:sz w:val="28"/>
+                <w:szCs w:val="28"/>
+                <w:highlight w:val="yellow"/>
+                <w:cs/>
+                <w:lang w:bidi="ta-IN"/>
+              </w:rPr>
+              <w:t>த்</w:t>
+            </w:r>
+            <w:r>
+              <w:rPr>
+                <w:rFonts w:ascii="Latha" w:hAnsi="Latha" w:cs="Latha"/>
+                <w:sz w:val="28"/>
+                <w:szCs w:val="28"/>
+                <w:cs/>
+                <w:lang w:bidi="ta-IN"/>
+              </w:rPr>
+              <w:t>யை</w:t>
+            </w:r>
+            <w:r>
+              <w:rPr>
+                <w:rFonts w:ascii="BRH Tamil Tab Extra" w:hAnsi="BRH Tamil Tab Extra" w:cs="Latha"/>
+                <w:b/>
+                <w:sz w:val="32"/>
+                <w:szCs w:val="28"/>
+                <w:lang w:bidi="ta-IN"/>
+              </w:rPr>
+              <w:t>…</w:t>
+            </w:r>
+            <w:r>
+              <w:rPr>
+                <w:rFonts w:ascii="Latha" w:hAnsi="Latha" w:cs="Latha"/>
+                <w:sz w:val="28"/>
+                <w:szCs w:val="28"/>
+                <w:lang w:bidi="ta-IN"/>
+              </w:rPr>
+              <w:t xml:space="preserve"> |</w:t>
+            </w:r>
+          </w:p>
+        </w:tc>
+        <w:tc>
+          <w:tcPr>
+            <w:tcW w:w="5355" w:type="dxa"/>
+          </w:tcPr>
+          <w:p>
+            <w:pPr>
+              <w:widowControl w:val="0"/>
+              <w:autoSpaceDE w:val="0"/>
+              <w:autoSpaceDN w:val="0"/>
+              <w:adjustRightInd w:val="0"/>
+              <w:spacing w:before="0" w:line="264" w:lineRule="auto"/>
+              <w:rPr>
+                <w:rFonts w:ascii="Latha" w:hAnsi="Latha" w:cs="Latha"/>
+                <w:sz w:val="28"/>
+                <w:szCs w:val="28"/>
+                <w:cs/>
+                <w:lang w:bidi="ta-IN"/>
+              </w:rPr>
+            </w:pPr>
+            <w:r>
+              <w:rPr>
+                <w:rFonts w:ascii="Latha" w:hAnsi="Latha" w:cs="Latha"/>
+                <w:sz w:val="28"/>
+                <w:szCs w:val="28"/>
+                <w:cs/>
+                <w:lang w:bidi="ta-IN"/>
+              </w:rPr>
+              <w:t>ஸ்தோமா</w:t>
+            </w:r>
+            <w:r>
+              <w:rPr>
+                <w:rFonts w:ascii="BRH Tamil Tab Extra" w:hAnsi="BRH Tamil Tab Extra" w:cs="Latha"/>
+                <w:b/>
+                <w:sz w:val="36"/>
+                <w:szCs w:val="28"/>
+                <w:lang w:bidi="ta-IN"/>
+              </w:rPr>
+              <w:t>†</w:t>
+            </w:r>
+            <w:r>
+              <w:rPr>
+                <w:rFonts w:ascii="Latha" w:hAnsi="Latha" w:cs="Latha"/>
+                <w:sz w:val="28"/>
+                <w:szCs w:val="28"/>
+                <w:cs/>
+                <w:lang w:bidi="ta-IN"/>
+              </w:rPr>
+              <w:t>னா</w:t>
+            </w:r>
+            <w:r>
+              <w:rPr>
+                <w:rFonts w:ascii="BRH Tamil Tab Extra" w:hAnsi="BRH Tamil Tab Extra" w:cs="Latha"/>
+                <w:b/>
+                <w:sz w:val="32"/>
+                <w:szCs w:val="28"/>
+                <w:lang w:bidi="ta-IN"/>
+              </w:rPr>
+              <w:t>…</w:t>
+            </w:r>
+            <w:r>
+              <w:rPr>
+                <w:rFonts w:ascii="BRH Devanagari Extra" w:hAnsi="BRH Devanagari Extra" w:cs="Latha"/>
+                <w:b/>
+                <w:sz w:val="36"/>
+                <w:szCs w:val="28"/>
+                <w:lang w:bidi="ta-IN"/>
+              </w:rPr>
+              <w:t>óè</w:t>
+            </w:r>
+            <w:r>
+              <w:rPr>
+                <w:rFonts w:ascii="BRH Tamil Tab Extra" w:hAnsi="BRH Tamil Tab Extra" w:cs="Latha"/>
+                <w:b/>
+                <w:sz w:val="32"/>
+                <w:szCs w:val="28"/>
+                <w:lang w:bidi="ta-IN"/>
+              </w:rPr>
+              <w:t>…</w:t>
+            </w:r>
+            <w:r>
+              <w:rPr>
+                <w:rFonts w:ascii="Latha" w:hAnsi="Latha" w:cs="Latha"/>
+                <w:sz w:val="28"/>
+                <w:szCs w:val="28"/>
+                <w:lang w:bidi="ta-IN"/>
+              </w:rPr>
+              <w:t xml:space="preserve"> </w:t>
+            </w:r>
+            <w:r>
+              <w:rPr>
+                <w:rFonts w:ascii="Latha" w:hAnsi="Latha" w:cs="Latha"/>
+                <w:sz w:val="28"/>
+                <w:szCs w:val="28"/>
+                <w:cs/>
+                <w:lang w:bidi="ta-IN"/>
+              </w:rPr>
+              <w:t>ஸம்ப</w:t>
+            </w:r>
+            <w:r>
+              <w:rPr>
+                <w:rFonts w:ascii="BRH Tamil Tab Extra" w:hAnsi="BRH Tamil Tab Extra" w:cs="Latha"/>
+                <w:b/>
+                <w:sz w:val="36"/>
+                <w:szCs w:val="28"/>
+                <w:highlight w:val="cyan"/>
+                <w:lang w:bidi="ta-IN"/>
+              </w:rPr>
+              <w:t>†</w:t>
+            </w:r>
+            <w:r>
+              <w:rPr>
+                <w:rFonts w:ascii="Latha" w:hAnsi="Latha" w:cs="Latha"/>
+                <w:sz w:val="28"/>
+                <w:szCs w:val="28"/>
+                <w:highlight w:val="green"/>
+                <w:cs/>
+                <w:lang w:bidi="ta-IN"/>
+              </w:rPr>
+              <w:t>த்த்</w:t>
+            </w:r>
+            <w:r>
+              <w:rPr>
+                <w:rFonts w:ascii="Latha" w:hAnsi="Latha" w:cs="Latha"/>
+                <w:sz w:val="28"/>
+                <w:szCs w:val="28"/>
+                <w:cs/>
+                <w:lang w:bidi="ta-IN"/>
+              </w:rPr>
+              <w:t>யை</w:t>
+            </w:r>
+            <w:r>
+              <w:rPr>
+                <w:rFonts w:ascii="Latha" w:hAnsi="Latha" w:cs="Latha"/>
+                <w:sz w:val="28"/>
+                <w:szCs w:val="28"/>
+                <w:lang w:bidi="ta-IN"/>
+              </w:rPr>
+              <w:t xml:space="preserve"> | </w:t>
+            </w:r>
+            <w:r>
+              <w:rPr>
+                <w:rFonts w:ascii="Latha" w:hAnsi="Latha" w:cs="Latha"/>
+                <w:sz w:val="28"/>
+                <w:szCs w:val="28"/>
+                <w:cs/>
+                <w:lang w:bidi="ta-IN"/>
+              </w:rPr>
+              <w:t>ஸம்ப</w:t>
+            </w:r>
+            <w:r>
+              <w:rPr>
+                <w:rFonts w:ascii="BRH Tamil Tab Extra" w:hAnsi="BRH Tamil Tab Extra" w:cs="Latha"/>
+                <w:b/>
+                <w:sz w:val="36"/>
+                <w:szCs w:val="28"/>
+                <w:highlight w:val="yellow"/>
+                <w:lang w:bidi="ta-IN"/>
+              </w:rPr>
+              <w:t>†</w:t>
+            </w:r>
+            <w:r>
+              <w:rPr>
+                <w:rFonts w:ascii="Latha" w:hAnsi="Latha" w:cs="Latha"/>
+                <w:sz w:val="28"/>
+                <w:szCs w:val="28"/>
+                <w:highlight w:val="green"/>
+                <w:cs/>
+                <w:lang w:bidi="ta-IN"/>
+              </w:rPr>
+              <w:t>த்த்</w:t>
+            </w:r>
+            <w:r>
+              <w:rPr>
+                <w:rFonts w:ascii="Latha" w:hAnsi="Latha" w:cs="Latha"/>
+                <w:sz w:val="28"/>
+                <w:szCs w:val="28"/>
+                <w:cs/>
+                <w:lang w:bidi="ta-IN"/>
+              </w:rPr>
+              <w:t>யை</w:t>
+            </w:r>
+            <w:r>
+              <w:rPr>
+                <w:rFonts w:ascii="Latha" w:hAnsi="Latha" w:cs="Latha"/>
+                <w:sz w:val="28"/>
+                <w:szCs w:val="28"/>
+                <w:lang w:bidi="ta-IN"/>
+              </w:rPr>
+              <w:t xml:space="preserve"> </w:t>
+            </w:r>
+            <w:r>
+              <w:rPr>
+                <w:rFonts w:ascii="Latha" w:hAnsi="Latha" w:cs="Latha"/>
+                <w:sz w:val="28"/>
+                <w:szCs w:val="28"/>
+                <w:cs/>
+                <w:lang w:bidi="ta-IN"/>
+              </w:rPr>
+              <w:t>ப்ரப</w:t>
+            </w:r>
+            <w:r>
+              <w:rPr>
+                <w:rFonts w:ascii="BRH Tamil Tab Extra" w:hAnsi="BRH Tamil Tab Extra" w:cs="Latha"/>
+                <w:b/>
+                <w:sz w:val="32"/>
+                <w:szCs w:val="28"/>
+                <w:lang w:bidi="ta-IN"/>
+              </w:rPr>
+              <w:t>…</w:t>
+            </w:r>
+            <w:r>
+              <w:rPr>
+                <w:rFonts w:ascii="Latha" w:hAnsi="Latha" w:cs="Latha"/>
+                <w:b/>
+                <w:bCs/>
+                <w:position w:val="-12"/>
+                <w:sz w:val="28"/>
+                <w:szCs w:val="28"/>
+                <w:cs/>
+                <w:lang w:bidi="ta-IN"/>
+              </w:rPr>
+              <w:t>4</w:t>
+            </w:r>
+            <w:r>
+              <w:rPr>
+                <w:rFonts w:ascii="Latha" w:hAnsi="Latha" w:cs="Latha"/>
+                <w:sz w:val="28"/>
+                <w:szCs w:val="28"/>
+                <w:cs/>
+                <w:lang w:bidi="ta-IN"/>
+              </w:rPr>
+              <w:t>வாய</w:t>
+            </w:r>
+            <w:r>
+              <w:rPr>
+                <w:rFonts w:ascii="BRH Tamil Tab Extra" w:hAnsi="BRH Tamil Tab Extra" w:cs="Latha"/>
+                <w:b/>
+                <w:sz w:val="36"/>
+                <w:szCs w:val="28"/>
+                <w:lang w:bidi="ta-IN"/>
+              </w:rPr>
+              <w:t>†</w:t>
+            </w:r>
+            <w:r>
+              <w:rPr>
+                <w:rFonts w:ascii="Latha" w:hAnsi="Latha" w:cs="Latha"/>
+                <w:sz w:val="28"/>
+                <w:szCs w:val="28"/>
+                <w:lang w:bidi="ta-IN"/>
+              </w:rPr>
+              <w:t xml:space="preserve"> | </w:t>
+            </w:r>
+            <w:r>
+              <w:rPr>
+                <w:rFonts w:ascii="Latha" w:hAnsi="Latha" w:cs="Latha"/>
+                <w:sz w:val="28"/>
+                <w:szCs w:val="28"/>
+                <w:cs/>
+                <w:lang w:bidi="ta-IN"/>
+              </w:rPr>
+              <w:t>ஸம்ப</w:t>
+            </w:r>
+            <w:r>
+              <w:rPr>
+                <w:rFonts w:ascii="BRH Tamil Tab Extra" w:hAnsi="BRH Tamil Tab Extra" w:cs="Latha"/>
+                <w:b/>
+                <w:sz w:val="36"/>
+                <w:szCs w:val="28"/>
+                <w:lang w:bidi="ta-IN"/>
+              </w:rPr>
+              <w:t>†</w:t>
+            </w:r>
+            <w:r>
+              <w:rPr>
+                <w:rFonts w:ascii="Latha" w:hAnsi="Latha" w:cs="Latha"/>
+                <w:sz w:val="28"/>
+                <w:szCs w:val="28"/>
+                <w:highlight w:val="green"/>
+                <w:cs/>
+                <w:lang w:bidi="ta-IN"/>
+              </w:rPr>
+              <w:t>த்த்</w:t>
+            </w:r>
+            <w:r>
+              <w:rPr>
+                <w:rFonts w:ascii="Latha" w:hAnsi="Latha" w:cs="Latha"/>
+                <w:sz w:val="28"/>
+                <w:szCs w:val="28"/>
+                <w:cs/>
+                <w:lang w:bidi="ta-IN"/>
+              </w:rPr>
+              <w:t>யா</w:t>
+            </w:r>
+            <w:r>
+              <w:rPr>
+                <w:rFonts w:ascii="BRH Tamil Tab Extra" w:hAnsi="BRH Tamil Tab Extra" w:cs="Latha"/>
+                <w:b/>
+                <w:sz w:val="32"/>
+                <w:szCs w:val="28"/>
+                <w:lang w:bidi="ta-IN"/>
+              </w:rPr>
+              <w:t>…</w:t>
+            </w:r>
+            <w:r>
+              <w:rPr>
+                <w:rFonts w:ascii="Latha" w:hAnsi="Latha" w:cs="Latha"/>
+                <w:sz w:val="28"/>
+                <w:szCs w:val="28"/>
+                <w:lang w:bidi="ta-IN"/>
+              </w:rPr>
+              <w:t xml:space="preserve"> </w:t>
+            </w:r>
+            <w:r>
+              <w:rPr>
+                <w:rFonts w:ascii="Latha" w:hAnsi="Latha" w:cs="Latha"/>
+                <w:sz w:val="28"/>
+                <w:szCs w:val="28"/>
+                <w:cs/>
+                <w:lang w:bidi="ta-IN"/>
+              </w:rPr>
+              <w:t>இதி</w:t>
+            </w:r>
+            <w:r>
+              <w:rPr>
+                <w:rFonts w:ascii="BRH Tamil Tab Extra" w:hAnsi="BRH Tamil Tab Extra" w:cs="Latha"/>
+                <w:b/>
+                <w:sz w:val="32"/>
+                <w:szCs w:val="28"/>
+                <w:lang w:bidi="ta-IN"/>
+              </w:rPr>
+              <w:t>…</w:t>
+            </w:r>
+            <w:r>
+              <w:rPr>
+                <w:rFonts w:ascii="Latha" w:hAnsi="Latha" w:cs="Latha"/>
+                <w:sz w:val="28"/>
+                <w:szCs w:val="28"/>
+                <w:lang w:bidi="ta-IN"/>
+              </w:rPr>
+              <w:t xml:space="preserve"> </w:t>
+            </w:r>
+            <w:r>
+              <w:rPr>
+                <w:rFonts w:ascii="Latha" w:hAnsi="Latha" w:cs="Latha"/>
+                <w:sz w:val="28"/>
+                <w:szCs w:val="28"/>
+                <w:cs/>
+                <w:lang w:bidi="ta-IN"/>
+              </w:rPr>
+              <w:t>ஸம்</w:t>
+            </w:r>
+            <w:r>
+              <w:rPr>
+                <w:rFonts w:ascii="Latha" w:hAnsi="Latha" w:cs="Latha"/>
+                <w:sz w:val="28"/>
+                <w:szCs w:val="28"/>
+                <w:lang w:bidi="ta-IN"/>
+              </w:rPr>
+              <w:t xml:space="preserve"> - </w:t>
+            </w:r>
+            <w:r>
+              <w:rPr>
+                <w:rFonts w:ascii="Latha" w:hAnsi="Latha" w:cs="Latha"/>
+                <w:sz w:val="28"/>
+                <w:szCs w:val="28"/>
+                <w:cs/>
+                <w:lang w:bidi="ta-IN"/>
+              </w:rPr>
+              <w:t>ப</w:t>
+            </w:r>
+            <w:r>
+              <w:rPr>
+                <w:rFonts w:ascii="BRH Tamil Tab Extra" w:hAnsi="BRH Tamil Tab Extra" w:cs="Latha"/>
+                <w:b/>
+                <w:sz w:val="32"/>
+                <w:szCs w:val="28"/>
+                <w:lang w:bidi="ta-IN"/>
+              </w:rPr>
+              <w:t>…</w:t>
+            </w:r>
+            <w:r>
+              <w:rPr>
+                <w:rFonts w:ascii="Latha" w:hAnsi="Latha" w:cs="Latha"/>
+                <w:sz w:val="28"/>
+                <w:szCs w:val="28"/>
+                <w:highlight w:val="green"/>
+                <w:cs/>
+                <w:lang w:bidi="ta-IN"/>
+              </w:rPr>
+              <w:t>த்த்</w:t>
+            </w:r>
+            <w:r>
+              <w:rPr>
+                <w:rFonts w:ascii="Latha" w:hAnsi="Latha" w:cs="Latha"/>
+                <w:sz w:val="28"/>
+                <w:szCs w:val="28"/>
+                <w:cs/>
+                <w:lang w:bidi="ta-IN"/>
+              </w:rPr>
+              <w:t>யை</w:t>
+            </w:r>
+            <w:r>
+              <w:rPr>
+                <w:rFonts w:ascii="BRH Tamil Tab Extra" w:hAnsi="BRH Tamil Tab Extra" w:cs="Latha"/>
+                <w:b/>
+                <w:sz w:val="32"/>
+                <w:szCs w:val="28"/>
+                <w:lang w:bidi="ta-IN"/>
+              </w:rPr>
+              <w:t>…</w:t>
+            </w:r>
+            <w:r>
+              <w:rPr>
+                <w:rFonts w:ascii="Latha" w:hAnsi="Latha" w:cs="Latha"/>
+                <w:sz w:val="28"/>
+                <w:szCs w:val="28"/>
+                <w:lang w:bidi="ta-IN"/>
+              </w:rPr>
+              <w:t xml:space="preserve"> |</w:t>
+            </w:r>
+          </w:p>
+        </w:tc>
+      </w:tr>
+      <w:tr>
+        <w:trPr>
+          <w:trHeight w:val="680"/>
+        </w:trPr>
+        <w:tc>
+          <w:tcPr>
+            <w:tcW w:w="3877" w:type="dxa"/>
+          </w:tcPr>
+          <w:p>
+            <w:pPr>
+              <w:widowControl w:val="0"/>
+              <w:tabs>
+                <w:tab w:val="left" w:pos="993"/>
+              </w:tabs>
+              <w:autoSpaceDE w:val="0"/>
+              <w:autoSpaceDN w:val="0"/>
+              <w:adjustRightInd w:val="0"/>
+              <w:spacing w:before="0" w:line="252" w:lineRule="auto"/>
+              <w:ind w:right="297"/>
+              <w:rPr>
+                <w:rFonts w:cs="Arial"/>
+                <w:b/>
+                <w:sz w:val="28"/>
+                <w:szCs w:val="28"/>
+              </w:rPr>
+            </w:pPr>
+            <w:r>
+              <w:rPr>
+                <w:rFonts w:cs="Arial"/>
+                <w:b/>
+                <w:sz w:val="28"/>
+                <w:szCs w:val="28"/>
+              </w:rPr>
+              <w:t>T.S.7.4.</w:t>
+            </w:r>
+            <w:r>
+              <w:rPr>
+                <w:rFonts w:cs="Arial"/>
+                <w:b/>
+                <w:sz w:val="28"/>
+                <w:szCs w:val="28"/>
+              </w:rPr>
+              <w:t>2</w:t>
+            </w:r>
+            <w:r>
+              <w:rPr>
+                <w:rFonts w:cs="Arial"/>
+                <w:b/>
+                <w:sz w:val="28"/>
+                <w:szCs w:val="28"/>
+              </w:rPr>
+              <w:t>.</w:t>
+            </w:r>
+            <w:r>
+              <w:rPr>
+                <w:rFonts w:cs="Arial"/>
+                <w:b/>
+                <w:sz w:val="28"/>
+                <w:szCs w:val="28"/>
+              </w:rPr>
+              <w:t>5</w:t>
+            </w:r>
+            <w:r>
+              <w:rPr>
+                <w:rFonts w:cs="Arial"/>
+                <w:b/>
+                <w:sz w:val="28"/>
+                <w:szCs w:val="28"/>
+              </w:rPr>
+              <w:t xml:space="preserve"> – Kramam</w:t>
+            </w:r>
+          </w:p>
+          <w:p>
+            <w:pPr>
+              <w:widowControl w:val="0"/>
+              <w:tabs>
+                <w:tab w:val="left" w:pos="993"/>
+              </w:tabs>
+              <w:autoSpaceDE w:val="0"/>
+              <w:autoSpaceDN w:val="0"/>
+              <w:adjustRightInd w:val="0"/>
+              <w:spacing w:before="0" w:line="252" w:lineRule="auto"/>
+              <w:ind w:right="297"/>
+              <w:rPr>
+                <w:rFonts w:cs="Arial"/>
+                <w:b/>
+                <w:sz w:val="28"/>
+                <w:szCs w:val="28"/>
+              </w:rPr>
+            </w:pPr>
+            <w:r>
+              <w:rPr>
+                <w:rFonts w:cs="Arial"/>
+                <w:b/>
+                <w:sz w:val="28"/>
+                <w:szCs w:val="28"/>
+              </w:rPr>
+              <w:t xml:space="preserve">Krama Vaakyam No.– </w:t>
+            </w:r>
+            <w:r>
+              <w:rPr>
+                <w:rFonts w:cs="Arial"/>
+                <w:b/>
+                <w:sz w:val="28"/>
+                <w:szCs w:val="28"/>
+              </w:rPr>
+              <w:t>40</w:t>
+            </w:r>
+          </w:p>
+          <w:p>
+            <w:pPr>
+              <w:widowControl w:val="0"/>
+              <w:tabs>
+                <w:tab w:val="left" w:pos="993"/>
+              </w:tabs>
+              <w:autoSpaceDE w:val="0"/>
+              <w:autoSpaceDN w:val="0"/>
+              <w:adjustRightInd w:val="0"/>
+              <w:spacing w:before="0" w:line="252" w:lineRule="auto"/>
+              <w:ind w:right="297"/>
+              <w:rPr>
+                <w:rFonts w:cs="Arial"/>
+                <w:b/>
+                <w:sz w:val="28"/>
+                <w:szCs w:val="28"/>
+              </w:rPr>
+            </w:pPr>
+            <w:r>
+              <w:rPr>
+                <w:rFonts w:cs="Arial"/>
+                <w:b/>
+                <w:sz w:val="28"/>
+                <w:szCs w:val="28"/>
+              </w:rPr>
+              <w:t xml:space="preserve">Panchaati No. - </w:t>
+            </w:r>
+            <w:r>
+              <w:rPr>
+                <w:rFonts w:cs="Arial"/>
+                <w:b/>
+                <w:sz w:val="28"/>
+                <w:szCs w:val="28"/>
+              </w:rPr>
+              <w:t>17</w:t>
+            </w:r>
+          </w:p>
+        </w:tc>
+        <w:tc>
+          <w:tcPr>
+            <w:tcW w:w="4738" w:type="dxa"/>
+          </w:tcPr>
+          <w:p>
+            <w:pPr>
+              <w:widowControl w:val="0"/>
+              <w:autoSpaceDE w:val="0"/>
+              <w:autoSpaceDN w:val="0"/>
+              <w:adjustRightInd w:val="0"/>
+              <w:spacing w:before="0" w:line="264" w:lineRule="auto"/>
+              <w:rPr>
+                <w:rFonts w:ascii="Latha" w:hAnsi="Latha" w:cs="Latha"/>
+                <w:sz w:val="28"/>
+                <w:szCs w:val="28"/>
+                <w:lang w:bidi="ta-IN"/>
+              </w:rPr>
+            </w:pPr>
+            <w:r>
+              <w:rPr>
+                <w:rFonts w:ascii="Latha" w:hAnsi="Latha" w:cs="Latha"/>
+                <w:sz w:val="28"/>
+                <w:szCs w:val="28"/>
+                <w:cs/>
+                <w:lang w:bidi="ta-IN"/>
+              </w:rPr>
+              <w:t>யே</w:t>
+            </w:r>
+            <w:r>
+              <w:rPr>
+                <w:rFonts w:ascii="Latha" w:hAnsi="Latha" w:cs="Latha"/>
+                <w:sz w:val="28"/>
+                <w:szCs w:val="28"/>
+                <w:lang w:bidi="ta-IN"/>
+              </w:rPr>
+              <w:t xml:space="preserve"> </w:t>
+            </w:r>
+            <w:r>
+              <w:rPr>
+                <w:rFonts w:ascii="Latha" w:hAnsi="Latha" w:cs="Latha"/>
+                <w:sz w:val="28"/>
+                <w:szCs w:val="28"/>
+                <w:cs/>
+                <w:lang w:bidi="ta-IN"/>
+              </w:rPr>
+              <w:t>பரா</w:t>
+            </w:r>
+            <w:r>
+              <w:rPr>
+                <w:rFonts w:ascii="BRH Tamil Tab Extra" w:hAnsi="BRH Tamil Tab Extra" w:cs="Latha"/>
+                <w:b/>
+                <w:sz w:val="36"/>
+                <w:szCs w:val="28"/>
+                <w:lang w:bidi="ta-IN"/>
+              </w:rPr>
+              <w:t>†</w:t>
+            </w:r>
+            <w:r>
+              <w:rPr>
+                <w:rFonts w:ascii="Latha" w:hAnsi="Latha" w:cs="Latha"/>
+                <w:sz w:val="28"/>
+                <w:szCs w:val="28"/>
+                <w:cs/>
+                <w:lang w:bidi="ta-IN"/>
+              </w:rPr>
+              <w:t>ச</w:t>
+            </w:r>
+            <w:r>
+              <w:rPr>
+                <w:rFonts w:ascii="Latha" w:hAnsi="Latha" w:cs="Latha"/>
+                <w:b/>
+                <w:bCs/>
+                <w:sz w:val="32"/>
+                <w:szCs w:val="32"/>
+                <w:cs/>
+                <w:lang w:bidi="ta-IN"/>
+              </w:rPr>
+              <w:t>:</w:t>
+            </w:r>
+            <w:r>
+              <w:rPr>
+                <w:rFonts w:ascii="Latha" w:hAnsi="Latha" w:cs="Latha"/>
+                <w:sz w:val="28"/>
+                <w:szCs w:val="28"/>
+                <w:lang w:bidi="ta-IN"/>
+              </w:rPr>
+              <w:t xml:space="preserve"> | </w:t>
+            </w:r>
+            <w:r>
+              <w:rPr>
+                <w:rFonts w:ascii="Latha" w:hAnsi="Latha" w:cs="Latha"/>
+                <w:sz w:val="28"/>
+                <w:szCs w:val="28"/>
+                <w:lang w:bidi="ta-IN"/>
+              </w:rPr>
+              <w:br/>
+            </w:r>
+            <w:r>
+              <w:rPr>
+                <w:rFonts w:ascii="Latha" w:hAnsi="Latha" w:cs="Latha"/>
+                <w:sz w:val="28"/>
+                <w:szCs w:val="28"/>
+                <w:cs/>
+                <w:lang w:bidi="ta-IN"/>
+              </w:rPr>
+              <w:t>பரா</w:t>
+            </w:r>
+            <w:r>
+              <w:rPr>
+                <w:rFonts w:ascii="BRH Tamil Tab Extra" w:hAnsi="BRH Tamil Tab Extra" w:cs="Latha"/>
+                <w:b/>
+                <w:sz w:val="36"/>
+                <w:szCs w:val="28"/>
+                <w:lang w:bidi="ta-IN"/>
+              </w:rPr>
+              <w:t>†</w:t>
+            </w:r>
+            <w:r>
+              <w:rPr>
+                <w:rFonts w:ascii="Latha" w:hAnsi="Latha" w:cs="Latha"/>
+                <w:sz w:val="28"/>
+                <w:szCs w:val="28"/>
+                <w:highlight w:val="yellow"/>
+                <w:cs/>
+                <w:lang w:bidi="ta-IN"/>
+              </w:rPr>
+              <w:t>ச</w:t>
+            </w:r>
+            <w:r>
+              <w:rPr>
+                <w:rFonts w:ascii="Latha" w:hAnsi="Latha" w:cs="Latha"/>
+                <w:b/>
+                <w:bCs/>
+                <w:sz w:val="32"/>
+                <w:szCs w:val="32"/>
+                <w:highlight w:val="yellow"/>
+                <w:cs/>
+                <w:lang w:bidi="ta-IN"/>
+              </w:rPr>
+              <w:t>:</w:t>
+            </w:r>
+            <w:r>
+              <w:rPr>
+                <w:rFonts w:ascii="Latha" w:hAnsi="Latha" w:cs="Latha"/>
+                <w:sz w:val="28"/>
+                <w:szCs w:val="28"/>
+                <w:highlight w:val="yellow"/>
+                <w:lang w:bidi="ta-IN"/>
+              </w:rPr>
+              <w:t xml:space="preserve"> </w:t>
+            </w:r>
+            <w:r>
+              <w:rPr>
+                <w:rFonts w:ascii="Latha" w:hAnsi="Latha" w:cs="Latha"/>
+                <w:sz w:val="28"/>
+                <w:szCs w:val="28"/>
+                <w:highlight w:val="yellow"/>
+                <w:cs/>
+                <w:lang w:bidi="ta-IN"/>
+              </w:rPr>
+              <w:t>த்</w:t>
+            </w:r>
+            <w:r>
+              <w:rPr>
+                <w:rFonts w:ascii="Latha" w:hAnsi="Latha" w:cs="Latha"/>
+                <w:sz w:val="28"/>
+                <w:szCs w:val="28"/>
+                <w:cs/>
+                <w:lang w:bidi="ta-IN"/>
+              </w:rPr>
+              <w:t>ர்ய</w:t>
+            </w:r>
+            <w:r>
+              <w:rPr>
+                <w:rFonts w:ascii="BRH Tamil Tab Extra" w:hAnsi="BRH Tamil Tab Extra" w:cs="Latha"/>
+                <w:b/>
+                <w:sz w:val="32"/>
+                <w:szCs w:val="28"/>
+                <w:lang w:bidi="ta-IN"/>
+              </w:rPr>
+              <w:t>…</w:t>
+            </w:r>
+            <w:r>
+              <w:rPr>
+                <w:rFonts w:ascii="Latha" w:hAnsi="Latha" w:cs="Latha"/>
+                <w:sz w:val="28"/>
+                <w:szCs w:val="28"/>
+                <w:cs/>
+                <w:lang w:bidi="ta-IN"/>
+              </w:rPr>
+              <w:t>ஹான்</w:t>
+            </w:r>
+            <w:r>
+              <w:rPr>
+                <w:rFonts w:ascii="Latha" w:hAnsi="Latha" w:cs="Latha"/>
+                <w:sz w:val="28"/>
+                <w:szCs w:val="28"/>
+                <w:lang w:bidi="ta-IN"/>
+              </w:rPr>
+              <w:t xml:space="preserve"> |</w:t>
+            </w:r>
+          </w:p>
+          <w:p>
+            <w:pPr>
+              <w:widowControl w:val="0"/>
+              <w:autoSpaceDE w:val="0"/>
+              <w:autoSpaceDN w:val="0"/>
+              <w:adjustRightInd w:val="0"/>
+              <w:spacing w:before="0" w:line="264" w:lineRule="auto"/>
+              <w:rPr>
+                <w:rFonts w:ascii="Latha" w:hAnsi="Latha" w:cs="Latha"/>
+                <w:sz w:val="28"/>
+                <w:szCs w:val="28"/>
+                <w:cs/>
+                <w:lang w:bidi="ta-IN"/>
+              </w:rPr>
+            </w:pPr>
+          </w:p>
+        </w:tc>
+        <w:tc>
+          <w:tcPr>
+            <w:tcW w:w="5355" w:type="dxa"/>
+          </w:tcPr>
+          <w:p>
+            <w:pPr>
+              <w:widowControl w:val="0"/>
+              <w:autoSpaceDE w:val="0"/>
+              <w:autoSpaceDN w:val="0"/>
+              <w:adjustRightInd w:val="0"/>
+              <w:spacing w:before="0" w:line="264" w:lineRule="auto"/>
+              <w:rPr>
+                <w:rFonts w:ascii="Latha" w:hAnsi="Latha" w:cs="Latha"/>
+                <w:sz w:val="28"/>
+                <w:szCs w:val="28"/>
+                <w:cs/>
+                <w:lang w:bidi="ta-IN"/>
+              </w:rPr>
+            </w:pPr>
+            <w:r>
+              <w:rPr>
+                <w:rFonts w:ascii="Latha" w:hAnsi="Latha" w:cs="Latha"/>
+                <w:sz w:val="28"/>
+                <w:szCs w:val="28"/>
+                <w:cs/>
+                <w:lang w:bidi="ta-IN"/>
+              </w:rPr>
+              <w:t>யே</w:t>
+            </w:r>
+            <w:r>
+              <w:rPr>
+                <w:rFonts w:ascii="Latha" w:hAnsi="Latha" w:cs="Latha"/>
+                <w:sz w:val="28"/>
+                <w:szCs w:val="28"/>
+                <w:lang w:bidi="ta-IN"/>
+              </w:rPr>
+              <w:t xml:space="preserve"> </w:t>
+            </w:r>
+            <w:r>
+              <w:rPr>
+                <w:rFonts w:ascii="Latha" w:hAnsi="Latha" w:cs="Latha"/>
+                <w:sz w:val="28"/>
+                <w:szCs w:val="28"/>
+                <w:cs/>
+                <w:lang w:bidi="ta-IN"/>
+              </w:rPr>
+              <w:t>பரா</w:t>
+            </w:r>
+            <w:r>
+              <w:rPr>
+                <w:rFonts w:ascii="BRH Tamil Tab Extra" w:hAnsi="BRH Tamil Tab Extra" w:cs="Latha"/>
+                <w:b/>
+                <w:sz w:val="36"/>
+                <w:szCs w:val="28"/>
+                <w:lang w:bidi="ta-IN"/>
+              </w:rPr>
+              <w:t>†</w:t>
+            </w:r>
+            <w:r>
+              <w:rPr>
+                <w:rFonts w:ascii="Latha" w:hAnsi="Latha" w:cs="Latha"/>
+                <w:sz w:val="28"/>
+                <w:szCs w:val="28"/>
+                <w:cs/>
+                <w:lang w:bidi="ta-IN"/>
+              </w:rPr>
+              <w:t>ச</w:t>
+            </w:r>
+            <w:r>
+              <w:rPr>
+                <w:rFonts w:ascii="Latha" w:hAnsi="Latha" w:cs="Latha"/>
+                <w:b/>
+                <w:bCs/>
+                <w:sz w:val="32"/>
+                <w:szCs w:val="32"/>
+                <w:cs/>
+                <w:lang w:bidi="ta-IN"/>
+              </w:rPr>
+              <w:t>:</w:t>
+            </w:r>
+            <w:r>
+              <w:rPr>
+                <w:rFonts w:ascii="Latha" w:hAnsi="Latha" w:cs="Latha"/>
+                <w:sz w:val="28"/>
+                <w:szCs w:val="28"/>
+                <w:lang w:bidi="ta-IN"/>
+              </w:rPr>
+              <w:t xml:space="preserve"> | </w:t>
+            </w:r>
+            <w:r>
+              <w:rPr>
+                <w:rFonts w:ascii="Latha" w:hAnsi="Latha" w:cs="Latha"/>
+                <w:sz w:val="28"/>
+                <w:szCs w:val="28"/>
+                <w:cs/>
+                <w:lang w:bidi="ta-IN"/>
+              </w:rPr>
+              <w:t>பரா</w:t>
+            </w:r>
+            <w:r>
+              <w:rPr>
+                <w:rFonts w:ascii="BRH Tamil Tab Extra" w:hAnsi="BRH Tamil Tab Extra" w:cs="Latha"/>
+                <w:b/>
+                <w:sz w:val="36"/>
+                <w:szCs w:val="28"/>
+                <w:lang w:bidi="ta-IN"/>
+              </w:rPr>
+              <w:t>†</w:t>
+            </w:r>
+            <w:r>
+              <w:rPr>
+                <w:rFonts w:ascii="Latha" w:hAnsi="Latha" w:cs="Latha"/>
+                <w:sz w:val="28"/>
+                <w:szCs w:val="28"/>
+                <w:highlight w:val="green"/>
+                <w:cs/>
+                <w:lang w:bidi="ta-IN"/>
+              </w:rPr>
+              <w:t>சஸ்த்</w:t>
+            </w:r>
+            <w:r>
+              <w:rPr>
+                <w:rFonts w:ascii="Latha" w:hAnsi="Latha" w:cs="Latha"/>
+                <w:sz w:val="28"/>
+                <w:szCs w:val="28"/>
+                <w:cs/>
+                <w:lang w:bidi="ta-IN"/>
+              </w:rPr>
+              <w:t>ர்ய</w:t>
+            </w:r>
+            <w:r>
+              <w:rPr>
+                <w:rFonts w:ascii="BRH Tamil Tab Extra" w:hAnsi="BRH Tamil Tab Extra" w:cs="Latha"/>
+                <w:b/>
+                <w:sz w:val="32"/>
+                <w:szCs w:val="28"/>
+                <w:lang w:bidi="ta-IN"/>
+              </w:rPr>
+              <w:t>…</w:t>
+            </w:r>
+            <w:r>
+              <w:rPr>
+                <w:rFonts w:ascii="Latha" w:hAnsi="Latha" w:cs="Latha"/>
+                <w:sz w:val="28"/>
+                <w:szCs w:val="28"/>
+                <w:cs/>
+                <w:lang w:bidi="ta-IN"/>
+              </w:rPr>
+              <w:t>ஹான்</w:t>
+            </w:r>
+            <w:r>
+              <w:rPr>
+                <w:rFonts w:ascii="Latha" w:hAnsi="Latha" w:cs="Latha"/>
+                <w:sz w:val="28"/>
+                <w:szCs w:val="28"/>
+                <w:lang w:bidi="ta-IN"/>
+              </w:rPr>
+              <w:t xml:space="preserve"> |</w:t>
+            </w:r>
+          </w:p>
+        </w:tc>
+      </w:tr>
+      <w:tr>
+        <w:trPr>
+          <w:trHeight w:val="680"/>
+        </w:trPr>
+        <w:tc>
+          <w:tcPr>
+            <w:tcW w:w="3877" w:type="dxa"/>
+          </w:tcPr>
+          <w:p>
+            <w:pPr>
+              <w:widowControl w:val="0"/>
+              <w:tabs>
+                <w:tab w:val="left" w:pos="993"/>
+              </w:tabs>
+              <w:autoSpaceDE w:val="0"/>
+              <w:autoSpaceDN w:val="0"/>
+              <w:adjustRightInd w:val="0"/>
+              <w:spacing w:before="0" w:line="252" w:lineRule="auto"/>
+              <w:ind w:right="297"/>
+              <w:rPr>
+                <w:rFonts w:cs="Arial"/>
+                <w:b/>
+                <w:sz w:val="28"/>
+                <w:szCs w:val="28"/>
+              </w:rPr>
+            </w:pPr>
+            <w:r>
+              <w:rPr>
+                <w:rFonts w:cs="Arial"/>
+                <w:b/>
+                <w:sz w:val="28"/>
+                <w:szCs w:val="28"/>
+              </w:rPr>
+              <w:lastRenderedPageBreak/>
+              <w:t>T.S.7.4.</w:t>
+            </w:r>
+            <w:r>
+              <w:rPr>
+                <w:rFonts w:cs="Arial"/>
+                <w:b/>
+                <w:sz w:val="28"/>
+                <w:szCs w:val="28"/>
+              </w:rPr>
+              <w:t>2</w:t>
+            </w:r>
+            <w:r>
+              <w:rPr>
+                <w:rFonts w:cs="Arial"/>
+                <w:b/>
+                <w:sz w:val="28"/>
+                <w:szCs w:val="28"/>
+              </w:rPr>
+              <w:t>.</w:t>
+            </w:r>
+            <w:r>
+              <w:rPr>
+                <w:rFonts w:cs="Arial"/>
+                <w:b/>
+                <w:sz w:val="28"/>
+                <w:szCs w:val="28"/>
+              </w:rPr>
+              <w:t>5</w:t>
+            </w:r>
+            <w:r>
+              <w:rPr>
+                <w:rFonts w:cs="Arial"/>
+                <w:b/>
+                <w:sz w:val="28"/>
+                <w:szCs w:val="28"/>
+              </w:rPr>
+              <w:t xml:space="preserve"> – Kramam</w:t>
+            </w:r>
+          </w:p>
+          <w:p>
+            <w:pPr>
+              <w:widowControl w:val="0"/>
+              <w:tabs>
+                <w:tab w:val="left" w:pos="993"/>
+              </w:tabs>
+              <w:autoSpaceDE w:val="0"/>
+              <w:autoSpaceDN w:val="0"/>
+              <w:adjustRightInd w:val="0"/>
+              <w:spacing w:before="0" w:line="252" w:lineRule="auto"/>
+              <w:ind w:right="297"/>
+              <w:rPr>
+                <w:rFonts w:cs="Arial"/>
+                <w:b/>
+                <w:sz w:val="28"/>
+                <w:szCs w:val="28"/>
+              </w:rPr>
+            </w:pPr>
+            <w:r>
+              <w:rPr>
+                <w:rFonts w:cs="Arial"/>
+                <w:b/>
+                <w:sz w:val="28"/>
+                <w:szCs w:val="28"/>
+              </w:rPr>
+              <w:t xml:space="preserve">Krama Vaakyam No.– </w:t>
+            </w:r>
+            <w:r>
+              <w:rPr>
+                <w:rFonts w:cs="Arial"/>
+                <w:b/>
+                <w:sz w:val="28"/>
+                <w:szCs w:val="28"/>
+              </w:rPr>
+              <w:t>73</w:t>
+            </w:r>
+          </w:p>
+          <w:p>
+            <w:pPr>
+              <w:widowControl w:val="0"/>
+              <w:tabs>
+                <w:tab w:val="left" w:pos="993"/>
+              </w:tabs>
+              <w:autoSpaceDE w:val="0"/>
+              <w:autoSpaceDN w:val="0"/>
+              <w:adjustRightInd w:val="0"/>
+              <w:spacing w:before="0" w:line="252" w:lineRule="auto"/>
+              <w:ind w:right="297"/>
+              <w:rPr>
+                <w:rFonts w:cs="Arial"/>
+                <w:b/>
+                <w:sz w:val="28"/>
+                <w:szCs w:val="28"/>
+              </w:rPr>
+            </w:pPr>
+            <w:r>
+              <w:rPr>
+                <w:rFonts w:cs="Arial"/>
+                <w:b/>
+                <w:sz w:val="28"/>
+                <w:szCs w:val="28"/>
+              </w:rPr>
+              <w:t xml:space="preserve">Panchaati No. - </w:t>
+            </w:r>
+            <w:r>
+              <w:rPr>
+                <w:rFonts w:cs="Arial"/>
+                <w:b/>
+                <w:sz w:val="28"/>
+                <w:szCs w:val="28"/>
+              </w:rPr>
+              <w:t>17</w:t>
+            </w:r>
+          </w:p>
+        </w:tc>
+        <w:tc>
+          <w:tcPr>
+            <w:tcW w:w="4738" w:type="dxa"/>
+          </w:tcPr>
+          <w:p>
+            <w:pPr>
+              <w:widowControl w:val="0"/>
+              <w:autoSpaceDE w:val="0"/>
+              <w:autoSpaceDN w:val="0"/>
+              <w:adjustRightInd w:val="0"/>
+              <w:spacing w:before="0" w:line="264" w:lineRule="auto"/>
+              <w:rPr>
+                <w:rFonts w:ascii="Latha" w:hAnsi="Latha" w:cs="Latha"/>
+                <w:sz w:val="28"/>
+                <w:szCs w:val="28"/>
+                <w:cs/>
+                <w:lang w:bidi="ta-IN"/>
+              </w:rPr>
+            </w:pPr>
+            <w:r>
+              <w:rPr>
+                <w:rFonts w:ascii="Latha" w:hAnsi="Latha" w:cs="Latha"/>
+                <w:sz w:val="28"/>
+                <w:szCs w:val="28"/>
+                <w:cs/>
+                <w:lang w:bidi="ta-IN"/>
+              </w:rPr>
+              <w:t>ஏ</w:t>
+            </w:r>
+            <w:r>
+              <w:rPr>
+                <w:rFonts w:ascii="BRH Tamil Tab Extra" w:hAnsi="BRH Tamil Tab Extra" w:cs="Latha"/>
+                <w:b/>
+                <w:sz w:val="32"/>
+                <w:szCs w:val="28"/>
+                <w:lang w:bidi="ta-IN"/>
+              </w:rPr>
+              <w:t>…</w:t>
+            </w:r>
+            <w:r>
+              <w:rPr>
+                <w:rFonts w:ascii="Latha" w:hAnsi="Latha" w:cs="Latha"/>
+                <w:sz w:val="28"/>
+                <w:szCs w:val="28"/>
+                <w:cs/>
+                <w:lang w:bidi="ta-IN"/>
+              </w:rPr>
+              <w:t>வா</w:t>
+            </w:r>
+            <w:r>
+              <w:rPr>
+                <w:rFonts w:ascii="BRH Devanagari Extra" w:hAnsi="BRH Devanagari Extra" w:cs="Latha"/>
+                <w:b/>
+                <w:sz w:val="36"/>
+                <w:szCs w:val="28"/>
+                <w:highlight w:val="yellow"/>
+                <w:lang w:bidi="ta-IN"/>
+              </w:rPr>
+              <w:t>Å</w:t>
+            </w:r>
+            <w:r>
+              <w:rPr>
+                <w:rFonts w:ascii="Latha" w:hAnsi="Latha" w:cs="Latha"/>
+                <w:sz w:val="28"/>
+                <w:szCs w:val="28"/>
+                <w:cs/>
+                <w:lang w:bidi="ta-IN"/>
+              </w:rPr>
+              <w:t>ன்னாத்</w:t>
+            </w:r>
+            <w:r>
+              <w:rPr>
+                <w:rFonts w:ascii="Latha" w:hAnsi="Latha" w:cs="Latha"/>
+                <w:b/>
+                <w:bCs/>
+                <w:position w:val="-12"/>
+                <w:sz w:val="28"/>
+                <w:szCs w:val="28"/>
+                <w:cs/>
+                <w:lang w:bidi="ta-IN"/>
+              </w:rPr>
+              <w:t>3</w:t>
+            </w:r>
+            <w:r>
+              <w:rPr>
+                <w:rFonts w:ascii="Latha" w:hAnsi="Latha" w:cs="Latha"/>
+                <w:sz w:val="28"/>
+                <w:szCs w:val="28"/>
+                <w:cs/>
+                <w:lang w:bidi="ta-IN"/>
+              </w:rPr>
+              <w:t>ய</w:t>
+            </w:r>
+            <w:r>
+              <w:rPr>
+                <w:rFonts w:ascii="BRH Tamil Tab Extra" w:hAnsi="BRH Tamil Tab Extra" w:cs="Latha"/>
+                <w:b/>
+                <w:sz w:val="36"/>
+                <w:szCs w:val="28"/>
+                <w:lang w:bidi="ta-IN"/>
+              </w:rPr>
+              <w:t>‡</w:t>
+            </w:r>
+            <w:r>
+              <w:rPr>
+                <w:rFonts w:ascii="Latha" w:hAnsi="Latha" w:cs="Latha"/>
+                <w:sz w:val="28"/>
+                <w:szCs w:val="28"/>
+                <w:cs/>
+                <w:lang w:bidi="ta-IN"/>
+              </w:rPr>
+              <w:t>ம்</w:t>
+            </w:r>
+            <w:r>
+              <w:rPr>
+                <w:rFonts w:ascii="Latha" w:hAnsi="Latha" w:cs="Latha"/>
+                <w:sz w:val="28"/>
+                <w:szCs w:val="28"/>
+                <w:lang w:bidi="ta-IN"/>
+              </w:rPr>
+              <w:t xml:space="preserve"> | </w:t>
+            </w:r>
+            <w:r>
+              <w:rPr>
+                <w:rFonts w:ascii="Latha" w:hAnsi="Latha" w:cs="Latha"/>
+                <w:sz w:val="28"/>
+                <w:szCs w:val="28"/>
+                <w:cs/>
+                <w:lang w:bidi="ta-IN"/>
+              </w:rPr>
+              <w:t>அ</w:t>
+            </w:r>
+            <w:r>
+              <w:rPr>
+                <w:rFonts w:ascii="BRH Tamil Tab Extra" w:hAnsi="BRH Tamil Tab Extra" w:cs="Latha"/>
+                <w:b/>
+                <w:sz w:val="32"/>
+                <w:szCs w:val="28"/>
+                <w:lang w:bidi="ta-IN"/>
+              </w:rPr>
+              <w:t>…</w:t>
+            </w:r>
+            <w:r>
+              <w:rPr>
+                <w:rFonts w:ascii="Latha" w:hAnsi="Latha" w:cs="Latha"/>
+                <w:sz w:val="28"/>
+                <w:szCs w:val="28"/>
+                <w:cs/>
+                <w:lang w:bidi="ta-IN"/>
+              </w:rPr>
+              <w:t>ன்னாத்</w:t>
+            </w:r>
+            <w:r>
+              <w:rPr>
+                <w:rFonts w:ascii="Latha" w:hAnsi="Latha" w:cs="Latha"/>
+                <w:b/>
+                <w:bCs/>
+                <w:position w:val="-12"/>
+                <w:sz w:val="28"/>
+                <w:szCs w:val="28"/>
+                <w:cs/>
+                <w:lang w:bidi="ta-IN"/>
+              </w:rPr>
+              <w:t>3</w:t>
+            </w:r>
+            <w:r>
+              <w:rPr>
+                <w:rFonts w:ascii="Latha" w:hAnsi="Latha" w:cs="Latha"/>
+                <w:sz w:val="28"/>
+                <w:szCs w:val="28"/>
+                <w:cs/>
+                <w:lang w:bidi="ta-IN"/>
+              </w:rPr>
+              <w:t>ய</w:t>
+            </w:r>
+            <w:r>
+              <w:rPr>
+                <w:rFonts w:ascii="BRH Tamil Tab Extra" w:hAnsi="BRH Tamil Tab Extra" w:cs="Latha"/>
+                <w:b/>
+                <w:sz w:val="32"/>
+                <w:szCs w:val="28"/>
+                <w:lang w:bidi="ta-IN"/>
+              </w:rPr>
+              <w:t>…</w:t>
+            </w:r>
+            <w:r>
+              <w:rPr>
+                <w:rFonts w:ascii="Latha" w:hAnsi="Latha" w:cs="Latha"/>
+                <w:sz w:val="28"/>
+                <w:szCs w:val="28"/>
+                <w:cs/>
+                <w:lang w:bidi="ta-IN"/>
+              </w:rPr>
+              <w:t>மவ</w:t>
+            </w:r>
+            <w:r>
+              <w:rPr>
+                <w:rFonts w:ascii="BRH Tamil Tab Extra" w:hAnsi="BRH Tamil Tab Extra" w:cs="Latha"/>
+                <w:b/>
+                <w:sz w:val="36"/>
+                <w:szCs w:val="28"/>
+                <w:lang w:bidi="ta-IN"/>
+              </w:rPr>
+              <w:t>†</w:t>
+            </w:r>
+            <w:r>
+              <w:rPr>
+                <w:rFonts w:ascii="Latha" w:hAnsi="Latha" w:cs="Latha"/>
+                <w:sz w:val="28"/>
+                <w:szCs w:val="28"/>
+                <w:lang w:bidi="ta-IN"/>
+              </w:rPr>
+              <w:t xml:space="preserve"> |</w:t>
+            </w:r>
+          </w:p>
+        </w:tc>
+        <w:tc>
+          <w:tcPr>
+            <w:tcW w:w="5355" w:type="dxa"/>
+          </w:tcPr>
+          <w:p>
+            <w:pPr>
+              <w:widowControl w:val="0"/>
+              <w:autoSpaceDE w:val="0"/>
+              <w:autoSpaceDN w:val="0"/>
+              <w:adjustRightInd w:val="0"/>
+              <w:spacing w:before="0" w:line="264" w:lineRule="auto"/>
+              <w:rPr>
+                <w:rFonts w:ascii="Latha" w:hAnsi="Latha" w:cs="Latha"/>
+                <w:sz w:val="28"/>
+                <w:szCs w:val="28"/>
+                <w:cs/>
+                <w:lang w:bidi="ta-IN"/>
+              </w:rPr>
+            </w:pPr>
+            <w:r>
+              <w:rPr>
+                <w:rFonts w:ascii="Latha" w:hAnsi="Latha" w:cs="Latha"/>
+                <w:sz w:val="28"/>
+                <w:szCs w:val="28"/>
+                <w:cs/>
+                <w:lang w:bidi="ta-IN"/>
+              </w:rPr>
+              <w:t>ஏ</w:t>
+            </w:r>
+            <w:r>
+              <w:rPr>
+                <w:rFonts w:ascii="BRH Tamil Tab Extra" w:hAnsi="BRH Tamil Tab Extra" w:cs="Latha"/>
+                <w:b/>
+                <w:sz w:val="32"/>
+                <w:szCs w:val="28"/>
+                <w:lang w:bidi="ta-IN"/>
+              </w:rPr>
+              <w:t>…</w:t>
+            </w:r>
+            <w:r>
+              <w:rPr>
+                <w:rFonts w:ascii="Latha" w:hAnsi="Latha" w:cs="Latha"/>
+                <w:sz w:val="28"/>
+                <w:szCs w:val="28"/>
+                <w:highlight w:val="green"/>
+                <w:cs/>
+                <w:lang w:bidi="ta-IN"/>
+              </w:rPr>
+              <w:t>வான்</w:t>
+            </w:r>
+            <w:r>
+              <w:rPr>
+                <w:rFonts w:ascii="Latha" w:hAnsi="Latha" w:cs="Latha"/>
+                <w:sz w:val="28"/>
+                <w:szCs w:val="28"/>
+                <w:cs/>
+                <w:lang w:bidi="ta-IN"/>
+              </w:rPr>
+              <w:t>னாத்</w:t>
+            </w:r>
+            <w:r>
+              <w:rPr>
+                <w:rFonts w:ascii="Latha" w:hAnsi="Latha" w:cs="Latha"/>
+                <w:b/>
+                <w:bCs/>
+                <w:position w:val="-12"/>
+                <w:sz w:val="28"/>
+                <w:szCs w:val="28"/>
+                <w:cs/>
+                <w:lang w:bidi="ta-IN"/>
+              </w:rPr>
+              <w:t>3</w:t>
+            </w:r>
+            <w:r>
+              <w:rPr>
+                <w:rFonts w:ascii="Latha" w:hAnsi="Latha" w:cs="Latha"/>
+                <w:sz w:val="28"/>
+                <w:szCs w:val="28"/>
+                <w:cs/>
+                <w:lang w:bidi="ta-IN"/>
+              </w:rPr>
+              <w:t>ய</w:t>
+            </w:r>
+            <w:r>
+              <w:rPr>
+                <w:rFonts w:ascii="BRH Tamil Tab Extra" w:hAnsi="BRH Tamil Tab Extra" w:cs="Latha"/>
+                <w:b/>
+                <w:sz w:val="36"/>
+                <w:szCs w:val="28"/>
+                <w:lang w:bidi="ta-IN"/>
+              </w:rPr>
+              <w:t>‡</w:t>
+            </w:r>
+            <w:r>
+              <w:rPr>
+                <w:rFonts w:ascii="Latha" w:hAnsi="Latha" w:cs="Latha"/>
+                <w:sz w:val="28"/>
+                <w:szCs w:val="28"/>
+                <w:cs/>
+                <w:lang w:bidi="ta-IN"/>
+              </w:rPr>
+              <w:t>ம்</w:t>
+            </w:r>
+            <w:r>
+              <w:rPr>
+                <w:rFonts w:ascii="Latha" w:hAnsi="Latha" w:cs="Latha"/>
+                <w:sz w:val="28"/>
+                <w:szCs w:val="28"/>
+                <w:lang w:bidi="ta-IN"/>
+              </w:rPr>
+              <w:t xml:space="preserve"> | </w:t>
+            </w:r>
+            <w:r>
+              <w:rPr>
+                <w:rFonts w:ascii="Latha" w:hAnsi="Latha" w:cs="Latha"/>
+                <w:sz w:val="28"/>
+                <w:szCs w:val="28"/>
+                <w:cs/>
+                <w:lang w:bidi="ta-IN"/>
+              </w:rPr>
+              <w:t>அ</w:t>
+            </w:r>
+            <w:r>
+              <w:rPr>
+                <w:rFonts w:ascii="BRH Tamil Tab Extra" w:hAnsi="BRH Tamil Tab Extra" w:cs="Latha"/>
+                <w:b/>
+                <w:sz w:val="32"/>
+                <w:szCs w:val="28"/>
+                <w:lang w:bidi="ta-IN"/>
+              </w:rPr>
+              <w:t>…</w:t>
+            </w:r>
+            <w:r>
+              <w:rPr>
+                <w:rFonts w:ascii="Latha" w:hAnsi="Latha" w:cs="Latha"/>
+                <w:sz w:val="28"/>
+                <w:szCs w:val="28"/>
+                <w:cs/>
+                <w:lang w:bidi="ta-IN"/>
+              </w:rPr>
+              <w:t>ன்னாத்</w:t>
+            </w:r>
+            <w:r>
+              <w:rPr>
+                <w:rFonts w:ascii="Latha" w:hAnsi="Latha" w:cs="Latha"/>
+                <w:b/>
+                <w:bCs/>
+                <w:position w:val="-12"/>
+                <w:sz w:val="28"/>
+                <w:szCs w:val="28"/>
+                <w:cs/>
+                <w:lang w:bidi="ta-IN"/>
+              </w:rPr>
+              <w:t>3</w:t>
+            </w:r>
+            <w:r>
+              <w:rPr>
+                <w:rFonts w:ascii="Latha" w:hAnsi="Latha" w:cs="Latha"/>
+                <w:sz w:val="28"/>
+                <w:szCs w:val="28"/>
+                <w:cs/>
+                <w:lang w:bidi="ta-IN"/>
+              </w:rPr>
+              <w:t>ய</w:t>
+            </w:r>
+            <w:r>
+              <w:rPr>
+                <w:rFonts w:ascii="BRH Tamil Tab Extra" w:hAnsi="BRH Tamil Tab Extra" w:cs="Latha"/>
+                <w:b/>
+                <w:sz w:val="32"/>
+                <w:szCs w:val="28"/>
+                <w:lang w:bidi="ta-IN"/>
+              </w:rPr>
+              <w:t>…</w:t>
+            </w:r>
+            <w:r>
+              <w:rPr>
+                <w:rFonts w:ascii="Latha" w:hAnsi="Latha" w:cs="Latha"/>
+                <w:sz w:val="28"/>
+                <w:szCs w:val="28"/>
+                <w:cs/>
+                <w:lang w:bidi="ta-IN"/>
+              </w:rPr>
+              <w:t>மவ</w:t>
+            </w:r>
+            <w:r>
+              <w:rPr>
+                <w:rFonts w:ascii="BRH Tamil Tab Extra" w:hAnsi="BRH Tamil Tab Extra" w:cs="Latha"/>
+                <w:b/>
+                <w:sz w:val="36"/>
+                <w:szCs w:val="28"/>
+                <w:lang w:bidi="ta-IN"/>
+              </w:rPr>
+              <w:t>†</w:t>
+            </w:r>
+            <w:r>
+              <w:rPr>
+                <w:rFonts w:ascii="Latha" w:hAnsi="Latha" w:cs="Latha"/>
+                <w:sz w:val="28"/>
+                <w:szCs w:val="28"/>
+                <w:lang w:bidi="ta-IN"/>
+              </w:rPr>
+              <w:t xml:space="preserve"> |</w:t>
+            </w:r>
+          </w:p>
+        </w:tc>
+      </w:tr>
+      <w:tr>
+        <w:trPr>
+          <w:trHeight w:val="680"/>
+        </w:trPr>
+        <w:tc>
+          <w:tcPr>
+            <w:tcW w:w="3877" w:type="dxa"/>
+          </w:tcPr>
+          <w:p>
+            <w:pPr>
+              <w:widowControl w:val="0"/>
+              <w:tabs>
+                <w:tab w:val="left" w:pos="993"/>
+              </w:tabs>
+              <w:autoSpaceDE w:val="0"/>
+              <w:autoSpaceDN w:val="0"/>
+              <w:adjustRightInd w:val="0"/>
+              <w:spacing w:before="0" w:line="252" w:lineRule="auto"/>
+              <w:ind w:right="297"/>
+              <w:rPr>
+                <w:rFonts w:cs="Arial"/>
+                <w:b/>
+                <w:sz w:val="28"/>
+                <w:szCs w:val="28"/>
+              </w:rPr>
+            </w:pPr>
+            <w:r>
+              <w:rPr>
+                <w:rFonts w:cs="Arial"/>
+                <w:b/>
+                <w:sz w:val="28"/>
+                <w:szCs w:val="28"/>
+              </w:rPr>
+              <w:t>T.S.7.4.</w:t>
+            </w:r>
+            <w:r>
+              <w:rPr>
+                <w:rFonts w:cs="Arial"/>
+                <w:b/>
+                <w:sz w:val="28"/>
+                <w:szCs w:val="28"/>
+              </w:rPr>
+              <w:t>6</w:t>
+            </w:r>
+            <w:r>
+              <w:rPr>
+                <w:rFonts w:cs="Arial"/>
+                <w:b/>
+                <w:sz w:val="28"/>
+                <w:szCs w:val="28"/>
+              </w:rPr>
+              <w:t>.</w:t>
+            </w:r>
+            <w:r>
+              <w:rPr>
+                <w:rFonts w:cs="Arial"/>
+                <w:b/>
+                <w:sz w:val="28"/>
+                <w:szCs w:val="28"/>
+              </w:rPr>
+              <w:t>2</w:t>
+            </w:r>
+            <w:r>
+              <w:rPr>
+                <w:rFonts w:cs="Arial"/>
+                <w:b/>
+                <w:sz w:val="28"/>
+                <w:szCs w:val="28"/>
+              </w:rPr>
+              <w:t xml:space="preserve"> – Kramam</w:t>
+            </w:r>
+          </w:p>
+          <w:p>
+            <w:pPr>
+              <w:widowControl w:val="0"/>
+              <w:tabs>
+                <w:tab w:val="left" w:pos="993"/>
+              </w:tabs>
+              <w:autoSpaceDE w:val="0"/>
+              <w:autoSpaceDN w:val="0"/>
+              <w:adjustRightInd w:val="0"/>
+              <w:spacing w:before="0" w:line="252" w:lineRule="auto"/>
+              <w:ind w:right="297"/>
+              <w:rPr>
+                <w:rFonts w:cs="Arial"/>
+                <w:b/>
+                <w:sz w:val="28"/>
+                <w:szCs w:val="28"/>
+              </w:rPr>
+            </w:pPr>
+            <w:r>
+              <w:rPr>
+                <w:rFonts w:cs="Arial"/>
+                <w:b/>
+                <w:sz w:val="28"/>
+                <w:szCs w:val="28"/>
+              </w:rPr>
+              <w:t xml:space="preserve">Krama Vaakyam No.– </w:t>
+            </w:r>
+            <w:r>
+              <w:rPr>
+                <w:rFonts w:cs="Arial"/>
+                <w:b/>
+                <w:sz w:val="28"/>
+                <w:szCs w:val="28"/>
+              </w:rPr>
+              <w:t>42,43</w:t>
+            </w:r>
+          </w:p>
+          <w:p>
+            <w:pPr>
+              <w:widowControl w:val="0"/>
+              <w:tabs>
+                <w:tab w:val="left" w:pos="993"/>
+              </w:tabs>
+              <w:autoSpaceDE w:val="0"/>
+              <w:autoSpaceDN w:val="0"/>
+              <w:adjustRightInd w:val="0"/>
+              <w:spacing w:before="0" w:line="252" w:lineRule="auto"/>
+              <w:ind w:right="297"/>
+              <w:rPr>
+                <w:rFonts w:cs="Arial"/>
+                <w:b/>
+                <w:sz w:val="28"/>
+                <w:szCs w:val="28"/>
+              </w:rPr>
+            </w:pPr>
+            <w:r>
+              <w:rPr>
+                <w:rFonts w:cs="Arial"/>
+                <w:b/>
+                <w:sz w:val="28"/>
+                <w:szCs w:val="28"/>
+              </w:rPr>
+              <w:t xml:space="preserve">Panchaati No. - </w:t>
+            </w:r>
+            <w:r>
+              <w:rPr>
+                <w:rFonts w:cs="Arial"/>
+                <w:b/>
+                <w:sz w:val="28"/>
+                <w:szCs w:val="28"/>
+              </w:rPr>
+              <w:t>23</w:t>
+            </w:r>
+          </w:p>
+        </w:tc>
+        <w:tc>
+          <w:tcPr>
+            <w:tcW w:w="4738" w:type="dxa"/>
+          </w:tcPr>
+          <w:p>
+            <w:pPr>
+              <w:widowControl w:val="0"/>
+              <w:autoSpaceDE w:val="0"/>
+              <w:autoSpaceDN w:val="0"/>
+              <w:adjustRightInd w:val="0"/>
+              <w:spacing w:before="0" w:line="264" w:lineRule="auto"/>
+              <w:rPr>
+                <w:rFonts w:ascii="Latha" w:hAnsi="Latha" w:cs="Latha"/>
+                <w:sz w:val="28"/>
+                <w:szCs w:val="28"/>
+                <w:cs/>
+                <w:lang w:bidi="ta-IN"/>
+              </w:rPr>
+            </w:pPr>
+            <w:r>
+              <w:rPr>
+                <w:rFonts w:ascii="Latha" w:hAnsi="Latha" w:cs="Latha"/>
+                <w:sz w:val="28"/>
+                <w:szCs w:val="28"/>
+                <w:cs/>
+                <w:lang w:bidi="ta-IN"/>
+              </w:rPr>
+              <w:t>ஏ</w:t>
+            </w:r>
+            <w:r>
+              <w:rPr>
+                <w:rFonts w:ascii="BRH Tamil Tab Extra" w:hAnsi="BRH Tamil Tab Extra" w:cs="Latha"/>
+                <w:b/>
+                <w:sz w:val="32"/>
+                <w:szCs w:val="28"/>
+                <w:lang w:bidi="ta-IN"/>
+              </w:rPr>
+              <w:t>…</w:t>
+            </w:r>
+            <w:r>
+              <w:rPr>
+                <w:rFonts w:ascii="Latha" w:hAnsi="Latha" w:cs="Latha"/>
+                <w:sz w:val="28"/>
+                <w:szCs w:val="28"/>
+                <w:cs/>
+                <w:lang w:bidi="ta-IN"/>
+              </w:rPr>
+              <w:t>வ</w:t>
+            </w:r>
+            <w:r>
+              <w:rPr>
+                <w:rFonts w:ascii="Latha" w:hAnsi="Latha" w:cs="Latha"/>
+                <w:sz w:val="28"/>
+                <w:szCs w:val="28"/>
+                <w:lang w:bidi="ta-IN"/>
+              </w:rPr>
+              <w:t xml:space="preserve"> </w:t>
+            </w:r>
+            <w:r>
+              <w:rPr>
+                <w:rFonts w:ascii="Latha" w:hAnsi="Latha" w:cs="Latha"/>
+                <w:sz w:val="28"/>
+                <w:szCs w:val="28"/>
+                <w:cs/>
+                <w:lang w:bidi="ta-IN"/>
+              </w:rPr>
+              <w:t>ப்</w:t>
+            </w:r>
+            <w:r>
+              <w:rPr>
+                <w:rFonts w:ascii="Latha" w:hAnsi="Latha" w:cs="Latha"/>
+                <w:b/>
+                <w:bCs/>
+                <w:i/>
+                <w:iCs/>
+                <w:sz w:val="28"/>
+                <w:szCs w:val="28"/>
+                <w:cs/>
+                <w:lang w:bidi="ta-IN"/>
+              </w:rPr>
+              <w:t>ரு</w:t>
+            </w:r>
+            <w:r>
+              <w:rPr>
+                <w:rFonts w:ascii="BRH Tamil Tab Extra" w:hAnsi="BRH Tamil Tab Extra" w:cs="Latha"/>
+                <w:b/>
+                <w:sz w:val="32"/>
+                <w:szCs w:val="28"/>
+                <w:lang w:bidi="ta-IN"/>
+              </w:rPr>
+              <w:t>…</w:t>
+            </w:r>
+            <w:r>
+              <w:rPr>
+                <w:rFonts w:ascii="Latha" w:hAnsi="Latha" w:cs="Latha"/>
+                <w:sz w:val="28"/>
+                <w:szCs w:val="28"/>
+                <w:cs/>
+                <w:lang w:bidi="ta-IN"/>
+              </w:rPr>
+              <w:t>ஷ்</w:t>
+            </w:r>
+            <w:r>
+              <w:rPr>
+                <w:rFonts w:ascii="Latha" w:hAnsi="Latha" w:cs="Latha"/>
+                <w:sz w:val="28"/>
+                <w:szCs w:val="28"/>
+                <w:highlight w:val="yellow"/>
+                <w:cs/>
+                <w:lang w:bidi="ta-IN"/>
+              </w:rPr>
+              <w:t>ட</w:t>
+            </w:r>
+            <w:r>
+              <w:rPr>
+                <w:rFonts w:ascii="Latha" w:hAnsi="Latha" w:cs="Latha"/>
+                <w:b/>
+                <w:bCs/>
+                <w:position w:val="-12"/>
+                <w:sz w:val="28"/>
+                <w:szCs w:val="28"/>
+                <w:highlight w:val="yellow"/>
+                <w:cs/>
+                <w:lang w:bidi="ta-IN"/>
+              </w:rPr>
+              <w:t>2</w:t>
+            </w:r>
+            <w:r>
+              <w:rPr>
+                <w:rFonts w:ascii="Latha" w:hAnsi="Latha" w:cs="Latha"/>
+                <w:sz w:val="28"/>
+                <w:szCs w:val="28"/>
+                <w:highlight w:val="yellow"/>
+                <w:cs/>
+                <w:lang w:bidi="ta-IN"/>
+              </w:rPr>
+              <w:t>இ</w:t>
+            </w:r>
+            <w:r>
+              <w:rPr>
+                <w:rFonts w:ascii="Latha" w:hAnsi="Latha" w:cs="Latha"/>
+                <w:b/>
+                <w:bCs/>
+                <w:sz w:val="32"/>
+                <w:szCs w:val="32"/>
+                <w:highlight w:val="yellow"/>
+                <w:cs/>
+                <w:lang w:bidi="ta-IN"/>
+              </w:rPr>
+              <w:t>:</w:t>
+            </w:r>
+            <w:r>
+              <w:rPr>
+                <w:rFonts w:ascii="Latha" w:hAnsi="Latha" w:cs="Latha"/>
+                <w:sz w:val="28"/>
+                <w:szCs w:val="28"/>
+                <w:lang w:bidi="ta-IN"/>
+              </w:rPr>
+              <w:t xml:space="preserve"> | </w:t>
+            </w:r>
+            <w:r>
+              <w:rPr>
+                <w:rFonts w:ascii="Latha" w:hAnsi="Latha" w:cs="Latha"/>
+                <w:sz w:val="28"/>
+                <w:szCs w:val="28"/>
+                <w:cs/>
+                <w:lang w:bidi="ta-IN"/>
+              </w:rPr>
+              <w:t>ப்</w:t>
+            </w:r>
+            <w:r>
+              <w:rPr>
+                <w:rFonts w:ascii="Latha" w:hAnsi="Latha" w:cs="Latha"/>
+                <w:b/>
+                <w:bCs/>
+                <w:i/>
+                <w:iCs/>
+                <w:sz w:val="28"/>
+                <w:szCs w:val="28"/>
+                <w:cs/>
+                <w:lang w:bidi="ta-IN"/>
+              </w:rPr>
+              <w:t>ரு</w:t>
+            </w:r>
+            <w:r>
+              <w:rPr>
+                <w:rFonts w:ascii="BRH Tamil Tab Extra" w:hAnsi="BRH Tamil Tab Extra" w:cs="Latha"/>
+                <w:b/>
+                <w:sz w:val="32"/>
+                <w:szCs w:val="28"/>
+                <w:lang w:bidi="ta-IN"/>
+              </w:rPr>
+              <w:t>…</w:t>
+            </w:r>
+            <w:r>
+              <w:rPr>
+                <w:rFonts w:ascii="Latha" w:hAnsi="Latha" w:cs="Latha"/>
+                <w:sz w:val="28"/>
+                <w:szCs w:val="28"/>
+                <w:cs/>
+                <w:lang w:bidi="ta-IN"/>
+              </w:rPr>
+              <w:t>ஷ்</w:t>
+            </w:r>
+            <w:r>
+              <w:rPr>
+                <w:rFonts w:ascii="Latha" w:hAnsi="Latha" w:cs="Latha"/>
+                <w:sz w:val="28"/>
+                <w:szCs w:val="28"/>
+                <w:highlight w:val="yellow"/>
+                <w:cs/>
+                <w:lang w:bidi="ta-IN"/>
+              </w:rPr>
+              <w:t>ட</w:t>
+            </w:r>
+            <w:r>
+              <w:rPr>
+                <w:rFonts w:ascii="Latha" w:hAnsi="Latha" w:cs="Latha"/>
+                <w:b/>
+                <w:bCs/>
+                <w:position w:val="-12"/>
+                <w:sz w:val="28"/>
+                <w:szCs w:val="28"/>
+                <w:highlight w:val="yellow"/>
+                <w:cs/>
+                <w:lang w:bidi="ta-IN"/>
+              </w:rPr>
+              <w:t>2</w:t>
+            </w:r>
+            <w:r>
+              <w:rPr>
+                <w:rFonts w:ascii="Latha" w:hAnsi="Latha" w:cs="Latha"/>
+                <w:sz w:val="28"/>
+                <w:szCs w:val="28"/>
+                <w:highlight w:val="yellow"/>
+                <w:cs/>
+                <w:lang w:bidi="ta-IN"/>
+              </w:rPr>
+              <w:t>இ</w:t>
+            </w:r>
+            <w:r>
+              <w:rPr>
+                <w:rFonts w:ascii="Latha" w:hAnsi="Latha" w:cs="Latha"/>
+                <w:sz w:val="28"/>
+                <w:szCs w:val="28"/>
+                <w:cs/>
+                <w:lang w:bidi="ta-IN"/>
+              </w:rPr>
+              <w:t>ரவ</w:t>
+            </w:r>
+            <w:r>
+              <w:rPr>
+                <w:rFonts w:ascii="BRH Tamil Tab Extra" w:hAnsi="BRH Tamil Tab Extra" w:cs="Latha"/>
+                <w:b/>
+                <w:sz w:val="36"/>
+                <w:szCs w:val="28"/>
+                <w:lang w:bidi="ta-IN"/>
+              </w:rPr>
+              <w:t>†</w:t>
+            </w:r>
+            <w:r>
+              <w:rPr>
+                <w:rFonts w:ascii="Latha" w:hAnsi="Latha" w:cs="Latha"/>
+                <w:sz w:val="28"/>
+                <w:szCs w:val="28"/>
+                <w:lang w:bidi="ta-IN"/>
+              </w:rPr>
+              <w:t xml:space="preserve"> |</w:t>
+            </w:r>
+          </w:p>
+        </w:tc>
+        <w:tc>
+          <w:tcPr>
+            <w:tcW w:w="5355" w:type="dxa"/>
+          </w:tcPr>
+          <w:p>
+            <w:pPr>
+              <w:widowControl w:val="0"/>
+              <w:autoSpaceDE w:val="0"/>
+              <w:autoSpaceDN w:val="0"/>
+              <w:adjustRightInd w:val="0"/>
+              <w:spacing w:before="0" w:line="264" w:lineRule="auto"/>
+              <w:rPr>
+                <w:rFonts w:ascii="Latha" w:hAnsi="Latha" w:cs="Latha"/>
+                <w:sz w:val="28"/>
+                <w:szCs w:val="28"/>
+                <w:cs/>
+                <w:lang w:bidi="ta-IN"/>
+              </w:rPr>
+            </w:pPr>
+            <w:r>
+              <w:rPr>
+                <w:rFonts w:ascii="Latha" w:hAnsi="Latha" w:cs="Latha"/>
+                <w:sz w:val="28"/>
+                <w:szCs w:val="28"/>
+                <w:cs/>
+                <w:lang w:bidi="ta-IN"/>
+              </w:rPr>
+              <w:t>ஏ</w:t>
+            </w:r>
+            <w:r>
+              <w:rPr>
+                <w:rFonts w:ascii="BRH Tamil Tab Extra" w:hAnsi="BRH Tamil Tab Extra" w:cs="Latha"/>
+                <w:b/>
+                <w:sz w:val="32"/>
+                <w:szCs w:val="28"/>
+                <w:lang w:bidi="ta-IN"/>
+              </w:rPr>
+              <w:t>…</w:t>
+            </w:r>
+            <w:r>
+              <w:rPr>
+                <w:rFonts w:ascii="Latha" w:hAnsi="Latha" w:cs="Latha"/>
+                <w:sz w:val="28"/>
+                <w:szCs w:val="28"/>
+                <w:cs/>
+                <w:lang w:bidi="ta-IN"/>
+              </w:rPr>
+              <w:t>வ</w:t>
+            </w:r>
+            <w:r>
+              <w:rPr>
+                <w:rFonts w:ascii="Latha" w:hAnsi="Latha" w:cs="Latha"/>
+                <w:sz w:val="28"/>
+                <w:szCs w:val="28"/>
+                <w:lang w:bidi="ta-IN"/>
+              </w:rPr>
+              <w:t xml:space="preserve"> </w:t>
+            </w:r>
+            <w:r>
+              <w:rPr>
+                <w:rFonts w:ascii="Latha" w:hAnsi="Latha" w:cs="Latha"/>
+                <w:sz w:val="28"/>
+                <w:szCs w:val="28"/>
+                <w:cs/>
+                <w:lang w:bidi="ta-IN"/>
+              </w:rPr>
+              <w:t>ப்</w:t>
+            </w:r>
+            <w:r>
+              <w:rPr>
+                <w:rFonts w:ascii="Latha" w:hAnsi="Latha" w:cs="Latha"/>
+                <w:b/>
+                <w:bCs/>
+                <w:i/>
+                <w:iCs/>
+                <w:sz w:val="28"/>
+                <w:szCs w:val="28"/>
+                <w:cs/>
+                <w:lang w:bidi="ta-IN"/>
+              </w:rPr>
+              <w:t>ரு</w:t>
+            </w:r>
+            <w:r>
+              <w:rPr>
+                <w:rFonts w:ascii="BRH Tamil Tab Extra" w:hAnsi="BRH Tamil Tab Extra" w:cs="Latha"/>
+                <w:b/>
+                <w:sz w:val="32"/>
+                <w:szCs w:val="28"/>
+                <w:lang w:bidi="ta-IN"/>
+              </w:rPr>
+              <w:t>…</w:t>
+            </w:r>
+            <w:r>
+              <w:rPr>
+                <w:rFonts w:ascii="Latha" w:hAnsi="Latha" w:cs="Latha"/>
+                <w:sz w:val="28"/>
+                <w:szCs w:val="28"/>
+                <w:cs/>
+                <w:lang w:bidi="ta-IN"/>
+              </w:rPr>
+              <w:t>ஷ்</w:t>
+            </w:r>
+            <w:r>
+              <w:rPr>
+                <w:rFonts w:ascii="Latha" w:hAnsi="Latha" w:cs="Latha" w:hint="cs"/>
+                <w:sz w:val="28"/>
+                <w:szCs w:val="28"/>
+                <w:highlight w:val="green"/>
+                <w:cs/>
+                <w:lang w:bidi="ta-IN"/>
+              </w:rPr>
+              <w:t>டை</w:t>
+            </w:r>
+            <w:r>
+              <w:rPr>
+                <w:rFonts w:ascii="Latha" w:hAnsi="Latha" w:cs="Latha"/>
+                <w:b/>
+                <w:bCs/>
+                <w:position w:val="-12"/>
+                <w:sz w:val="28"/>
+                <w:szCs w:val="28"/>
+                <w:highlight w:val="green"/>
+                <w:cs/>
+                <w:lang w:bidi="ta-IN"/>
+              </w:rPr>
+              <w:t>2</w:t>
+            </w:r>
+            <w:r>
+              <w:rPr>
+                <w:rFonts w:ascii="Latha" w:hAnsi="Latha" w:cs="Latha"/>
+                <w:b/>
+                <w:bCs/>
+                <w:sz w:val="32"/>
+                <w:szCs w:val="32"/>
+                <w:highlight w:val="green"/>
+                <w:cs/>
+                <w:lang w:bidi="ta-IN"/>
+              </w:rPr>
+              <w:t>:</w:t>
+            </w:r>
+            <w:r>
+              <w:rPr>
+                <w:rFonts w:ascii="Latha" w:hAnsi="Latha" w:cs="Latha"/>
+                <w:sz w:val="28"/>
+                <w:szCs w:val="28"/>
+                <w:lang w:bidi="ta-IN"/>
+              </w:rPr>
+              <w:t xml:space="preserve"> | </w:t>
+            </w:r>
+            <w:r>
+              <w:rPr>
+                <w:rFonts w:ascii="Latha" w:hAnsi="Latha" w:cs="Latha"/>
+                <w:sz w:val="28"/>
+                <w:szCs w:val="28"/>
+                <w:cs/>
+                <w:lang w:bidi="ta-IN"/>
+              </w:rPr>
+              <w:br/>
+            </w:r>
+            <w:r>
+              <w:rPr>
+                <w:rFonts w:ascii="Latha" w:hAnsi="Latha" w:cs="Latha"/>
+                <w:sz w:val="28"/>
+                <w:szCs w:val="28"/>
+                <w:cs/>
+                <w:lang w:bidi="ta-IN"/>
+              </w:rPr>
+              <w:t>ப்</w:t>
+            </w:r>
+            <w:r>
+              <w:rPr>
+                <w:rFonts w:ascii="Latha" w:hAnsi="Latha" w:cs="Latha"/>
+                <w:b/>
+                <w:bCs/>
+                <w:i/>
+                <w:iCs/>
+                <w:sz w:val="28"/>
+                <w:szCs w:val="28"/>
+                <w:cs/>
+                <w:lang w:bidi="ta-IN"/>
+              </w:rPr>
+              <w:t>ரு</w:t>
+            </w:r>
+            <w:r>
+              <w:rPr>
+                <w:rFonts w:ascii="BRH Tamil Tab Extra" w:hAnsi="BRH Tamil Tab Extra" w:cs="Latha"/>
+                <w:b/>
+                <w:sz w:val="32"/>
+                <w:szCs w:val="28"/>
+                <w:lang w:bidi="ta-IN"/>
+              </w:rPr>
+              <w:t>…</w:t>
+            </w:r>
+            <w:r>
+              <w:rPr>
+                <w:rFonts w:ascii="Latha" w:hAnsi="Latha" w:cs="Latha"/>
+                <w:sz w:val="28"/>
+                <w:szCs w:val="28"/>
+                <w:cs/>
+                <w:lang w:bidi="ta-IN"/>
+              </w:rPr>
+              <w:t>ஷ்</w:t>
+            </w:r>
+            <w:r>
+              <w:rPr>
+                <w:rFonts w:ascii="Latha" w:hAnsi="Latha" w:cs="Latha" w:hint="cs"/>
+                <w:sz w:val="28"/>
+                <w:szCs w:val="28"/>
+                <w:highlight w:val="green"/>
+                <w:cs/>
+                <w:lang w:bidi="ta-IN"/>
+              </w:rPr>
+              <w:t>டை</w:t>
+            </w:r>
+            <w:r>
+              <w:rPr>
+                <w:rFonts w:ascii="Latha" w:hAnsi="Latha" w:cs="Latha"/>
+                <w:b/>
+                <w:bCs/>
+                <w:position w:val="-12"/>
+                <w:sz w:val="28"/>
+                <w:szCs w:val="28"/>
+                <w:highlight w:val="green"/>
+                <w:cs/>
+                <w:lang w:bidi="ta-IN"/>
+              </w:rPr>
+              <w:t>2</w:t>
+            </w:r>
+            <w:r>
+              <w:rPr>
+                <w:rFonts w:ascii="Latha" w:hAnsi="Latha" w:cs="Latha"/>
+                <w:sz w:val="28"/>
+                <w:szCs w:val="28"/>
+                <w:highlight w:val="green"/>
+                <w:cs/>
+                <w:lang w:bidi="ta-IN"/>
+              </w:rPr>
+              <w:t>ரவ</w:t>
+            </w:r>
+            <w:r>
+              <w:rPr>
+                <w:rFonts w:ascii="BRH Tamil Tab Extra" w:hAnsi="BRH Tamil Tab Extra" w:cs="Latha"/>
+                <w:b/>
+                <w:sz w:val="36"/>
+                <w:szCs w:val="28"/>
+                <w:lang w:bidi="ta-IN"/>
+              </w:rPr>
+              <w:t>†</w:t>
+            </w:r>
+            <w:r>
+              <w:rPr>
+                <w:rFonts w:ascii="Latha" w:hAnsi="Latha" w:cs="Latha"/>
+                <w:sz w:val="28"/>
+                <w:szCs w:val="28"/>
+                <w:lang w:bidi="ta-IN"/>
+              </w:rPr>
+              <w:t xml:space="preserve"> |</w:t>
+            </w:r>
+          </w:p>
+        </w:tc>
+      </w:tr>
+      <w:tr>
+        <w:trPr>
+          <w:trHeight w:val="680"/>
+        </w:trPr>
+        <w:tc>
+          <w:tcPr>
+            <w:tcW w:w="3877" w:type="dxa"/>
+          </w:tcPr>
+          <w:p>
+            <w:pPr>
+              <w:widowControl w:val="0"/>
+              <w:tabs>
+                <w:tab w:val="left" w:pos="993"/>
+              </w:tabs>
+              <w:autoSpaceDE w:val="0"/>
+              <w:autoSpaceDN w:val="0"/>
+              <w:adjustRightInd w:val="0"/>
+              <w:spacing w:before="0" w:line="252" w:lineRule="auto"/>
+              <w:ind w:right="297"/>
+              <w:rPr>
+                <w:rFonts w:cs="Arial"/>
+                <w:b/>
+                <w:sz w:val="28"/>
+                <w:szCs w:val="28"/>
+              </w:rPr>
+            </w:pPr>
+            <w:r>
+              <w:rPr>
+                <w:rFonts w:cs="Arial"/>
+                <w:b/>
+                <w:sz w:val="28"/>
+                <w:szCs w:val="28"/>
+              </w:rPr>
+              <w:t>T.S.7.4.</w:t>
+            </w:r>
+            <w:r>
+              <w:rPr>
+                <w:rFonts w:cs="Arial"/>
+                <w:b/>
+                <w:sz w:val="28"/>
+                <w:szCs w:val="28"/>
+              </w:rPr>
+              <w:t>17</w:t>
+            </w:r>
+            <w:r>
+              <w:rPr>
+                <w:rFonts w:cs="Arial"/>
+                <w:b/>
+                <w:sz w:val="28"/>
+                <w:szCs w:val="28"/>
+              </w:rPr>
+              <w:t>.</w:t>
+            </w:r>
+            <w:r>
+              <w:rPr>
+                <w:rFonts w:cs="Arial"/>
+                <w:b/>
+                <w:sz w:val="28"/>
+                <w:szCs w:val="28"/>
+              </w:rPr>
+              <w:t>2</w:t>
+            </w:r>
+            <w:r>
+              <w:rPr>
+                <w:rFonts w:cs="Arial"/>
+                <w:b/>
+                <w:sz w:val="28"/>
+                <w:szCs w:val="28"/>
+              </w:rPr>
+              <w:t xml:space="preserve"> – Kramam</w:t>
+            </w:r>
+          </w:p>
+          <w:p>
+            <w:pPr>
+              <w:widowControl w:val="0"/>
+              <w:tabs>
+                <w:tab w:val="left" w:pos="993"/>
+              </w:tabs>
+              <w:autoSpaceDE w:val="0"/>
+              <w:autoSpaceDN w:val="0"/>
+              <w:adjustRightInd w:val="0"/>
+              <w:spacing w:before="0" w:line="252" w:lineRule="auto"/>
+              <w:ind w:right="297"/>
+              <w:rPr>
+                <w:rFonts w:cs="Arial"/>
+                <w:b/>
+                <w:sz w:val="28"/>
+                <w:szCs w:val="28"/>
+              </w:rPr>
+            </w:pPr>
+            <w:r>
+              <w:rPr>
+                <w:rFonts w:cs="Arial"/>
+                <w:b/>
+                <w:sz w:val="28"/>
+                <w:szCs w:val="28"/>
+              </w:rPr>
+              <w:t xml:space="preserve">Krama Vaakyam No.– </w:t>
+            </w:r>
+            <w:r>
+              <w:rPr>
+                <w:rFonts w:cs="Arial"/>
+                <w:b/>
+                <w:sz w:val="28"/>
+                <w:szCs w:val="28"/>
+              </w:rPr>
+              <w:t>42</w:t>
+            </w:r>
+          </w:p>
+          <w:p>
+            <w:pPr>
+              <w:widowControl w:val="0"/>
+              <w:tabs>
+                <w:tab w:val="left" w:pos="993"/>
+              </w:tabs>
+              <w:autoSpaceDE w:val="0"/>
+              <w:autoSpaceDN w:val="0"/>
+              <w:adjustRightInd w:val="0"/>
+              <w:spacing w:before="0" w:line="252" w:lineRule="auto"/>
+              <w:ind w:right="297"/>
+              <w:rPr>
+                <w:rFonts w:cs="Arial"/>
+                <w:b/>
+                <w:sz w:val="28"/>
+                <w:szCs w:val="28"/>
+              </w:rPr>
+            </w:pPr>
+            <w:r>
+              <w:rPr>
+                <w:rFonts w:cs="Arial"/>
+                <w:b/>
+                <w:sz w:val="28"/>
+                <w:szCs w:val="28"/>
+              </w:rPr>
+              <w:t xml:space="preserve">Panchaati No. - </w:t>
+            </w:r>
+            <w:r>
+              <w:rPr>
+                <w:rFonts w:cs="Arial"/>
+                <w:b/>
+                <w:sz w:val="28"/>
+                <w:szCs w:val="28"/>
+              </w:rPr>
+              <w:t>44</w:t>
+            </w:r>
+          </w:p>
+        </w:tc>
+        <w:tc>
+          <w:tcPr>
+            <w:tcW w:w="4738" w:type="dxa"/>
+          </w:tcPr>
+          <w:p>
+            <w:pPr>
+              <w:widowControl w:val="0"/>
+              <w:autoSpaceDE w:val="0"/>
+              <w:autoSpaceDN w:val="0"/>
+              <w:adjustRightInd w:val="0"/>
+              <w:spacing w:before="0" w:line="264" w:lineRule="auto"/>
+              <w:rPr>
+                <w:rFonts w:ascii="Latha" w:hAnsi="Latha" w:cs="Latha"/>
+                <w:sz w:val="28"/>
+                <w:szCs w:val="28"/>
+                <w:cs/>
+                <w:lang w:bidi="ta-IN"/>
+              </w:rPr>
+            </w:pPr>
+            <w:r>
+              <w:rPr>
+                <w:rFonts w:ascii="Latha" w:hAnsi="Latha" w:cs="Latha"/>
+                <w:sz w:val="28"/>
+                <w:szCs w:val="28"/>
+                <w:cs/>
+                <w:lang w:bidi="ta-IN"/>
+              </w:rPr>
+              <w:t>ம</w:t>
+            </w:r>
+            <w:r>
+              <w:rPr>
+                <w:rFonts w:ascii="BRH Tamil Tab Extra" w:hAnsi="BRH Tamil Tab Extra" w:cs="Latha"/>
+                <w:b/>
+                <w:sz w:val="32"/>
+                <w:szCs w:val="28"/>
+                <w:lang w:bidi="ta-IN"/>
+              </w:rPr>
+              <w:t>…</w:t>
+            </w:r>
+            <w:r>
+              <w:rPr>
+                <w:rFonts w:ascii="Latha" w:hAnsi="Latha" w:cs="Latha"/>
+                <w:sz w:val="28"/>
+                <w:szCs w:val="28"/>
+                <w:cs/>
+                <w:lang w:bidi="ta-IN"/>
+              </w:rPr>
+              <w:t>ஹீமு</w:t>
+            </w:r>
+            <w:r>
+              <w:rPr>
+                <w:rFonts w:ascii="BRH Tamil Tab Extra" w:hAnsi="BRH Tamil Tab Extra" w:cs="Latha"/>
+                <w:b/>
+                <w:sz w:val="36"/>
+                <w:szCs w:val="28"/>
+                <w:lang w:bidi="ta-IN"/>
+              </w:rPr>
+              <w:t>†</w:t>
+            </w:r>
+            <w:r>
+              <w:rPr>
+                <w:rFonts w:ascii="Latha" w:hAnsi="Latha" w:cs="Latha"/>
+                <w:sz w:val="28"/>
+                <w:szCs w:val="28"/>
+                <w:lang w:bidi="ta-IN"/>
+              </w:rPr>
+              <w:t xml:space="preserve"> | </w:t>
+            </w:r>
+            <w:r>
+              <w:rPr>
+                <w:rFonts w:ascii="Latha" w:hAnsi="Latha" w:cs="Latha"/>
+                <w:sz w:val="28"/>
+                <w:szCs w:val="28"/>
+                <w:highlight w:val="yellow"/>
+                <w:cs/>
+                <w:lang w:bidi="ta-IN"/>
+              </w:rPr>
+              <w:t>உ</w:t>
+            </w:r>
+            <w:r>
+              <w:rPr>
+                <w:rFonts w:ascii="BRH Tamil Tab Extra" w:hAnsi="BRH Tamil Tab Extra" w:cs="Latha"/>
+                <w:b/>
+                <w:sz w:val="32"/>
+                <w:szCs w:val="28"/>
+                <w:highlight w:val="yellow"/>
+                <w:lang w:bidi="ta-IN"/>
+              </w:rPr>
+              <w:t>…</w:t>
+            </w:r>
+            <w:r>
+              <w:rPr>
+                <w:rFonts w:ascii="Latha" w:hAnsi="Latha" w:cs="Latha"/>
+                <w:sz w:val="28"/>
+                <w:szCs w:val="28"/>
+                <w:highlight w:val="yellow"/>
+                <w:cs/>
+                <w:lang w:bidi="ta-IN"/>
+              </w:rPr>
+              <w:t>ஷு</w:t>
+            </w:r>
+            <w:r>
+              <w:rPr>
+                <w:rFonts w:ascii="Latha" w:hAnsi="Latha" w:cs="Latha"/>
+                <w:sz w:val="28"/>
+                <w:szCs w:val="28"/>
+                <w:lang w:bidi="ta-IN"/>
+              </w:rPr>
+              <w:t xml:space="preserve"> |</w:t>
+            </w:r>
+          </w:p>
+        </w:tc>
+        <w:tc>
+          <w:tcPr>
+            <w:tcW w:w="5355" w:type="dxa"/>
+          </w:tcPr>
+          <w:p>
+            <w:pPr>
+              <w:widowControl w:val="0"/>
+              <w:autoSpaceDE w:val="0"/>
+              <w:autoSpaceDN w:val="0"/>
+              <w:adjustRightInd w:val="0"/>
+              <w:spacing w:before="0" w:line="264" w:lineRule="auto"/>
+              <w:rPr>
+                <w:rFonts w:ascii="Latha" w:hAnsi="Latha" w:cs="Latha"/>
+                <w:sz w:val="28"/>
+                <w:szCs w:val="28"/>
+                <w:cs/>
+                <w:lang w:bidi="ta-IN"/>
+              </w:rPr>
+            </w:pPr>
+            <w:r>
+              <w:rPr>
+                <w:rFonts w:ascii="Latha" w:hAnsi="Latha" w:cs="Latha"/>
+                <w:sz w:val="28"/>
+                <w:szCs w:val="28"/>
+                <w:cs/>
+                <w:lang w:bidi="ta-IN"/>
+              </w:rPr>
+              <w:t>ம</w:t>
+            </w:r>
+            <w:r>
+              <w:rPr>
+                <w:rFonts w:ascii="BRH Tamil Tab Extra" w:hAnsi="BRH Tamil Tab Extra" w:cs="Latha"/>
+                <w:b/>
+                <w:sz w:val="32"/>
+                <w:szCs w:val="28"/>
+                <w:lang w:bidi="ta-IN"/>
+              </w:rPr>
+              <w:t>…</w:t>
+            </w:r>
+            <w:r>
+              <w:rPr>
+                <w:rFonts w:ascii="Latha" w:hAnsi="Latha" w:cs="Latha"/>
+                <w:sz w:val="28"/>
+                <w:szCs w:val="28"/>
+                <w:cs/>
+                <w:lang w:bidi="ta-IN"/>
+              </w:rPr>
+              <w:t>ஹீமு</w:t>
+            </w:r>
+            <w:r>
+              <w:rPr>
+                <w:rFonts w:ascii="BRH Tamil Tab Extra" w:hAnsi="BRH Tamil Tab Extra" w:cs="Latha"/>
+                <w:b/>
+                <w:sz w:val="36"/>
+                <w:szCs w:val="28"/>
+                <w:lang w:bidi="ta-IN"/>
+              </w:rPr>
+              <w:t>†</w:t>
+            </w:r>
+            <w:r>
+              <w:rPr>
+                <w:rFonts w:ascii="Latha" w:hAnsi="Latha" w:cs="Latha"/>
+                <w:sz w:val="28"/>
+                <w:szCs w:val="28"/>
+                <w:lang w:bidi="ta-IN"/>
+              </w:rPr>
+              <w:t xml:space="preserve"> | </w:t>
+            </w:r>
+            <w:r>
+              <w:rPr>
+                <w:rFonts w:ascii="Latha" w:hAnsi="Latha" w:cs="Latha" w:hint="cs"/>
+                <w:sz w:val="28"/>
+                <w:szCs w:val="28"/>
+                <w:highlight w:val="green"/>
+                <w:cs/>
+                <w:lang w:bidi="ta-IN"/>
+              </w:rPr>
+              <w:t>ஊ</w:t>
+            </w:r>
+            <w:r>
+              <w:rPr>
+                <w:rFonts w:ascii="BRH Tamil Tab Extra" w:hAnsi="BRH Tamil Tab Extra" w:cs="Latha"/>
+                <w:b/>
+                <w:sz w:val="32"/>
+                <w:szCs w:val="28"/>
+                <w:highlight w:val="green"/>
+                <w:lang w:bidi="ta-IN"/>
+              </w:rPr>
+              <w:t>…</w:t>
+            </w:r>
+            <w:r>
+              <w:rPr>
+                <w:rFonts w:ascii="BRH Tamil Tab Extra" w:hAnsi="BRH Tamil Tab Extra" w:cs="Latha"/>
+                <w:b/>
+                <w:sz w:val="32"/>
+                <w:szCs w:val="28"/>
+                <w:highlight w:val="green"/>
+                <w:lang w:bidi="ta-IN"/>
+              </w:rPr>
+              <w:t xml:space="preserve"> </w:t>
+            </w:r>
+            <w:r>
+              <w:rPr>
+                <w:rFonts w:ascii="Latha" w:hAnsi="Latha" w:cs="Latha"/>
+                <w:sz w:val="28"/>
+                <w:szCs w:val="28"/>
+                <w:highlight w:val="green"/>
+                <w:cs/>
+                <w:lang w:bidi="ta-IN"/>
+              </w:rPr>
+              <w:t>ஷு</w:t>
+            </w:r>
+            <w:r>
+              <w:rPr>
+                <w:rFonts w:ascii="Latha" w:hAnsi="Latha" w:cs="Latha"/>
+                <w:sz w:val="28"/>
+                <w:szCs w:val="28"/>
+                <w:lang w:bidi="ta-IN"/>
+              </w:rPr>
+              <w:t xml:space="preserve"> |</w:t>
+            </w:r>
+          </w:p>
+        </w:tc>
+      </w:tr>
+    </w:tbl>
+    <w:p>
+      <w:pPr>
+        <w:jc w:val="center"/>
+        <w:rPr>
+          <w:b/>
+          <w:bCs/>
+          <w:sz w:val="32"/>
+          <w:szCs w:val="32"/>
+          <w:u w:val="single"/>
+        </w:rPr>
+      </w:pPr>
+      <w:r>
+        <w:rPr>
+          <w:b/>
+          <w:bCs/>
+          <w:sz w:val="32"/>
+          <w:szCs w:val="32"/>
+          <w:u w:val="single"/>
+        </w:rPr>
+        <w:t>==============</w:t>
+      </w:r>
+    </w:p>
+    <w:p>
+      <w:pPr>
+        <w:jc w:val="center"/>
+        <w:rPr>
+          <w:b/>
+          <w:bCs/>
+          <w:sz w:val="32"/>
+          <w:szCs w:val="32"/>
+          <w:u w:val="single"/>
+        </w:rPr>
+      </w:pPr>
+    </w:p>
+    <w:p>
+      <w:pPr>
+        <w:jc w:val="center"/>
+        <w:rPr>
+          <w:b/>
+          <w:bCs/>
+          <w:sz w:val="32"/>
+          <w:szCs w:val="32"/>
+          <w:u w:val="single"/>
+        </w:rPr>
+      </w:pPr>
+    </w:p>
+    <w:p>
+      <w:pPr>
+        <w:jc w:val="center"/>
+        <w:rPr>
+          <w:b/>
+          <w:bCs/>
+          <w:sz w:val="32"/>
+          <w:szCs w:val="32"/>
+          <w:u w:val="single"/>
+        </w:rPr>
+      </w:pPr>
+    </w:p>
+    <w:p>
+      <w:pPr>
+        <w:jc w:val="center"/>
+        <w:rPr>
+          <w:b/>
+          <w:bCs/>
+          <w:sz w:val="32"/>
+          <w:szCs w:val="32"/>
+          <w:u w:val="single"/>
+        </w:rPr>
+      </w:pPr>
+    </w:p>
+    <w:p>
+      <w:pPr>
+        <w:jc w:val="center"/>
+        <w:rPr>
+          <w:b/>
+          <w:bCs/>
+          <w:sz w:val="32"/>
+          <w:szCs w:val="32"/>
+          <w:u w:val="single"/>
+        </w:rPr>
+      </w:pPr>
+    </w:p>
+    <w:p>
+      <w:pPr>
+        <w:jc w:val="center"/>
+        <w:rPr>
+          <w:b/>
+          <w:bCs/>
+          <w:sz w:val="32"/>
+          <w:szCs w:val="32"/>
+          <w:u w:val="single"/>
+        </w:rPr>
+      </w:pPr>
+    </w:p>
     <w:p>
       <w:pPr>
         <w:jc w:val="center"/>
@@ -128,23 +4302,7 @@
           <w:b/>
           <w:bCs/>
         </w:rPr>
-        <w:t>(</w:t>
-      </w:r>
-      <w:proofErr w:type="gramStart"/>
-      <w:r>
-        <w:rPr>
-          <w:b/>
-          <w:bCs/>
-        </w:rPr>
-        <w:t>ignore</w:t>
-      </w:r>
-      <w:proofErr w:type="gramEnd"/>
-      <w:r>
-        <w:rPr>
-          <w:b/>
-          <w:bCs/>
-        </w:rPr>
-        <w:t xml:space="preserve"> those which are already incorporated in your book’s version and date)</w:t>
+        <w:t>(ignore those which are already incorporated in your book’s version and date)</w:t>
       </w:r>
     </w:p>
     <w:tbl>
@@ -189,6 +4347,7 @@
                 <w:sz w:val="32"/>
                 <w:szCs w:val="32"/>
               </w:rPr>
+              <w:lastRenderedPageBreak/>
               <w:t>Section, Paragraph</w:t>
             </w:r>
           </w:p>
@@ -2513,7 +6672,6 @@
                 <w:sz w:val="28"/>
                 <w:szCs w:val="32"/>
               </w:rPr>
-              <w:lastRenderedPageBreak/>
               <w:t>T.S.7.4.2.2 – Kramam</w:t>
             </w:r>
           </w:p>
@@ -3144,6 +7302,7 @@
                 <w:sz w:val="28"/>
                 <w:szCs w:val="32"/>
               </w:rPr>
+              <w:lastRenderedPageBreak/>
               <w:t>T.S.7.4.2.</w:t>
             </w:r>
             <w:r>
@@ -5739,7 +9898,6 @@
                 <w:sz w:val="28"/>
                 <w:szCs w:val="32"/>
               </w:rPr>
-              <w:lastRenderedPageBreak/>
               <w:t>Panchaati No</w:t>
             </w:r>
             <w:r>
@@ -5788,7 +9946,6 @@
                 <w:cs/>
                 <w:lang w:bidi="ta-IN"/>
               </w:rPr>
-              <w:lastRenderedPageBreak/>
               <w:t>ப்</w:t>
             </w:r>
             <w:r>
@@ -5976,7 +10133,6 @@
                 <w:cs/>
                 <w:lang w:bidi="ta-IN"/>
               </w:rPr>
-              <w:lastRenderedPageBreak/>
               <w:t>ப்</w:t>
             </w:r>
             <w:r>
@@ -6117,7 +10273,6 @@
                 <w:cs/>
                 <w:lang w:bidi="ta-IN"/>
               </w:rPr>
-              <w:lastRenderedPageBreak/>
               <w:t>ப்</w:t>
             </w:r>
             <w:r>
@@ -6295,7 +10450,6 @@
                 <w:cs/>
                 <w:lang w:bidi="ta-IN"/>
               </w:rPr>
-              <w:lastRenderedPageBreak/>
               <w:t>ப்</w:t>
             </w:r>
             <w:r>
@@ -6432,7 +10586,6 @@
                 <w:sz w:val="28"/>
                 <w:szCs w:val="32"/>
               </w:rPr>
-              <w:lastRenderedPageBreak/>
               <w:t>T.S.7.4.3.2 – Kramam</w:t>
             </w:r>
           </w:p>
@@ -6738,6 +10891,7 @@
                 <w:cs/>
                 <w:lang w:bidi="ta-IN"/>
               </w:rPr>
+              <w:lastRenderedPageBreak/>
               <w:t>ரு</w:t>
             </w:r>
             <w:r>
@@ -9481,7 +13635,6 @@
                 <w:sz w:val="28"/>
                 <w:szCs w:val="32"/>
               </w:rPr>
-              <w:lastRenderedPageBreak/>
               <w:t>T.S.</w:t>
             </w:r>
             <w:r>
@@ -10030,6 +14183,7 @@
                 <w:sz w:val="28"/>
                 <w:szCs w:val="32"/>
               </w:rPr>
+              <w:lastRenderedPageBreak/>
               <w:t>T.S.7.4.5.1 – Kramam</w:t>
             </w:r>
           </w:p>
@@ -20066,6 +24220,7 @@
               </w:rPr>
               <w:t>“</w:t>
             </w:r>
+            <w:proofErr w:type="spellStart"/>
             <w:r>
               <w:rPr>
                 <w:b/>
@@ -20073,6 +24228,7 @@
               </w:rPr>
               <w:t>manyate</w:t>
             </w:r>
+            <w:proofErr w:type="spellEnd"/>
             <w:r>
               <w:rPr>
                 <w:b/>
@@ -20085,8 +24241,17 @@
                 <w:b/>
                 <w:bCs/>
               </w:rPr>
-              <w:t xml:space="preserve"> ruk</w:t>
-            </w:r>
+              <w:t xml:space="preserve"> </w:t>
+            </w:r>
+            <w:proofErr w:type="spellStart"/>
+            <w:r>
+              <w:rPr>
+                <w:b/>
+                <w:bCs/>
+              </w:rPr>
+              <w:t>ruk</w:t>
+            </w:r>
+            <w:proofErr w:type="spellEnd"/>
             <w:r>
               <w:rPr>
                 <w:rFonts w:ascii="BRH Malayalam Extra" w:hAnsi="BRH Malayalam Extra" w:cs="BRH Malayalam Extra"/>
@@ -20140,6 +24305,7 @@
               </w:rPr>
               <w:t>“</w:t>
             </w:r>
+            <w:proofErr w:type="spellStart"/>
             <w:r>
               <w:rPr>
                 <w:b/>
@@ -20147,6 +24313,7 @@
               </w:rPr>
               <w:t>manyate</w:t>
             </w:r>
+            <w:proofErr w:type="spellEnd"/>
             <w:r>
               <w:rPr>
                 <w:b/>
@@ -20168,6 +24335,7 @@
               </w:rPr>
               <w:t>“</w:t>
             </w:r>
+            <w:proofErr w:type="spellStart"/>
             <w:r>
               <w:rPr>
                 <w:b/>
@@ -20196,6 +24364,7 @@
               </w:rPr>
               <w:t>a</w:t>
             </w:r>
+            <w:proofErr w:type="spellEnd"/>
             <w:r>
               <w:rPr>
                 <w:b/>
@@ -20224,12 +24393,21 @@
               </w:rPr>
               <w:t xml:space="preserve"> </w:t>
             </w:r>
+            <w:proofErr w:type="spellStart"/>
             <w:r>
               <w:rPr>
                 <w:b/>
                 <w:bCs/>
               </w:rPr>
-              <w:t xml:space="preserve">padam of </w:t>
+              <w:t>padam</w:t>
+            </w:r>
+            <w:proofErr w:type="spellEnd"/>
+            <w:r>
+              <w:rPr>
+                <w:b/>
+                <w:bCs/>
+              </w:rPr>
+              <w:t xml:space="preserve"> of </w:t>
             </w:r>
             <w:r>
               <w:rPr>
@@ -22248,7 +26426,7 @@
 </file>
 
 <file path=word/endnotes.xml><?xml version="1.0" encoding="utf-8"?>
-<w:endnotes xmlns:wpc="http://schemas.microsoft.com/office/word/2010/wordprocessingCanvas" xmlns:cx="http://schemas.microsoft.com/office/drawing/2014/chartex" xmlns:cx1="http://schemas.microsoft.com/office/drawing/2015/9/8/chartex" xmlns:cx2="http://schemas.microsoft.com/office/drawing/2015/10/21/chartex" xmlns:cx3="http://schemas.microsoft.com/office/drawing/2016/5/9/chartex" xmlns:cx4="http://schemas.microsoft.com/office/drawing/2016/5/10/chartex" xmlns:cx5="http://schemas.microsoft.com/office/drawing/2016/5/11/chartex" xmlns:cx6="http://schemas.microsoft.com/office/drawing/2016/5/12/chartex" xmlns:cx7="http://schemas.microsoft.com/office/drawing/2016/5/13/chartex" xmlns:cx8="http://schemas.microsoft.com/office/drawing/2016/5/14/chartex" xmlns:mc="http://schemas.openxmlformats.org/markup-compatibility/2006" xmlns:aink="http://schemas.microsoft.com/office/drawing/2016/ink" xmlns:am3d="http://schemas.microsoft.com/office/drawing/2017/model3d" xmlns:o="urn:schemas-microsoft-com:office:office" xmlns:oel="http://schemas.microsoft.com/office/2019/extlst" xmlns:r="http://schemas.openxmlformats.org/officeDocument/2006/relationships" xmlns:m="http://schemas.openxmlformats.org/officeDocument/2006/math" xmlns:v="urn:schemas-microsoft-com:vml" xmlns:wp14="http://schemas.microsoft.com/office/word/2010/wordprocessingDrawing" xmlns:wp="http://schemas.openxmlformats.org/drawingml/2006/wordprocessingDrawing" xmlns:w10="urn:schemas-microsoft-com:office:word" xmlns:w="http://schemas.openxmlformats.org/wordprocessingml/2006/main" xmlns:w14="http://schemas.microsoft.com/office/word/2010/wordml" xmlns:w15="http://schemas.microsoft.com/office/word/2012/wordml" xmlns:w16cex="http://schemas.microsoft.com/office/word/2018/wordml/cex" xmlns:w16cid="http://schemas.microsoft.com/office/word/2016/wordml/cid" xmlns:w16="http://schemas.microsoft.com/office/word/2018/wordml" xmlns:w16sdtdh="http://schemas.microsoft.com/office/word/2020/wordml/sdtdatahash" xmlns:w16se="http://schemas.microsoft.com/office/word/2015/wordml/symex" xmlns:wpg="http://schemas.microsoft.com/office/word/2010/wordprocessingGroup" xmlns:wpi="http://schemas.microsoft.com/office/word/2010/wordprocessingInk" xmlns:wne="http://schemas.microsoft.com/office/word/2006/wordml" xmlns:wps="http://schemas.microsoft.com/office/word/2010/wordprocessingShape" mc:Ignorable="w14 w15 w16se w16cid w16 w16cex w16sdtdh wp14">
+<w:endnotes xmlns:wpc="http://schemas.microsoft.com/office/word/2010/wordprocessingCanvas" xmlns:cx="http://schemas.microsoft.com/office/drawing/2014/chartex" xmlns:cx1="http://schemas.microsoft.com/office/drawing/2015/9/8/chartex" xmlns:cx2="http://schemas.microsoft.com/office/drawing/2015/10/21/chartex" xmlns:cx3="http://schemas.microsoft.com/office/drawing/2016/5/9/chartex" xmlns:cx4="http://schemas.microsoft.com/office/drawing/2016/5/10/chartex" xmlns:cx5="http://schemas.microsoft.com/office/drawing/2016/5/11/chartex" xmlns:cx6="http://schemas.microsoft.com/office/drawing/2016/5/12/chartex" xmlns:cx7="http://schemas.microsoft.com/office/drawing/2016/5/13/chartex" xmlns:cx8="http://schemas.microsoft.com/office/drawing/2016/5/14/chartex" xmlns:mc="http://schemas.openxmlformats.org/markup-compatibility/2006" xmlns:aink="http://schemas.microsoft.com/office/drawing/2016/ink" xmlns:am3d="http://schemas.microsoft.com/office/drawing/2017/model3d" xmlns:o="urn:schemas-microsoft-com:office:office" xmlns:oel="http://schemas.microsoft.com/office/2019/extlst" xmlns:r="http://schemas.openxmlformats.org/officeDocument/2006/relationships" xmlns:m="http://schemas.openxmlformats.org/officeDocument/2006/math" xmlns:v="urn:schemas-microsoft-com:vml" xmlns:wp14="http://schemas.microsoft.com/office/word/2010/wordprocessingDrawing" xmlns:wp="http://schemas.openxmlformats.org/drawingml/2006/wordprocessingDrawing" xmlns:w10="urn:schemas-microsoft-com:office:word" xmlns:w="http://schemas.openxmlformats.org/wordprocessingml/2006/main" xmlns:w14="http://schemas.microsoft.com/office/word/2010/wordml" xmlns:w15="http://schemas.microsoft.com/office/word/2012/wordml" xmlns:w16cex="http://schemas.microsoft.com/office/word/2018/wordml/cex" xmlns:w16cid="http://schemas.microsoft.com/office/word/2016/wordml/cid" xmlns:w16="http://schemas.microsoft.com/office/word/2018/wordml" xmlns:w16du="http://schemas.microsoft.com/office/word/2023/wordml/word16du" xmlns:w16sdtdh="http://schemas.microsoft.com/office/word/2020/wordml/sdtdatahash" xmlns:w16sdtfl="http://schemas.microsoft.com/office/word/2024/wordml/sdtformatlock" xmlns:w16se="http://schemas.microsoft.com/office/word/2015/wordml/symex" xmlns:wpg="http://schemas.microsoft.com/office/word/2010/wordprocessingGroup" xmlns:wpi="http://schemas.microsoft.com/office/word/2010/wordprocessingInk" xmlns:wne="http://schemas.microsoft.com/office/word/2006/wordml" xmlns:wps="http://schemas.microsoft.com/office/word/2010/wordprocessingShape" mc:Ignorable="w14 w15 w16se w16cid w16 w16cex w16sdtdh w16sdtfl w16du wp14">
   <w:endnote w:type="separator" w:id="-1">
     <w:p>
       <w:pPr>
@@ -22273,7 +26451,7 @@
 </file>
 
 <file path=word/footer1.xml><?xml version="1.0" encoding="utf-8"?>
-<w:ftr xmlns:wpc="http://schemas.microsoft.com/office/word/2010/wordprocessingCanvas" xmlns:cx="http://schemas.microsoft.com/office/drawing/2014/chartex" xmlns:cx1="http://schemas.microsoft.com/office/drawing/2015/9/8/chartex" xmlns:cx2="http://schemas.microsoft.com/office/drawing/2015/10/21/chartex" xmlns:cx3="http://schemas.microsoft.com/office/drawing/2016/5/9/chartex" xmlns:cx4="http://schemas.microsoft.com/office/drawing/2016/5/10/chartex" xmlns:cx5="http://schemas.microsoft.com/office/drawing/2016/5/11/chartex" xmlns:cx6="http://schemas.microsoft.com/office/drawing/2016/5/12/chartex" xmlns:cx7="http://schemas.microsoft.com/office/drawing/2016/5/13/chartex" xmlns:cx8="http://schemas.microsoft.com/office/drawing/2016/5/14/chartex" xmlns:mc="http://schemas.openxmlformats.org/markup-compatibility/2006" xmlns:aink="http://schemas.microsoft.com/office/drawing/2016/ink" xmlns:am3d="http://schemas.microsoft.com/office/drawing/2017/model3d" xmlns:o="urn:schemas-microsoft-com:office:office" xmlns:oel="http://schemas.microsoft.com/office/2019/extlst" xmlns:r="http://schemas.openxmlformats.org/officeDocument/2006/relationships" xmlns:m="http://schemas.openxmlformats.org/officeDocument/2006/math" xmlns:v="urn:schemas-microsoft-com:vml" xmlns:wp14="http://schemas.microsoft.com/office/word/2010/wordprocessingDrawing" xmlns:wp="http://schemas.openxmlformats.org/drawingml/2006/wordprocessingDrawing" xmlns:w10="urn:schemas-microsoft-com:office:word" xmlns:w="http://schemas.openxmlformats.org/wordprocessingml/2006/main" xmlns:w14="http://schemas.microsoft.com/office/word/2010/wordml" xmlns:w15="http://schemas.microsoft.com/office/word/2012/wordml" xmlns:w16cex="http://schemas.microsoft.com/office/word/2018/wordml/cex" xmlns:w16cid="http://schemas.microsoft.com/office/word/2016/wordml/cid" xmlns:w16="http://schemas.microsoft.com/office/word/2018/wordml" xmlns:w16sdtdh="http://schemas.microsoft.com/office/word/2020/wordml/sdtdatahash" xmlns:w16se="http://schemas.microsoft.com/office/word/2015/wordml/symex" xmlns:wpg="http://schemas.microsoft.com/office/word/2010/wordprocessingGroup" xmlns:wpi="http://schemas.microsoft.com/office/word/2010/wordprocessingInk" xmlns:wne="http://schemas.microsoft.com/office/word/2006/wordml" xmlns:wps="http://schemas.microsoft.com/office/word/2010/wordprocessingShape" mc:Ignorable="w14 w15 w16se w16cid w16 w16cex w16sdtdh wp14">
+<w:ftr xmlns:wpc="http://schemas.microsoft.com/office/word/2010/wordprocessingCanvas" xmlns:cx="http://schemas.microsoft.com/office/drawing/2014/chartex" xmlns:cx1="http://schemas.microsoft.com/office/drawing/2015/9/8/chartex" xmlns:cx2="http://schemas.microsoft.com/office/drawing/2015/10/21/chartex" xmlns:cx3="http://schemas.microsoft.com/office/drawing/2016/5/9/chartex" xmlns:cx4="http://schemas.microsoft.com/office/drawing/2016/5/10/chartex" xmlns:cx5="http://schemas.microsoft.com/office/drawing/2016/5/11/chartex" xmlns:cx6="http://schemas.microsoft.com/office/drawing/2016/5/12/chartex" xmlns:cx7="http://schemas.microsoft.com/office/drawing/2016/5/13/chartex" xmlns:cx8="http://schemas.microsoft.com/office/drawing/2016/5/14/chartex" xmlns:mc="http://schemas.openxmlformats.org/markup-compatibility/2006" xmlns:aink="http://schemas.microsoft.com/office/drawing/2016/ink" xmlns:am3d="http://schemas.microsoft.com/office/drawing/2017/model3d" xmlns:o="urn:schemas-microsoft-com:office:office" xmlns:oel="http://schemas.microsoft.com/office/2019/extlst" xmlns:r="http://schemas.openxmlformats.org/officeDocument/2006/relationships" xmlns:m="http://schemas.openxmlformats.org/officeDocument/2006/math" xmlns:v="urn:schemas-microsoft-com:vml" xmlns:wp14="http://schemas.microsoft.com/office/word/2010/wordprocessingDrawing" xmlns:wp="http://schemas.openxmlformats.org/drawingml/2006/wordprocessingDrawing" xmlns:w10="urn:schemas-microsoft-com:office:word" xmlns:w="http://schemas.openxmlformats.org/wordprocessingml/2006/main" xmlns:w14="http://schemas.microsoft.com/office/word/2010/wordml" xmlns:w15="http://schemas.microsoft.com/office/word/2012/wordml" xmlns:w16cex="http://schemas.microsoft.com/office/word/2018/wordml/cex" xmlns:w16cid="http://schemas.microsoft.com/office/word/2016/wordml/cid" xmlns:w16="http://schemas.microsoft.com/office/word/2018/wordml" xmlns:w16du="http://schemas.microsoft.com/office/word/2023/wordml/word16du" xmlns:w16sdtdh="http://schemas.microsoft.com/office/word/2020/wordml/sdtdatahash" xmlns:w16sdtfl="http://schemas.microsoft.com/office/word/2024/wordml/sdtformatlock" xmlns:w16se="http://schemas.microsoft.com/office/word/2015/wordml/symex" xmlns:wpg="http://schemas.microsoft.com/office/word/2010/wordprocessingGroup" xmlns:wpi="http://schemas.microsoft.com/office/word/2010/wordprocessingInk" xmlns:wne="http://schemas.microsoft.com/office/word/2006/wordml" xmlns:wps="http://schemas.microsoft.com/office/word/2010/wordprocessingShape" mc:Ignorable="w14 w15 w16se w16cid w16 w16cex w16sdtdh w16sdtfl w16du wp14">
   <w:p>
     <w:pPr>
       <w:pBdr>
@@ -22465,7 +26643,7 @@
 </file>
 
 <file path=word/footer2.xml><?xml version="1.0" encoding="utf-8"?>
-<w:ftr xmlns:wpc="http://schemas.microsoft.com/office/word/2010/wordprocessingCanvas" xmlns:cx="http://schemas.microsoft.com/office/drawing/2014/chartex" xmlns:cx1="http://schemas.microsoft.com/office/drawing/2015/9/8/chartex" xmlns:cx2="http://schemas.microsoft.com/office/drawing/2015/10/21/chartex" xmlns:cx3="http://schemas.microsoft.com/office/drawing/2016/5/9/chartex" xmlns:cx4="http://schemas.microsoft.com/office/drawing/2016/5/10/chartex" xmlns:cx5="http://schemas.microsoft.com/office/drawing/2016/5/11/chartex" xmlns:cx6="http://schemas.microsoft.com/office/drawing/2016/5/12/chartex" xmlns:cx7="http://schemas.microsoft.com/office/drawing/2016/5/13/chartex" xmlns:cx8="http://schemas.microsoft.com/office/drawing/2016/5/14/chartex" xmlns:mc="http://schemas.openxmlformats.org/markup-compatibility/2006" xmlns:aink="http://schemas.microsoft.com/office/drawing/2016/ink" xmlns:am3d="http://schemas.microsoft.com/office/drawing/2017/model3d" xmlns:o="urn:schemas-microsoft-com:office:office" xmlns:oel="http://schemas.microsoft.com/office/2019/extlst" xmlns:r="http://schemas.openxmlformats.org/officeDocument/2006/relationships" xmlns:m="http://schemas.openxmlformats.org/officeDocument/2006/math" xmlns:v="urn:schemas-microsoft-com:vml" xmlns:wp14="http://schemas.microsoft.com/office/word/2010/wordprocessingDrawing" xmlns:wp="http://schemas.openxmlformats.org/drawingml/2006/wordprocessingDrawing" xmlns:w10="urn:schemas-microsoft-com:office:word" xmlns:w="http://schemas.openxmlformats.org/wordprocessingml/2006/main" xmlns:w14="http://schemas.microsoft.com/office/word/2010/wordml" xmlns:w15="http://schemas.microsoft.com/office/word/2012/wordml" xmlns:w16cex="http://schemas.microsoft.com/office/word/2018/wordml/cex" xmlns:w16cid="http://schemas.microsoft.com/office/word/2016/wordml/cid" xmlns:w16="http://schemas.microsoft.com/office/word/2018/wordml" xmlns:w16sdtdh="http://schemas.microsoft.com/office/word/2020/wordml/sdtdatahash" xmlns:w16se="http://schemas.microsoft.com/office/word/2015/wordml/symex" xmlns:wpg="http://schemas.microsoft.com/office/word/2010/wordprocessingGroup" xmlns:wpi="http://schemas.microsoft.com/office/word/2010/wordprocessingInk" xmlns:wne="http://schemas.microsoft.com/office/word/2006/wordml" xmlns:wps="http://schemas.microsoft.com/office/word/2010/wordprocessingShape" mc:Ignorable="w14 w15 w16se w16cid w16 w16cex w16sdtdh wp14">
+<w:ftr xmlns:wpc="http://schemas.microsoft.com/office/word/2010/wordprocessingCanvas" xmlns:cx="http://schemas.microsoft.com/office/drawing/2014/chartex" xmlns:cx1="http://schemas.microsoft.com/office/drawing/2015/9/8/chartex" xmlns:cx2="http://schemas.microsoft.com/office/drawing/2015/10/21/chartex" xmlns:cx3="http://schemas.microsoft.com/office/drawing/2016/5/9/chartex" xmlns:cx4="http://schemas.microsoft.com/office/drawing/2016/5/10/chartex" xmlns:cx5="http://schemas.microsoft.com/office/drawing/2016/5/11/chartex" xmlns:cx6="http://schemas.microsoft.com/office/drawing/2016/5/12/chartex" xmlns:cx7="http://schemas.microsoft.com/office/drawing/2016/5/13/chartex" xmlns:cx8="http://schemas.microsoft.com/office/drawing/2016/5/14/chartex" xmlns:mc="http://schemas.openxmlformats.org/markup-compatibility/2006" xmlns:aink="http://schemas.microsoft.com/office/drawing/2016/ink" xmlns:am3d="http://schemas.microsoft.com/office/drawing/2017/model3d" xmlns:o="urn:schemas-microsoft-com:office:office" xmlns:oel="http://schemas.microsoft.com/office/2019/extlst" xmlns:r="http://schemas.openxmlformats.org/officeDocument/2006/relationships" xmlns:m="http://schemas.openxmlformats.org/officeDocument/2006/math" xmlns:v="urn:schemas-microsoft-com:vml" xmlns:wp14="http://schemas.microsoft.com/office/word/2010/wordprocessingDrawing" xmlns:wp="http://schemas.openxmlformats.org/drawingml/2006/wordprocessingDrawing" xmlns:w10="urn:schemas-microsoft-com:office:word" xmlns:w="http://schemas.openxmlformats.org/wordprocessingml/2006/main" xmlns:w14="http://schemas.microsoft.com/office/word/2010/wordml" xmlns:w15="http://schemas.microsoft.com/office/word/2012/wordml" xmlns:w16cex="http://schemas.microsoft.com/office/word/2018/wordml/cex" xmlns:w16cid="http://schemas.microsoft.com/office/word/2016/wordml/cid" xmlns:w16="http://schemas.microsoft.com/office/word/2018/wordml" xmlns:w16du="http://schemas.microsoft.com/office/word/2023/wordml/word16du" xmlns:w16sdtdh="http://schemas.microsoft.com/office/word/2020/wordml/sdtdatahash" xmlns:w16sdtfl="http://schemas.microsoft.com/office/word/2024/wordml/sdtformatlock" xmlns:w16se="http://schemas.microsoft.com/office/word/2015/wordml/symex" xmlns:wpg="http://schemas.microsoft.com/office/word/2010/wordprocessingGroup" xmlns:wpi="http://schemas.microsoft.com/office/word/2010/wordprocessingInk" xmlns:wne="http://schemas.microsoft.com/office/word/2006/wordml" xmlns:wps="http://schemas.microsoft.com/office/word/2010/wordprocessingShape" mc:Ignorable="w14 w15 w16se w16cid w16 w16cex w16sdtdh w16sdtfl w16du wp14">
   <w:p>
     <w:pPr>
       <w:pBdr>
@@ -22646,7 +26824,7 @@
 </file>
 
 <file path=word/footnotes.xml><?xml version="1.0" encoding="utf-8"?>
-<w:footnotes xmlns:wpc="http://schemas.microsoft.com/office/word/2010/wordprocessingCanvas" xmlns:cx="http://schemas.microsoft.com/office/drawing/2014/chartex" xmlns:cx1="http://schemas.microsoft.com/office/drawing/2015/9/8/chartex" xmlns:cx2="http://schemas.microsoft.com/office/drawing/2015/10/21/chartex" xmlns:cx3="http://schemas.microsoft.com/office/drawing/2016/5/9/chartex" xmlns:cx4="http://schemas.microsoft.com/office/drawing/2016/5/10/chartex" xmlns:cx5="http://schemas.microsoft.com/office/drawing/2016/5/11/chartex" xmlns:cx6="http://schemas.microsoft.com/office/drawing/2016/5/12/chartex" xmlns:cx7="http://schemas.microsoft.com/office/drawing/2016/5/13/chartex" xmlns:cx8="http://schemas.microsoft.com/office/drawing/2016/5/14/chartex" xmlns:mc="http://schemas.openxmlformats.org/markup-compatibility/2006" xmlns:aink="http://schemas.microsoft.com/office/drawing/2016/ink" xmlns:am3d="http://schemas.microsoft.com/office/drawing/2017/model3d" xmlns:o="urn:schemas-microsoft-com:office:office" xmlns:oel="http://schemas.microsoft.com/office/2019/extlst" xmlns:r="http://schemas.openxmlformats.org/officeDocument/2006/relationships" xmlns:m="http://schemas.openxmlformats.org/officeDocument/2006/math" xmlns:v="urn:schemas-microsoft-com:vml" xmlns:wp14="http://schemas.microsoft.com/office/word/2010/wordprocessingDrawing" xmlns:wp="http://schemas.openxmlformats.org/drawingml/2006/wordprocessingDrawing" xmlns:w10="urn:schemas-microsoft-com:office:word" xmlns:w="http://schemas.openxmlformats.org/wordprocessingml/2006/main" xmlns:w14="http://schemas.microsoft.com/office/word/2010/wordml" xmlns:w15="http://schemas.microsoft.com/office/word/2012/wordml" xmlns:w16cex="http://schemas.microsoft.com/office/word/2018/wordml/cex" xmlns:w16cid="http://schemas.microsoft.com/office/word/2016/wordml/cid" xmlns:w16="http://schemas.microsoft.com/office/word/2018/wordml" xmlns:w16sdtdh="http://schemas.microsoft.com/office/word/2020/wordml/sdtdatahash" xmlns:w16se="http://schemas.microsoft.com/office/word/2015/wordml/symex" xmlns:wpg="http://schemas.microsoft.com/office/word/2010/wordprocessingGroup" xmlns:wpi="http://schemas.microsoft.com/office/word/2010/wordprocessingInk" xmlns:wne="http://schemas.microsoft.com/office/word/2006/wordml" xmlns:wps="http://schemas.microsoft.com/office/word/2010/wordprocessingShape" mc:Ignorable="w14 w15 w16se w16cid w16 w16cex w16sdtdh wp14">
+<w:footnotes xmlns:wpc="http://schemas.microsoft.com/office/word/2010/wordprocessingCanvas" xmlns:cx="http://schemas.microsoft.com/office/drawing/2014/chartex" xmlns:cx1="http://schemas.microsoft.com/office/drawing/2015/9/8/chartex" xmlns:cx2="http://schemas.microsoft.com/office/drawing/2015/10/21/chartex" xmlns:cx3="http://schemas.microsoft.com/office/drawing/2016/5/9/chartex" xmlns:cx4="http://schemas.microsoft.com/office/drawing/2016/5/10/chartex" xmlns:cx5="http://schemas.microsoft.com/office/drawing/2016/5/11/chartex" xmlns:cx6="http://schemas.microsoft.com/office/drawing/2016/5/12/chartex" xmlns:cx7="http://schemas.microsoft.com/office/drawing/2016/5/13/chartex" xmlns:cx8="http://schemas.microsoft.com/office/drawing/2016/5/14/chartex" xmlns:mc="http://schemas.openxmlformats.org/markup-compatibility/2006" xmlns:aink="http://schemas.microsoft.com/office/drawing/2016/ink" xmlns:am3d="http://schemas.microsoft.com/office/drawing/2017/model3d" xmlns:o="urn:schemas-microsoft-com:office:office" xmlns:oel="http://schemas.microsoft.com/office/2019/extlst" xmlns:r="http://schemas.openxmlformats.org/officeDocument/2006/relationships" xmlns:m="http://schemas.openxmlformats.org/officeDocument/2006/math" xmlns:v="urn:schemas-microsoft-com:vml" xmlns:wp14="http://schemas.microsoft.com/office/word/2010/wordprocessingDrawing" xmlns:wp="http://schemas.openxmlformats.org/drawingml/2006/wordprocessingDrawing" xmlns:w10="urn:schemas-microsoft-com:office:word" xmlns:w="http://schemas.openxmlformats.org/wordprocessingml/2006/main" xmlns:w14="http://schemas.microsoft.com/office/word/2010/wordml" xmlns:w15="http://schemas.microsoft.com/office/word/2012/wordml" xmlns:w16cex="http://schemas.microsoft.com/office/word/2018/wordml/cex" xmlns:w16cid="http://schemas.microsoft.com/office/word/2016/wordml/cid" xmlns:w16="http://schemas.microsoft.com/office/word/2018/wordml" xmlns:w16du="http://schemas.microsoft.com/office/word/2023/wordml/word16du" xmlns:w16sdtdh="http://schemas.microsoft.com/office/word/2020/wordml/sdtdatahash" xmlns:w16sdtfl="http://schemas.microsoft.com/office/word/2024/wordml/sdtformatlock" xmlns:w16se="http://schemas.microsoft.com/office/word/2015/wordml/symex" xmlns:wpg="http://schemas.microsoft.com/office/word/2010/wordprocessingGroup" xmlns:wpi="http://schemas.microsoft.com/office/word/2010/wordprocessingInk" xmlns:wne="http://schemas.microsoft.com/office/word/2006/wordml" xmlns:wps="http://schemas.microsoft.com/office/word/2010/wordprocessingShape" mc:Ignorable="w14 w15 w16se w16cid w16 w16cex w16sdtdh w16sdtfl w16du wp14">
   <w:footnote w:type="separator" w:id="-1">
     <w:p>
       <w:pPr>
@@ -22671,7 +26849,7 @@
 </file>
 
 <file path=word/header1.xml><?xml version="1.0" encoding="utf-8"?>
-<w:hdr xmlns:wpc="http://schemas.microsoft.com/office/word/2010/wordprocessingCanvas" xmlns:cx="http://schemas.microsoft.com/office/drawing/2014/chartex" xmlns:cx1="http://schemas.microsoft.com/office/drawing/2015/9/8/chartex" xmlns:cx2="http://schemas.microsoft.com/office/drawing/2015/10/21/chartex" xmlns:cx3="http://schemas.microsoft.com/office/drawing/2016/5/9/chartex" xmlns:cx4="http://schemas.microsoft.com/office/drawing/2016/5/10/chartex" xmlns:cx5="http://schemas.microsoft.com/office/drawing/2016/5/11/chartex" xmlns:cx6="http://schemas.microsoft.com/office/drawing/2016/5/12/chartex" xmlns:cx7="http://schemas.microsoft.com/office/drawing/2016/5/13/chartex" xmlns:cx8="http://schemas.microsoft.com/office/drawing/2016/5/14/chartex" xmlns:mc="http://schemas.openxmlformats.org/markup-compatibility/2006" xmlns:aink="http://schemas.microsoft.com/office/drawing/2016/ink" xmlns:am3d="http://schemas.microsoft.com/office/drawing/2017/model3d" xmlns:o="urn:schemas-microsoft-com:office:office" xmlns:oel="http://schemas.microsoft.com/office/2019/extlst" xmlns:r="http://schemas.openxmlformats.org/officeDocument/2006/relationships" xmlns:m="http://schemas.openxmlformats.org/officeDocument/2006/math" xmlns:v="urn:schemas-microsoft-com:vml" xmlns:wp14="http://schemas.microsoft.com/office/word/2010/wordprocessingDrawing" xmlns:wp="http://schemas.openxmlformats.org/drawingml/2006/wordprocessingDrawing" xmlns:w10="urn:schemas-microsoft-com:office:word" xmlns:w="http://schemas.openxmlformats.org/wordprocessingml/2006/main" xmlns:w14="http://schemas.microsoft.com/office/word/2010/wordml" xmlns:w15="http://schemas.microsoft.com/office/word/2012/wordml" xmlns:w16cex="http://schemas.microsoft.com/office/word/2018/wordml/cex" xmlns:w16cid="http://schemas.microsoft.com/office/word/2016/wordml/cid" xmlns:w16="http://schemas.microsoft.com/office/word/2018/wordml" xmlns:w16sdtdh="http://schemas.microsoft.com/office/word/2020/wordml/sdtdatahash" xmlns:w16se="http://schemas.microsoft.com/office/word/2015/wordml/symex" xmlns:wpg="http://schemas.microsoft.com/office/word/2010/wordprocessingGroup" xmlns:wpi="http://schemas.microsoft.com/office/word/2010/wordprocessingInk" xmlns:wne="http://schemas.microsoft.com/office/word/2006/wordml" xmlns:wps="http://schemas.microsoft.com/office/word/2010/wordprocessingShape" mc:Ignorable="w14 w15 w16se w16cid w16 w16cex w16sdtdh wp14">
+<w:hdr xmlns:wpc="http://schemas.microsoft.com/office/word/2010/wordprocessingCanvas" xmlns:cx="http://schemas.microsoft.com/office/drawing/2014/chartex" xmlns:cx1="http://schemas.microsoft.com/office/drawing/2015/9/8/chartex" xmlns:cx2="http://schemas.microsoft.com/office/drawing/2015/10/21/chartex" xmlns:cx3="http://schemas.microsoft.com/office/drawing/2016/5/9/chartex" xmlns:cx4="http://schemas.microsoft.com/office/drawing/2016/5/10/chartex" xmlns:cx5="http://schemas.microsoft.com/office/drawing/2016/5/11/chartex" xmlns:cx6="http://schemas.microsoft.com/office/drawing/2016/5/12/chartex" xmlns:cx7="http://schemas.microsoft.com/office/drawing/2016/5/13/chartex" xmlns:cx8="http://schemas.microsoft.com/office/drawing/2016/5/14/chartex" xmlns:mc="http://schemas.openxmlformats.org/markup-compatibility/2006" xmlns:aink="http://schemas.microsoft.com/office/drawing/2016/ink" xmlns:am3d="http://schemas.microsoft.com/office/drawing/2017/model3d" xmlns:o="urn:schemas-microsoft-com:office:office" xmlns:oel="http://schemas.microsoft.com/office/2019/extlst" xmlns:r="http://schemas.openxmlformats.org/officeDocument/2006/relationships" xmlns:m="http://schemas.openxmlformats.org/officeDocument/2006/math" xmlns:v="urn:schemas-microsoft-com:vml" xmlns:wp14="http://schemas.microsoft.com/office/word/2010/wordprocessingDrawing" xmlns:wp="http://schemas.openxmlformats.org/drawingml/2006/wordprocessingDrawing" xmlns:w10="urn:schemas-microsoft-com:office:word" xmlns:w="http://schemas.openxmlformats.org/wordprocessingml/2006/main" xmlns:w14="http://schemas.microsoft.com/office/word/2010/wordml" xmlns:w15="http://schemas.microsoft.com/office/word/2012/wordml" xmlns:w16cex="http://schemas.microsoft.com/office/word/2018/wordml/cex" xmlns:w16cid="http://schemas.microsoft.com/office/word/2016/wordml/cid" xmlns:w16="http://schemas.microsoft.com/office/word/2018/wordml" xmlns:w16du="http://schemas.microsoft.com/office/word/2023/wordml/word16du" xmlns:w16sdtdh="http://schemas.microsoft.com/office/word/2020/wordml/sdtdatahash" xmlns:w16sdtfl="http://schemas.microsoft.com/office/word/2024/wordml/sdtformatlock" xmlns:w16se="http://schemas.microsoft.com/office/word/2015/wordml/symex" xmlns:wpg="http://schemas.microsoft.com/office/word/2010/wordprocessingGroup" xmlns:wpi="http://schemas.microsoft.com/office/word/2010/wordprocessingInk" xmlns:wne="http://schemas.microsoft.com/office/word/2006/wordml" xmlns:wps="http://schemas.microsoft.com/office/word/2010/wordprocessingShape" mc:Ignorable="w14 w15 w16se w16cid w16 w16cex w16sdtdh w16sdtfl w16du wp14">
   <w:p>
     <w:pPr>
       <w:pStyle w:val="Header"/>
@@ -22684,7 +26862,7 @@
 </file>
 
 <file path=word/header2.xml><?xml version="1.0" encoding="utf-8"?>
-<w:hdr xmlns:wpc="http://schemas.microsoft.com/office/word/2010/wordprocessingCanvas" xmlns:cx="http://schemas.microsoft.com/office/drawing/2014/chartex" xmlns:cx1="http://schemas.microsoft.com/office/drawing/2015/9/8/chartex" xmlns:cx2="http://schemas.microsoft.com/office/drawing/2015/10/21/chartex" xmlns:cx3="http://schemas.microsoft.com/office/drawing/2016/5/9/chartex" xmlns:cx4="http://schemas.microsoft.com/office/drawing/2016/5/10/chartex" xmlns:cx5="http://schemas.microsoft.com/office/drawing/2016/5/11/chartex" xmlns:cx6="http://schemas.microsoft.com/office/drawing/2016/5/12/chartex" xmlns:cx7="http://schemas.microsoft.com/office/drawing/2016/5/13/chartex" xmlns:cx8="http://schemas.microsoft.com/office/drawing/2016/5/14/chartex" xmlns:mc="http://schemas.openxmlformats.org/markup-compatibility/2006" xmlns:aink="http://schemas.microsoft.com/office/drawing/2016/ink" xmlns:am3d="http://schemas.microsoft.com/office/drawing/2017/model3d" xmlns:o="urn:schemas-microsoft-com:office:office" xmlns:oel="http://schemas.microsoft.com/office/2019/extlst" xmlns:r="http://schemas.openxmlformats.org/officeDocument/2006/relationships" xmlns:m="http://schemas.openxmlformats.org/officeDocument/2006/math" xmlns:v="urn:schemas-microsoft-com:vml" xmlns:wp14="http://schemas.microsoft.com/office/word/2010/wordprocessingDrawing" xmlns:wp="http://schemas.openxmlformats.org/drawingml/2006/wordprocessingDrawing" xmlns:w10="urn:schemas-microsoft-com:office:word" xmlns:w="http://schemas.openxmlformats.org/wordprocessingml/2006/main" xmlns:w14="http://schemas.microsoft.com/office/word/2010/wordml" xmlns:w15="http://schemas.microsoft.com/office/word/2012/wordml" xmlns:w16cex="http://schemas.microsoft.com/office/word/2018/wordml/cex" xmlns:w16cid="http://schemas.microsoft.com/office/word/2016/wordml/cid" xmlns:w16="http://schemas.microsoft.com/office/word/2018/wordml" xmlns:w16sdtdh="http://schemas.microsoft.com/office/word/2020/wordml/sdtdatahash" xmlns:w16se="http://schemas.microsoft.com/office/word/2015/wordml/symex" xmlns:wpg="http://schemas.microsoft.com/office/word/2010/wordprocessingGroup" xmlns:wpi="http://schemas.microsoft.com/office/word/2010/wordprocessingInk" xmlns:wne="http://schemas.microsoft.com/office/word/2006/wordml" xmlns:wps="http://schemas.microsoft.com/office/word/2010/wordprocessingShape" mc:Ignorable="w14 w15 w16se w16cid w16 w16cex w16sdtdh wp14">
+<w:hdr xmlns:wpc="http://schemas.microsoft.com/office/word/2010/wordprocessingCanvas" xmlns:cx="http://schemas.microsoft.com/office/drawing/2014/chartex" xmlns:cx1="http://schemas.microsoft.com/office/drawing/2015/9/8/chartex" xmlns:cx2="http://schemas.microsoft.com/office/drawing/2015/10/21/chartex" xmlns:cx3="http://schemas.microsoft.com/office/drawing/2016/5/9/chartex" xmlns:cx4="http://schemas.microsoft.com/office/drawing/2016/5/10/chartex" xmlns:cx5="http://schemas.microsoft.com/office/drawing/2016/5/11/chartex" xmlns:cx6="http://schemas.microsoft.com/office/drawing/2016/5/12/chartex" xmlns:cx7="http://schemas.microsoft.com/office/drawing/2016/5/13/chartex" xmlns:cx8="http://schemas.microsoft.com/office/drawing/2016/5/14/chartex" xmlns:mc="http://schemas.openxmlformats.org/markup-compatibility/2006" xmlns:aink="http://schemas.microsoft.com/office/drawing/2016/ink" xmlns:am3d="http://schemas.microsoft.com/office/drawing/2017/model3d" xmlns:o="urn:schemas-microsoft-com:office:office" xmlns:oel="http://schemas.microsoft.com/office/2019/extlst" xmlns:r="http://schemas.openxmlformats.org/officeDocument/2006/relationships" xmlns:m="http://schemas.openxmlformats.org/officeDocument/2006/math" xmlns:v="urn:schemas-microsoft-com:vml" xmlns:wp14="http://schemas.microsoft.com/office/word/2010/wordprocessingDrawing" xmlns:wp="http://schemas.openxmlformats.org/drawingml/2006/wordprocessingDrawing" xmlns:w10="urn:schemas-microsoft-com:office:word" xmlns:w="http://schemas.openxmlformats.org/wordprocessingml/2006/main" xmlns:w14="http://schemas.microsoft.com/office/word/2010/wordml" xmlns:w15="http://schemas.microsoft.com/office/word/2012/wordml" xmlns:w16cex="http://schemas.microsoft.com/office/word/2018/wordml/cex" xmlns:w16cid="http://schemas.microsoft.com/office/word/2016/wordml/cid" xmlns:w16="http://schemas.microsoft.com/office/word/2018/wordml" xmlns:w16du="http://schemas.microsoft.com/office/word/2023/wordml/word16du" xmlns:w16sdtdh="http://schemas.microsoft.com/office/word/2020/wordml/sdtdatahash" xmlns:w16sdtfl="http://schemas.microsoft.com/office/word/2024/wordml/sdtformatlock" xmlns:w16se="http://schemas.microsoft.com/office/word/2015/wordml/symex" xmlns:wpg="http://schemas.microsoft.com/office/word/2010/wordprocessingGroup" xmlns:wpi="http://schemas.microsoft.com/office/word/2010/wordprocessingInk" xmlns:wne="http://schemas.microsoft.com/office/word/2006/wordml" xmlns:wps="http://schemas.microsoft.com/office/word/2010/wordprocessingShape" mc:Ignorable="w14 w15 w16se w16cid w16 w16cex w16sdtdh w16sdtfl w16du wp14">
   <w:p>
     <w:pPr>
       <w:pStyle w:val="Header"/>
@@ -22697,7 +26875,7 @@
 </file>
 
 <file path=word/styles.xml><?xml version="1.0" encoding="utf-8"?>
-<w:styles xmlns:mc="http://schemas.openxmlformats.org/markup-compatibility/2006" xmlns:r="http://schemas.openxmlformats.org/officeDocument/2006/relationships" xmlns:w="http://schemas.openxmlformats.org/wordprocessingml/2006/main" xmlns:w14="http://schemas.microsoft.com/office/word/2010/wordml" xmlns:w15="http://schemas.microsoft.com/office/word/2012/wordml" xmlns:w16cex="http://schemas.microsoft.com/office/word/2018/wordml/cex" xmlns:w16cid="http://schemas.microsoft.com/office/word/2016/wordml/cid" xmlns:w16="http://schemas.microsoft.com/office/word/2018/wordml" xmlns:w16sdtdh="http://schemas.microsoft.com/office/word/2020/wordml/sdtdatahash" xmlns:w16se="http://schemas.microsoft.com/office/word/2015/wordml/symex" mc:Ignorable="w14 w15 w16se w16cid w16 w16cex w16sdtdh">
+<w:styles xmlns:mc="http://schemas.openxmlformats.org/markup-compatibility/2006" xmlns:r="http://schemas.openxmlformats.org/officeDocument/2006/relationships" xmlns:w="http://schemas.openxmlformats.org/wordprocessingml/2006/main" xmlns:w14="http://schemas.microsoft.com/office/word/2010/wordml" xmlns:w15="http://schemas.microsoft.com/office/word/2012/wordml" xmlns:w16cex="http://schemas.microsoft.com/office/word/2018/wordml/cex" xmlns:w16cid="http://schemas.microsoft.com/office/word/2016/wordml/cid" xmlns:w16="http://schemas.microsoft.com/office/word/2018/wordml" xmlns:w16du="http://schemas.microsoft.com/office/word/2023/wordml/word16du" xmlns:w16sdtdh="http://schemas.microsoft.com/office/word/2020/wordml/sdtdatahash" xmlns:w16sdtfl="http://schemas.microsoft.com/office/word/2024/wordml/sdtformatlock" xmlns:w16se="http://schemas.microsoft.com/office/word/2015/wordml/symex" mc:Ignorable="w14 w15 w16se w16cid w16 w16cex w16sdtdh w16sdtfl w16du">
   <w:docDefaults>
     <w:rPrDefault>
       <w:rPr>
@@ -23088,7 +27266,7 @@
   <w:style w:type="paragraph" w:default="1" w:styleId="Normal">
     <w:name w:val="Normal"/>
     <w:qFormat/>
-    <w:rsid w:val="00076C05"/>
+    <w:rsid w:val="009F608D"/>
     <w:pPr>
       <w:spacing w:before="120" w:line="276" w:lineRule="auto"/>
     </w:pPr>

</xml_diff>

<commit_message>
TS 7.4 Sanskrit kramam indicator
</commit_message>
<xml_diff>
--- a/TS-Kramam/TS-7.4/TS 7.4 Tamil Krama Paatam Corrections.docx
+++ b/TS-Kramam/TS-7.4/TS 7.4 Tamil Krama Paatam Corrections.docx
@@ -2,18 +2,6 @@
 <file path=word/document.xml><?xml version="1.0" encoding="utf-8"?>
 <w:document xmlns:wpc="http://schemas.microsoft.com/office/word/2010/wordprocessingCanvas" xmlns:cx="http://schemas.microsoft.com/office/drawing/2014/chartex" xmlns:cx1="http://schemas.microsoft.com/office/drawing/2015/9/8/chartex" xmlns:cx2="http://schemas.microsoft.com/office/drawing/2015/10/21/chartex" xmlns:cx3="http://schemas.microsoft.com/office/drawing/2016/5/9/chartex" xmlns:cx4="http://schemas.microsoft.com/office/drawing/2016/5/10/chartex" xmlns:cx5="http://schemas.microsoft.com/office/drawing/2016/5/11/chartex" xmlns:cx6="http://schemas.microsoft.com/office/drawing/2016/5/12/chartex" xmlns:cx7="http://schemas.microsoft.com/office/drawing/2016/5/13/chartex" xmlns:cx8="http://schemas.microsoft.com/office/drawing/2016/5/14/chartex" xmlns:mc="http://schemas.openxmlformats.org/markup-compatibility/2006" xmlns:aink="http://schemas.microsoft.com/office/drawing/2016/ink" xmlns:am3d="http://schemas.microsoft.com/office/drawing/2017/model3d" xmlns:o="urn:schemas-microsoft-com:office:office" xmlns:oel="http://schemas.microsoft.com/office/2019/extlst" xmlns:r="http://schemas.openxmlformats.org/officeDocument/2006/relationships" xmlns:m="http://schemas.openxmlformats.org/officeDocument/2006/math" xmlns:v="urn:schemas-microsoft-com:vml" xmlns:wp14="http://schemas.microsoft.com/office/word/2010/wordprocessingDrawing" xmlns:wp="http://schemas.openxmlformats.org/drawingml/2006/wordprocessingDrawing" xmlns:w10="urn:schemas-microsoft-com:office:word" xmlns:w="http://schemas.openxmlformats.org/wordprocessingml/2006/main" xmlns:w14="http://schemas.microsoft.com/office/word/2010/wordml" xmlns:w15="http://schemas.microsoft.com/office/word/2012/wordml" xmlns:w16cex="http://schemas.microsoft.com/office/word/2018/wordml/cex" xmlns:w16cid="http://schemas.microsoft.com/office/word/2016/wordml/cid" xmlns:w16="http://schemas.microsoft.com/office/word/2018/wordml" xmlns:w16du="http://schemas.microsoft.com/office/word/2023/wordml/word16du" xmlns:w16sdtdh="http://schemas.microsoft.com/office/word/2020/wordml/sdtdatahash" xmlns:w16sdtfl="http://schemas.microsoft.com/office/word/2024/wordml/sdtformatlock" xmlns:w16se="http://schemas.microsoft.com/office/word/2015/wordml/symex" xmlns:wpg="http://schemas.microsoft.com/office/word/2010/wordprocessingGroup" xmlns:wpi="http://schemas.microsoft.com/office/word/2010/wordprocessingInk" xmlns:wne="http://schemas.microsoft.com/office/word/2006/wordml" xmlns:wps="http://schemas.microsoft.com/office/word/2010/wordprocessingShape" mc:Ignorable="w14 w15 w16se w16cid w16 w16cex w16sdtdh w16sdtfl w16du wp14">
   <w:body>
-    <w:p>
-      <w:pPr>
-        <w:jc w:val="center"/>
-        <w:rPr>
-          <w:b/>
-          <w:bCs/>
-          <w:sz w:val="32"/>
-          <w:szCs w:val="32"/>
-          <w:u w:val="single"/>
-        </w:rPr>
-      </w:pPr>
-    </w:p>
     <w:p>
       <w:pPr>
         <w:jc w:val="center"/>
@@ -304,25 +292,7 @@
                 <w:sz w:val="28"/>
                 <w:szCs w:val="28"/>
               </w:rPr>
-              <w:t>T.S.7.4.1.</w:t>
-            </w:r>
-            <w:r>
-              <w:rPr>
-                <w:rFonts w:cs="Arial"/>
-                <w:b/>
-                <w:sz w:val="28"/>
-                <w:szCs w:val="28"/>
-              </w:rPr>
-              <w:t>2</w:t>
-            </w:r>
-            <w:r>
-              <w:rPr>
-                <w:rFonts w:cs="Arial"/>
-                <w:b/>
-                <w:sz w:val="28"/>
-                <w:szCs w:val="28"/>
-              </w:rPr>
-              <w:t xml:space="preserve"> – Kramam</w:t>
+              <w:t>T.S.7.4.1.2 – Kramam</w:t>
             </w:r>
           </w:p>
           <w:p>
@@ -384,16 +354,7 @@
                 <w:sz w:val="28"/>
                 <w:szCs w:val="28"/>
               </w:rPr>
-              <w:t xml:space="preserve">Panchaati No. - </w:t>
-            </w:r>
-            <w:r>
-              <w:rPr>
-                <w:rFonts w:cs="Arial"/>
-                <w:b/>
-                <w:sz w:val="28"/>
-                <w:szCs w:val="28"/>
-              </w:rPr>
-              <w:t>2</w:t>
+              <w:t>Panchaati No. - 2</w:t>
             </w:r>
           </w:p>
         </w:tc>
@@ -2481,7 +2442,6 @@
                 <w:sz w:val="28"/>
                 <w:szCs w:val="28"/>
               </w:rPr>
-              <w:lastRenderedPageBreak/>
               <w:t>T.S.7.4.</w:t>
             </w:r>
             <w:r>
@@ -2726,6 +2686,7 @@
                 <w:cs/>
                 <w:lang w:bidi="ta-IN"/>
               </w:rPr>
+              <w:lastRenderedPageBreak/>
               <w:t>அ</w:t>
             </w:r>
             <w:r>
@@ -2839,6 +2800,7 @@
                 <w:cs/>
                 <w:lang w:bidi="ta-IN"/>
               </w:rPr>
+              <w:lastRenderedPageBreak/>
               <w:t>ஏ</w:t>
             </w:r>
             <w:r>
@@ -2932,6 +2894,7 @@
                 <w:cs/>
                 <w:lang w:bidi="ta-IN"/>
               </w:rPr>
+              <w:lastRenderedPageBreak/>
               <w:t>அ</w:t>
             </w:r>
             <w:r>
@@ -3052,6 +3015,7 @@
                 <w:sz w:val="28"/>
                 <w:szCs w:val="28"/>
               </w:rPr>
+              <w:lastRenderedPageBreak/>
               <w:t>T.S.7.4.</w:t>
             </w:r>
             <w:r>
@@ -4045,18 +4009,7 @@
                 <w:highlight w:val="green"/>
                 <w:lang w:bidi="ta-IN"/>
               </w:rPr>
-              <w:t>…</w:t>
-            </w:r>
-            <w:r>
-              <w:rPr>
-                <w:rFonts w:ascii="BRH Tamil Tab Extra" w:hAnsi="BRH Tamil Tab Extra" w:cs="Latha"/>
-                <w:b/>
-                <w:sz w:val="32"/>
-                <w:szCs w:val="28"/>
-                <w:highlight w:val="green"/>
-                <w:lang w:bidi="ta-IN"/>
-              </w:rPr>
-              <w:t xml:space="preserve"> </w:t>
+              <w:t xml:space="preserve">… </w:t>
             </w:r>
             <w:r>
               <w:rPr>
@@ -4103,42 +4056,6 @@
         </w:rPr>
         <w:t>==============</w:t>
       </w:r>
-    </w:p>
-    <w:p>
-      <w:pPr>
-        <w:jc w:val="center"/>
-        <w:rPr>
-          <w:b/>
-          <w:bCs/>
-          <w:sz w:val="32"/>
-          <w:szCs w:val="32"/>
-          <w:u w:val="single"/>
-        </w:rPr>
-      </w:pPr>
-    </w:p>
-    <w:p>
-      <w:pPr>
-        <w:jc w:val="center"/>
-        <w:rPr>
-          <w:b/>
-          <w:bCs/>
-          <w:sz w:val="32"/>
-          <w:szCs w:val="32"/>
-          <w:u w:val="single"/>
-        </w:rPr>
-      </w:pPr>
-    </w:p>
-    <w:p>
-      <w:pPr>
-        <w:jc w:val="center"/>
-        <w:rPr>
-          <w:b/>
-          <w:bCs/>
-          <w:sz w:val="32"/>
-          <w:szCs w:val="32"/>
-          <w:u w:val="single"/>
-        </w:rPr>
-      </w:pPr>
     </w:p>
     <w:p>
       <w:pPr>
@@ -4347,7 +4264,6 @@
                 <w:sz w:val="32"/>
                 <w:szCs w:val="32"/>
               </w:rPr>
-              <w:lastRenderedPageBreak/>
               <w:t>Section, Paragraph</w:t>
             </w:r>
           </w:p>
@@ -4528,6 +4444,9 @@
     </w:tbl>
     <w:p>
       <w:pPr>
+        <w:pBdr>
+          <w:bottom w:val="double" w:sz="6" w:space="1" w:color="auto"/>
+        </w:pBdr>
         <w:jc w:val="center"/>
         <w:rPr>
           <w:b/>
@@ -4537,7 +4456,10 @@
           <w:u w:val="single"/>
         </w:rPr>
       </w:pPr>
-      <w:r>
+    </w:p>
+    <w:p>
+      <w:pPr>
+        <w:jc w:val="center"/>
         <w:rPr>
           <w:b/>
           <w:bCs/>
@@ -4545,8 +4467,7 @@
           <w:szCs w:val="32"/>
           <w:u w:val="single"/>
         </w:rPr>
-        <w:t>==============</w:t>
-      </w:r>
+      </w:pPr>
     </w:p>
     <w:p>
       <w:pPr>
@@ -4567,6 +4488,7 @@
           <w:szCs w:val="32"/>
           <w:u w:val="single"/>
         </w:rPr>
+        <w:lastRenderedPageBreak/>
         <w:t xml:space="preserve">TS </w:t>
       </w:r>
       <w:r>
@@ -7302,7 +7224,6 @@
                 <w:sz w:val="28"/>
                 <w:szCs w:val="32"/>
               </w:rPr>
-              <w:lastRenderedPageBreak/>
               <w:t>T.S.7.4.2.</w:t>
             </w:r>
             <w:r>
@@ -7920,6 +7841,7 @@
                 <w:sz w:val="28"/>
                 <w:szCs w:val="32"/>
               </w:rPr>
+              <w:lastRenderedPageBreak/>
               <w:t>T.S.7.4.2.4 – Kramam</w:t>
             </w:r>
           </w:p>
@@ -10891,7 +10813,6 @@
                 <w:cs/>
                 <w:lang w:bidi="ta-IN"/>
               </w:rPr>
-              <w:lastRenderedPageBreak/>
               <w:t>ரு</w:t>
             </w:r>
             <w:r>
@@ -11563,6 +11484,7 @@
                 <w:sz w:val="28"/>
                 <w:szCs w:val="32"/>
               </w:rPr>
+              <w:lastRenderedPageBreak/>
               <w:t>T.S.7.4.3.4 – Kramam</w:t>
             </w:r>
           </w:p>
@@ -14183,7 +14105,6 @@
                 <w:sz w:val="28"/>
                 <w:szCs w:val="32"/>
               </w:rPr>
-              <w:lastRenderedPageBreak/>
               <w:t>T.S.7.4.5.1 – Kramam</w:t>
             </w:r>
           </w:p>
@@ -15404,6 +15325,7 @@
                 <w:sz w:val="28"/>
                 <w:szCs w:val="32"/>
               </w:rPr>
+              <w:lastRenderedPageBreak/>
               <w:t>T.S.7.4.5.2 – Kramam</w:t>
             </w:r>
           </w:p>
@@ -17761,7 +17683,6 @@
                 <w:sz w:val="28"/>
                 <w:szCs w:val="32"/>
               </w:rPr>
-              <w:lastRenderedPageBreak/>
               <w:t xml:space="preserve">T.S.7.4.7.3 – </w:t>
             </w:r>
           </w:p>
@@ -19378,6 +19299,7 @@
                 <w:sz w:val="28"/>
                 <w:szCs w:val="32"/>
               </w:rPr>
+              <w:lastRenderedPageBreak/>
               <w:t>T.S.</w:t>
             </w:r>
             <w:r>
@@ -21607,7 +21529,6 @@
                 <w:sz w:val="28"/>
                 <w:szCs w:val="32"/>
               </w:rPr>
-              <w:lastRenderedPageBreak/>
               <w:t xml:space="preserve">T.S.7.4.13.1 – </w:t>
             </w:r>
           </w:p>
@@ -22868,6 +22789,7 @@
                 <w:sz w:val="28"/>
                 <w:szCs w:val="32"/>
               </w:rPr>
+              <w:lastRenderedPageBreak/>
               <w:t>T.S.7.4.17.2 – Kramam</w:t>
             </w:r>
           </w:p>
@@ -25043,7 +24965,6 @@
                 <w:sz w:val="28"/>
                 <w:szCs w:val="32"/>
               </w:rPr>
-              <w:lastRenderedPageBreak/>
               <w:t>T.S.7.4.19.4 – Kramam</w:t>
             </w:r>
           </w:p>
@@ -26058,6 +25979,7 @@
           <w:szCs w:val="32"/>
           <w:u w:val="single"/>
         </w:rPr>
+        <w:lastRenderedPageBreak/>
         <w:t xml:space="preserve">TS </w:t>
       </w:r>
       <w:r>

</xml_diff>